<commit_message>
P6: reflection, warm-up check, fast track, open investigations; glyphs replaced
Co-Authored-By: Claude Sonnet 5.5 <noreply@anthropic.com>
Claude-Session: https://claude.ai/code/session_01NYgB3ju57UwWRpkPPM6X7F
</commit_message>
<xml_diff>
--- a/hp/P1_Holiday_Program_Student_Workbook.docx
+++ b/hp/P1_Holiday_Program_Student_Workbook.docx
@@ -1203,9 +1203,9 @@
             </w:tcBorders>
             <w:shd w:fill="E8F5F2" w:color="auto" w:val="clear"/>
             <w:tcMar>
-              <w:top w:type="dxa" w:w="60"/>
+              <w:top w:type="dxa" w:w="40"/>
               <w:left w:type="dxa" w:w="100"/>
-              <w:bottom w:type="dxa" w:w="60"/>
+              <w:bottom w:type="dxa" w:w="40"/>
               <w:right w:type="dxa" w:w="100"/>
             </w:tcMar>
             <w:vAlign w:val="center"/>
@@ -1213,7 +1213,7 @@
           <w:p>
             <w:pPr>
               <w:keepLines/>
-              <w:spacing w:after="0" w:before="0" w:line="260" w:lineRule="auto"/>
+              <w:spacing w:after="0" w:before="0" w:line="240" w:lineRule="auto"/>
             </w:pPr>
             <w:r>
               <w:rPr>
@@ -1221,16 +1221,16 @@
                 <w:b/>
                 <w:bCs/>
                 <w:color w:val="1F7A6F"/>
-                <w:sz w:val="21"/>
-                <w:szCs w:val="21"/>
+                <w:sz w:val="19"/>
+                <w:szCs w:val="19"/>
               </w:rPr>
               <w:t xml:space="preserve">Fast track. </w:t>
             </w:r>
             <w:r>
               <w:rPr>
                 <w:rFonts w:ascii="Arial" w:cs="Arial" w:eastAsia="Arial" w:hAnsi="Arial"/>
-                <w:sz w:val="21"/>
-                <w:szCs w:val="21"/>
+                <w:sz w:val="19"/>
+                <w:szCs w:val="19"/>
               </w:rPr>
               <w:t xml:space="preserve">Got both warm-up check questions right and can say why? Ask your tutor. You may go straight to the Think Harder and Challenge pages and the Open investigation while the group works on this page. Come back to the group for talk time.</w:t>
             </w:r>
@@ -1241,7 +1241,7 @@
     <w:p>
       <w:pPr>
         <w:keepLines/>
-        <w:spacing w:after="60" w:before="0" w:line="320" w:lineRule="auto"/>
+        <w:spacing w:after="40" w:before="0" w:line="320" w:lineRule="auto"/>
       </w:pPr>
       <w:r>
         <w:rPr>
@@ -3409,7 +3409,7 @@
     <w:p>
       <w:pPr>
         <w:keepLines/>
-        <w:spacing w:after="60" w:before="0" w:line="320" w:lineRule="auto"/>
+        <w:spacing w:after="30" w:before="0" w:line="320" w:lineRule="auto"/>
       </w:pPr>
       <w:r>
         <w:rPr>
@@ -3450,9 +3450,9 @@
             </w:tcBorders>
             <w:shd w:fill="FFFDF5" w:color="auto" w:val="clear"/>
             <w:tcMar>
-              <w:top w:type="dxa" w:w="80"/>
+              <w:top w:type="dxa" w:w="50"/>
               <w:left w:type="dxa" w:w="100"/>
-              <w:bottom w:type="dxa" w:w="80"/>
+              <w:bottom w:type="dxa" w:w="50"/>
               <w:right w:type="dxa" w:w="100"/>
             </w:tcMar>
             <w:vAlign w:val="center"/>
@@ -3460,7 +3460,7 @@
           <w:p>
             <w:pPr>
               <w:keepLines/>
-              <w:spacing w:after="60" w:before="0" w:line="320" w:lineRule="auto"/>
+              <w:spacing w:after="30" w:before="0" w:line="320" w:lineRule="auto"/>
             </w:pPr>
             <w:r>
               <w:rPr>
@@ -3476,8 +3476,8 @@
             <w:r>
               <w:rPr>
                 <w:rFonts w:ascii="Arial" w:cs="Arial" w:eastAsia="Arial" w:hAnsi="Arial"/>
-                <w:sz w:val="21"/>
-                <w:szCs w:val="21"/>
+                <w:sz w:val="19"/>
+                <w:szCs w:val="19"/>
               </w:rPr>
               <w:t xml:space="preserve">A one-minute look-back. There are no right answers. Tick or write.</w:t>
             </w:r>
@@ -3485,15 +3485,15 @@
           <w:p>
             <w:pPr>
               <w:keepLines/>
-              <w:spacing w:after="40" w:before="0" w:line="300" w:lineRule="auto"/>
+              <w:spacing w:after="20" w:before="0" w:line="260" w:lineRule="auto"/>
             </w:pPr>
             <w:r>
               <w:rPr>
                 <w:rFonts w:ascii="Arial" w:cs="Arial" w:eastAsia="Arial" w:hAnsi="Arial"/>
                 <w:b/>
                 <w:bCs/>
-                <w:sz w:val="22"/>
-                <w:szCs w:val="22"/>
+                <w:sz w:val="20"/>
+                <w:szCs w:val="20"/>
               </w:rPr>
               <w:t xml:space="preserve">The hardest part was ...   </w:t>
             </w:r>
@@ -3540,8 +3540,8 @@
             <w:r>
               <w:rPr>
                 <w:rFonts w:ascii="Arial" w:cs="Arial" w:eastAsia="Arial" w:hAnsi="Arial"/>
-                <w:sz w:val="21"/>
-                <w:szCs w:val="21"/>
+                <w:sz w:val="19"/>
+                <w:szCs w:val="19"/>
               </w:rPr>
               <w:t xml:space="preserve"> the hops    </w:t>
             </w:r>
@@ -3588,8 +3588,8 @@
             <w:r>
               <w:rPr>
                 <w:rFonts w:ascii="Arial" w:cs="Arial" w:eastAsia="Arial" w:hAnsi="Arial"/>
-                <w:sz w:val="21"/>
-                <w:szCs w:val="21"/>
+                <w:sz w:val="19"/>
+                <w:szCs w:val="19"/>
               </w:rPr>
               <w:t xml:space="preserve"> finding the rule    </w:t>
             </w:r>
@@ -3636,8 +3636,8 @@
             <w:r>
               <w:rPr>
                 <w:rFonts w:ascii="Arial" w:cs="Arial" w:eastAsia="Arial" w:hAnsi="Arial"/>
-                <w:sz w:val="21"/>
-                <w:szCs w:val="21"/>
+                <w:sz w:val="19"/>
+                <w:szCs w:val="19"/>
               </w:rPr>
               <w:t xml:space="preserve"> saying why    </w:t>
             </w:r>
@@ -3684,8 +3684,8 @@
             <w:r>
               <w:rPr>
                 <w:rFonts w:ascii="Arial" w:cs="Arial" w:eastAsia="Arial" w:hAnsi="Arial"/>
-                <w:sz w:val="21"/>
-                <w:szCs w:val="21"/>
+                <w:sz w:val="19"/>
+                <w:szCs w:val="19"/>
               </w:rPr>
               <w:t xml:space="preserve"> something else: ____________    </w:t>
             </w:r>
@@ -3693,15 +3693,15 @@
           <w:p>
             <w:pPr>
               <w:keepLines/>
-              <w:spacing w:after="40" w:before="0" w:line="300" w:lineRule="auto"/>
+              <w:spacing w:after="20" w:before="0" w:line="260" w:lineRule="auto"/>
             </w:pPr>
             <w:r>
               <w:rPr>
                 <w:rFonts w:ascii="Arial" w:cs="Arial" w:eastAsia="Arial" w:hAnsi="Arial"/>
                 <w:b/>
                 <w:bCs/>
-                <w:sz w:val="22"/>
-                <w:szCs w:val="22"/>
+                <w:sz w:val="20"/>
+                <w:szCs w:val="20"/>
               </w:rPr>
               <w:t xml:space="preserve">I got unstuck by ...   </w:t>
             </w:r>
@@ -3748,8 +3748,8 @@
             <w:r>
               <w:rPr>
                 <w:rFonts w:ascii="Arial" w:cs="Arial" w:eastAsia="Arial" w:hAnsi="Arial"/>
-                <w:sz w:val="21"/>
-                <w:szCs w:val="21"/>
+                <w:sz w:val="19"/>
+                <w:szCs w:val="19"/>
               </w:rPr>
               <w:t xml:space="preserve"> counters or objects    </w:t>
             </w:r>
@@ -3796,8 +3796,8 @@
             <w:r>
               <w:rPr>
                 <w:rFonts w:ascii="Arial" w:cs="Arial" w:eastAsia="Arial" w:hAnsi="Arial"/>
-                <w:sz w:val="21"/>
-                <w:szCs w:val="21"/>
+                <w:sz w:val="19"/>
+                <w:szCs w:val="19"/>
               </w:rPr>
               <w:t xml:space="preserve"> drawing it    </w:t>
             </w:r>
@@ -3844,8 +3844,8 @@
             <w:r>
               <w:rPr>
                 <w:rFonts w:ascii="Arial" w:cs="Arial" w:eastAsia="Arial" w:hAnsi="Arial"/>
-                <w:sz w:val="21"/>
-                <w:szCs w:val="21"/>
+                <w:sz w:val="19"/>
+                <w:szCs w:val="19"/>
               </w:rPr>
               <w:t xml:space="preserve"> asking someone    </w:t>
             </w:r>
@@ -3892,8 +3892,8 @@
             <w:r>
               <w:rPr>
                 <w:rFonts w:ascii="Arial" w:cs="Arial" w:eastAsia="Arial" w:hAnsi="Arial"/>
-                <w:sz w:val="21"/>
-                <w:szCs w:val="21"/>
+                <w:sz w:val="19"/>
+                <w:szCs w:val="19"/>
               </w:rPr>
               <w:t xml:space="preserve"> trying again    </w:t>
             </w:r>
@@ -3901,15 +3901,15 @@
           <w:p>
             <w:pPr>
               <w:keepLines/>
-              <w:spacing w:after="0" w:before="0" w:line="300" w:lineRule="auto"/>
+              <w:spacing w:after="0" w:before="0" w:line="260" w:lineRule="auto"/>
             </w:pPr>
             <w:r>
               <w:rPr>
                 <w:rFonts w:ascii="Arial" w:cs="Arial" w:eastAsia="Arial" w:hAnsi="Arial"/>
                 <w:b/>
                 <w:bCs/>
-                <w:sz w:val="22"/>
-                <w:szCs w:val="22"/>
+                <w:sz w:val="20"/>
+                <w:szCs w:val="20"/>
               </w:rPr>
               <w:t xml:space="preserve">Next time I will try ...  ______________________     It felt:  </w:t>
             </w:r>
@@ -3956,8 +3956,8 @@
             <w:r>
               <w:rPr>
                 <w:rFonts w:ascii="Arial" w:cs="Arial" w:eastAsia="Arial" w:hAnsi="Arial"/>
-                <w:sz w:val="21"/>
-                <w:szCs w:val="21"/>
+                <w:sz w:val="19"/>
+                <w:szCs w:val="19"/>
               </w:rPr>
               <w:t xml:space="preserve"> easy   </w:t>
             </w:r>
@@ -4004,8 +4004,8 @@
             <w:r>
               <w:rPr>
                 <w:rFonts w:ascii="Arial" w:cs="Arial" w:eastAsia="Arial" w:hAnsi="Arial"/>
-                <w:sz w:val="21"/>
-                <w:szCs w:val="21"/>
+                <w:sz w:val="19"/>
+                <w:szCs w:val="19"/>
               </w:rPr>
               <w:t xml:space="preserve"> OK   </w:t>
             </w:r>
@@ -4052,8 +4052,8 @@
             <w:r>
               <w:rPr>
                 <w:rFonts w:ascii="Arial" w:cs="Arial" w:eastAsia="Arial" w:hAnsi="Arial"/>
-                <w:sz w:val="21"/>
-                <w:szCs w:val="21"/>
+                <w:sz w:val="19"/>
+                <w:szCs w:val="19"/>
               </w:rPr>
               <w:t xml:space="preserve"> hard   </w:t>
             </w:r>
@@ -4870,20 +4870,6 @@
         <w:ind w:left="560"/>
       </w:pPr>
     </w:p>
-    <w:p>
-      <w:pPr>
-        <w:keepLines/>
-        <w:spacing w:after="120" w:before="0" w:line="320" w:lineRule="auto"/>
-      </w:pPr>
-      <w:r>
-        <w:rPr>
-          <w:rFonts w:ascii="Arial" w:cs="Arial" w:eastAsia="Arial" w:hAnsi="Arial"/>
-          <w:sz w:val="26"/>
-          <w:szCs w:val="26"/>
-        </w:rPr>
-        <w:t xml:space="preserve"/>
-      </w:r>
-    </w:p>
     <w:tbl>
       <w:tblPr>
         <w:tblW w:type="dxa" w:w="9900"/>
@@ -4945,7 +4931,7 @@
       <w:pPr>
         <w:keepNext/>
         <w:keepLines/>
-        <w:spacing w:after="40" w:before="100" w:line="320" w:lineRule="auto"/>
+        <w:spacing w:after="20" w:before="60" w:line="320" w:lineRule="auto"/>
         <w:ind w:left="560" w:hanging="560"/>
       </w:pPr>
       <w:r>
@@ -4974,24 +4960,6 @@
         </w:rPr>
         <w:t xml:space="preserve">Frog 1 hops in 2s from 0. Frog 2 hops in 3s from 0. Write the numbers up to 30 that BOTH frogs land on. Now change frog 2 to hops of 4, then 5, then 6, and do it again each time. What stays the same? What changes?</w:t>
       </w:r>
-    </w:p>
-    <w:p>
-      <w:pPr>
-        <w:pBdr>
-          <w:bottom w:val="single" w:color="777777" w:sz="6" w:space="1"/>
-        </w:pBdr>
-        <w:spacing w:after="80" w:before="280"/>
-        <w:ind w:left="560"/>
-      </w:pPr>
-    </w:p>
-    <w:p>
-      <w:pPr>
-        <w:pBdr>
-          <w:bottom w:val="single" w:color="777777" w:sz="6" w:space="1"/>
-        </w:pBdr>
-        <w:spacing w:after="80" w:before="280"/>
-        <w:ind w:left="560"/>
-      </w:pPr>
     </w:p>
     <w:p>
       <w:pPr>
@@ -5242,9 +5210,9 @@
             </w:tcBorders>
             <w:shd w:fill="E8F5F2" w:color="auto" w:val="clear"/>
             <w:tcMar>
-              <w:top w:type="dxa" w:w="60"/>
+              <w:top w:type="dxa" w:w="40"/>
               <w:left w:type="dxa" w:w="100"/>
-              <w:bottom w:type="dxa" w:w="60"/>
+              <w:bottom w:type="dxa" w:w="40"/>
               <w:right w:type="dxa" w:w="100"/>
             </w:tcMar>
             <w:vAlign w:val="center"/>
@@ -5252,7 +5220,7 @@
           <w:p>
             <w:pPr>
               <w:keepLines/>
-              <w:spacing w:after="0" w:before="0" w:line="260" w:lineRule="auto"/>
+              <w:spacing w:after="0" w:before="0" w:line="240" w:lineRule="auto"/>
             </w:pPr>
             <w:r>
               <w:rPr>
@@ -5260,16 +5228,16 @@
                 <w:b/>
                 <w:bCs/>
                 <w:color w:val="1F7A6F"/>
-                <w:sz w:val="21"/>
-                <w:szCs w:val="21"/>
+                <w:sz w:val="19"/>
+                <w:szCs w:val="19"/>
               </w:rPr>
               <w:t xml:space="preserve">Fast track. </w:t>
             </w:r>
             <w:r>
               <w:rPr>
                 <w:rFonts w:ascii="Arial" w:cs="Arial" w:eastAsia="Arial" w:hAnsi="Arial"/>
-                <w:sz w:val="21"/>
-                <w:szCs w:val="21"/>
+                <w:sz w:val="19"/>
+                <w:szCs w:val="19"/>
               </w:rPr>
               <w:t xml:space="preserve">Got both warm-up check questions right and can say why? Ask your tutor. You may go straight to the Think Harder and Challenge pages and the Open investigation while the group works on this page. Come back to the group for talk time.</w:t>
             </w:r>
@@ -5280,7 +5248,7 @@
     <w:p>
       <w:pPr>
         <w:keepLines/>
-        <w:spacing w:after="60" w:before="0" w:line="320" w:lineRule="auto"/>
+        <w:spacing w:after="40" w:before="0" w:line="320" w:lineRule="auto"/>
       </w:pPr>
       <w:r>
         <w:rPr>
@@ -6111,7 +6079,7 @@
     <w:p>
       <w:pPr>
         <w:keepLines/>
-        <w:spacing w:after="60" w:before="0" w:line="320" w:lineRule="auto"/>
+        <w:spacing w:after="30" w:before="0" w:line="320" w:lineRule="auto"/>
       </w:pPr>
       <w:r>
         <w:rPr>
@@ -6152,9 +6120,9 @@
             </w:tcBorders>
             <w:shd w:fill="FFFDF5" w:color="auto" w:val="clear"/>
             <w:tcMar>
-              <w:top w:type="dxa" w:w="80"/>
+              <w:top w:type="dxa" w:w="50"/>
               <w:left w:type="dxa" w:w="100"/>
-              <w:bottom w:type="dxa" w:w="80"/>
+              <w:bottom w:type="dxa" w:w="50"/>
               <w:right w:type="dxa" w:w="100"/>
             </w:tcMar>
             <w:vAlign w:val="center"/>
@@ -6162,7 +6130,7 @@
           <w:p>
             <w:pPr>
               <w:keepLines/>
-              <w:spacing w:after="60" w:before="0" w:line="320" w:lineRule="auto"/>
+              <w:spacing w:after="30" w:before="0" w:line="320" w:lineRule="auto"/>
             </w:pPr>
             <w:r>
               <w:rPr>
@@ -6178,8 +6146,8 @@
             <w:r>
               <w:rPr>
                 <w:rFonts w:ascii="Arial" w:cs="Arial" w:eastAsia="Arial" w:hAnsi="Arial"/>
-                <w:sz w:val="21"/>
-                <w:szCs w:val="21"/>
+                <w:sz w:val="19"/>
+                <w:szCs w:val="19"/>
               </w:rPr>
               <w:t xml:space="preserve">A one-minute look-back. There are no right answers. Tick or write.</w:t>
             </w:r>
@@ -6187,15 +6155,15 @@
           <w:p>
             <w:pPr>
               <w:keepLines/>
-              <w:spacing w:after="40" w:before="0" w:line="300" w:lineRule="auto"/>
+              <w:spacing w:after="20" w:before="0" w:line="260" w:lineRule="auto"/>
             </w:pPr>
             <w:r>
               <w:rPr>
                 <w:rFonts w:ascii="Arial" w:cs="Arial" w:eastAsia="Arial" w:hAnsi="Arial"/>
                 <w:b/>
                 <w:bCs/>
-                <w:sz w:val="22"/>
-                <w:szCs w:val="22"/>
+                <w:sz w:val="20"/>
+                <w:szCs w:val="20"/>
               </w:rPr>
               <w:t xml:space="preserve">The hardest part was ...   </w:t>
             </w:r>
@@ -6242,8 +6210,8 @@
             <w:r>
               <w:rPr>
                 <w:rFonts w:ascii="Arial" w:cs="Arial" w:eastAsia="Arial" w:hAnsi="Arial"/>
-                <w:sz w:val="21"/>
-                <w:szCs w:val="21"/>
+                <w:sz w:val="19"/>
+                <w:szCs w:val="19"/>
               </w:rPr>
               <w:t xml:space="preserve"> the bonds    </w:t>
             </w:r>
@@ -6290,8 +6258,8 @@
             <w:r>
               <w:rPr>
                 <w:rFonts w:ascii="Arial" w:cs="Arial" w:eastAsia="Arial" w:hAnsi="Arial"/>
-                <w:sz w:val="21"/>
-                <w:szCs w:val="21"/>
+                <w:sz w:val="19"/>
+                <w:szCs w:val="19"/>
               </w:rPr>
               <w:t xml:space="preserve"> the = sign    </w:t>
             </w:r>
@@ -6338,8 +6306,8 @@
             <w:r>
               <w:rPr>
                 <w:rFonts w:ascii="Arial" w:cs="Arial" w:eastAsia="Arial" w:hAnsi="Arial"/>
-                <w:sz w:val="21"/>
-                <w:szCs w:val="21"/>
+                <w:sz w:val="19"/>
+                <w:szCs w:val="19"/>
               </w:rPr>
               <w:t xml:space="preserve"> saying why    </w:t>
             </w:r>
@@ -6386,8 +6354,8 @@
             <w:r>
               <w:rPr>
                 <w:rFonts w:ascii="Arial" w:cs="Arial" w:eastAsia="Arial" w:hAnsi="Arial"/>
-                <w:sz w:val="21"/>
-                <w:szCs w:val="21"/>
+                <w:sz w:val="19"/>
+                <w:szCs w:val="19"/>
               </w:rPr>
               <w:t xml:space="preserve"> something else: ____________    </w:t>
             </w:r>
@@ -6395,15 +6363,15 @@
           <w:p>
             <w:pPr>
               <w:keepLines/>
-              <w:spacing w:after="40" w:before="0" w:line="300" w:lineRule="auto"/>
+              <w:spacing w:after="20" w:before="0" w:line="260" w:lineRule="auto"/>
             </w:pPr>
             <w:r>
               <w:rPr>
                 <w:rFonts w:ascii="Arial" w:cs="Arial" w:eastAsia="Arial" w:hAnsi="Arial"/>
                 <w:b/>
                 <w:bCs/>
-                <w:sz w:val="22"/>
-                <w:szCs w:val="22"/>
+                <w:sz w:val="20"/>
+                <w:szCs w:val="20"/>
               </w:rPr>
               <w:t xml:space="preserve">I got unstuck by ...   </w:t>
             </w:r>
@@ -6450,8 +6418,8 @@
             <w:r>
               <w:rPr>
                 <w:rFonts w:ascii="Arial" w:cs="Arial" w:eastAsia="Arial" w:hAnsi="Arial"/>
-                <w:sz w:val="21"/>
-                <w:szCs w:val="21"/>
+                <w:sz w:val="19"/>
+                <w:szCs w:val="19"/>
               </w:rPr>
               <w:t xml:space="preserve"> counters or objects    </w:t>
             </w:r>
@@ -6498,8 +6466,8 @@
             <w:r>
               <w:rPr>
                 <w:rFonts w:ascii="Arial" w:cs="Arial" w:eastAsia="Arial" w:hAnsi="Arial"/>
-                <w:sz w:val="21"/>
-                <w:szCs w:val="21"/>
+                <w:sz w:val="19"/>
+                <w:szCs w:val="19"/>
               </w:rPr>
               <w:t xml:space="preserve"> drawing it    </w:t>
             </w:r>
@@ -6546,8 +6514,8 @@
             <w:r>
               <w:rPr>
                 <w:rFonts w:ascii="Arial" w:cs="Arial" w:eastAsia="Arial" w:hAnsi="Arial"/>
-                <w:sz w:val="21"/>
-                <w:szCs w:val="21"/>
+                <w:sz w:val="19"/>
+                <w:szCs w:val="19"/>
               </w:rPr>
               <w:t xml:space="preserve"> asking someone    </w:t>
             </w:r>
@@ -6594,8 +6562,8 @@
             <w:r>
               <w:rPr>
                 <w:rFonts w:ascii="Arial" w:cs="Arial" w:eastAsia="Arial" w:hAnsi="Arial"/>
-                <w:sz w:val="21"/>
-                <w:szCs w:val="21"/>
+                <w:sz w:val="19"/>
+                <w:szCs w:val="19"/>
               </w:rPr>
               <w:t xml:space="preserve"> trying again    </w:t>
             </w:r>
@@ -6603,15 +6571,15 @@
           <w:p>
             <w:pPr>
               <w:keepLines/>
-              <w:spacing w:after="0" w:before="0" w:line="300" w:lineRule="auto"/>
+              <w:spacing w:after="0" w:before="0" w:line="260" w:lineRule="auto"/>
             </w:pPr>
             <w:r>
               <w:rPr>
                 <w:rFonts w:ascii="Arial" w:cs="Arial" w:eastAsia="Arial" w:hAnsi="Arial"/>
                 <w:b/>
                 <w:bCs/>
-                <w:sz w:val="22"/>
-                <w:szCs w:val="22"/>
+                <w:sz w:val="20"/>
+                <w:szCs w:val="20"/>
               </w:rPr>
               <w:t xml:space="preserve">Next time I will try ...  ______________________     It felt:  </w:t>
             </w:r>
@@ -6658,8 +6626,8 @@
             <w:r>
               <w:rPr>
                 <w:rFonts w:ascii="Arial" w:cs="Arial" w:eastAsia="Arial" w:hAnsi="Arial"/>
-                <w:sz w:val="21"/>
-                <w:szCs w:val="21"/>
+                <w:sz w:val="19"/>
+                <w:szCs w:val="19"/>
               </w:rPr>
               <w:t xml:space="preserve"> easy   </w:t>
             </w:r>
@@ -6706,8 +6674,8 @@
             <w:r>
               <w:rPr>
                 <w:rFonts w:ascii="Arial" w:cs="Arial" w:eastAsia="Arial" w:hAnsi="Arial"/>
-                <w:sz w:val="21"/>
-                <w:szCs w:val="21"/>
+                <w:sz w:val="19"/>
+                <w:szCs w:val="19"/>
               </w:rPr>
               <w:t xml:space="preserve"> OK   </w:t>
             </w:r>
@@ -6754,8 +6722,8 @@
             <w:r>
               <w:rPr>
                 <w:rFonts w:ascii="Arial" w:cs="Arial" w:eastAsia="Arial" w:hAnsi="Arial"/>
-                <w:sz w:val="21"/>
-                <w:szCs w:val="21"/>
+                <w:sz w:val="19"/>
+                <w:szCs w:val="19"/>
               </w:rPr>
               <w:t xml:space="preserve"> hard   </w:t>
             </w:r>
@@ -7572,20 +7540,6 @@
         <w:ind w:left="560"/>
       </w:pPr>
     </w:p>
-    <w:p>
-      <w:pPr>
-        <w:keepLines/>
-        <w:spacing w:after="120" w:before="0" w:line="320" w:lineRule="auto"/>
-      </w:pPr>
-      <w:r>
-        <w:rPr>
-          <w:rFonts w:ascii="Arial" w:cs="Arial" w:eastAsia="Arial" w:hAnsi="Arial"/>
-          <w:sz w:val="26"/>
-          <w:szCs w:val="26"/>
-        </w:rPr>
-        <w:t xml:space="preserve"/>
-      </w:r>
-    </w:p>
     <w:tbl>
       <w:tblPr>
         <w:tblW w:type="dxa" w:w="9900"/>
@@ -7647,7 +7601,7 @@
       <w:pPr>
         <w:keepNext/>
         <w:keepLines/>
-        <w:spacing w:after="40" w:before="100" w:line="320" w:lineRule="auto"/>
+        <w:spacing w:after="20" w:before="60" w:line="320" w:lineRule="auto"/>
         <w:ind w:left="560" w:hanging="560"/>
       </w:pPr>
       <w:r>
@@ -7676,24 +7630,6 @@
         </w:rPr>
         <w:t xml:space="preserve">Mei says: "When two numbers make 10, they are both odd or both even." Test every pair that makes 10 (0 + 10, 1 + 9, 2 + 8 ...). Is Mei always right? Now test the pairs that make 20. Why do you think it works?</w:t>
       </w:r>
-    </w:p>
-    <w:p>
-      <w:pPr>
-        <w:pBdr>
-          <w:bottom w:val="single" w:color="777777" w:sz="6" w:space="1"/>
-        </w:pBdr>
-        <w:spacing w:after="80" w:before="280"/>
-        <w:ind w:left="560"/>
-      </w:pPr>
-    </w:p>
-    <w:p>
-      <w:pPr>
-        <w:pBdr>
-          <w:bottom w:val="single" w:color="777777" w:sz="6" w:space="1"/>
-        </w:pBdr>
-        <w:spacing w:after="80" w:before="280"/>
-        <w:ind w:left="560"/>
-      </w:pPr>
     </w:p>
     <w:p>
       <w:pPr>
@@ -7944,9 +7880,9 @@
             </w:tcBorders>
             <w:shd w:fill="E8F5F2" w:color="auto" w:val="clear"/>
             <w:tcMar>
-              <w:top w:type="dxa" w:w="60"/>
+              <w:top w:type="dxa" w:w="40"/>
               <w:left w:type="dxa" w:w="100"/>
-              <w:bottom w:type="dxa" w:w="60"/>
+              <w:bottom w:type="dxa" w:w="40"/>
               <w:right w:type="dxa" w:w="100"/>
             </w:tcMar>
             <w:vAlign w:val="center"/>
@@ -7954,7 +7890,7 @@
           <w:p>
             <w:pPr>
               <w:keepLines/>
-              <w:spacing w:after="0" w:before="0" w:line="260" w:lineRule="auto"/>
+              <w:spacing w:after="0" w:before="0" w:line="240" w:lineRule="auto"/>
             </w:pPr>
             <w:r>
               <w:rPr>
@@ -7962,16 +7898,16 @@
                 <w:b/>
                 <w:bCs/>
                 <w:color w:val="1F7A6F"/>
-                <w:sz w:val="21"/>
-                <w:szCs w:val="21"/>
+                <w:sz w:val="19"/>
+                <w:szCs w:val="19"/>
               </w:rPr>
               <w:t xml:space="preserve">Fast track. </w:t>
             </w:r>
             <w:r>
               <w:rPr>
                 <w:rFonts w:ascii="Arial" w:cs="Arial" w:eastAsia="Arial" w:hAnsi="Arial"/>
-                <w:sz w:val="21"/>
-                <w:szCs w:val="21"/>
+                <w:sz w:val="19"/>
+                <w:szCs w:val="19"/>
               </w:rPr>
               <w:t xml:space="preserve">Got both warm-up check questions right and can say why? Ask your tutor. You may go straight to the Think Harder and Challenge pages and the Open investigation while the group works on this page. Come back to the group for talk time.</w:t>
             </w:r>
@@ -7982,7 +7918,7 @@
     <w:p>
       <w:pPr>
         <w:keepLines/>
-        <w:spacing w:after="60" w:before="0" w:line="320" w:lineRule="auto"/>
+        <w:spacing w:after="40" w:before="0" w:line="320" w:lineRule="auto"/>
       </w:pPr>
       <w:r>
         <w:rPr>
@@ -10056,7 +9992,7 @@
     <w:p>
       <w:pPr>
         <w:keepLines/>
-        <w:spacing w:after="60" w:before="0" w:line="320" w:lineRule="auto"/>
+        <w:spacing w:after="30" w:before="0" w:line="320" w:lineRule="auto"/>
       </w:pPr>
       <w:r>
         <w:rPr>
@@ -10097,9 +10033,9 @@
             </w:tcBorders>
             <w:shd w:fill="FFFDF5" w:color="auto" w:val="clear"/>
             <w:tcMar>
-              <w:top w:type="dxa" w:w="80"/>
+              <w:top w:type="dxa" w:w="50"/>
               <w:left w:type="dxa" w:w="100"/>
-              <w:bottom w:type="dxa" w:w="80"/>
+              <w:bottom w:type="dxa" w:w="50"/>
               <w:right w:type="dxa" w:w="100"/>
             </w:tcMar>
             <w:vAlign w:val="center"/>
@@ -10107,7 +10043,7 @@
           <w:p>
             <w:pPr>
               <w:keepLines/>
-              <w:spacing w:after="60" w:before="0" w:line="320" w:lineRule="auto"/>
+              <w:spacing w:after="30" w:before="0" w:line="320" w:lineRule="auto"/>
             </w:pPr>
             <w:r>
               <w:rPr>
@@ -10123,8 +10059,8 @@
             <w:r>
               <w:rPr>
                 <w:rFonts w:ascii="Arial" w:cs="Arial" w:eastAsia="Arial" w:hAnsi="Arial"/>
-                <w:sz w:val="21"/>
-                <w:szCs w:val="21"/>
+                <w:sz w:val="19"/>
+                <w:szCs w:val="19"/>
               </w:rPr>
               <w:t xml:space="preserve">A one-minute look-back. There are no right answers. Tick or write.</w:t>
             </w:r>
@@ -10132,15 +10068,15 @@
           <w:p>
             <w:pPr>
               <w:keepLines/>
-              <w:spacing w:after="40" w:before="0" w:line="300" w:lineRule="auto"/>
+              <w:spacing w:after="20" w:before="0" w:line="260" w:lineRule="auto"/>
             </w:pPr>
             <w:r>
               <w:rPr>
                 <w:rFonts w:ascii="Arial" w:cs="Arial" w:eastAsia="Arial" w:hAnsi="Arial"/>
                 <w:b/>
                 <w:bCs/>
-                <w:sz w:val="22"/>
-                <w:szCs w:val="22"/>
+                <w:sz w:val="20"/>
+                <w:szCs w:val="20"/>
               </w:rPr>
               <w:t xml:space="preserve">The hardest part was ...   </w:t>
             </w:r>
@@ -10187,8 +10123,8 @@
             <w:r>
               <w:rPr>
                 <w:rFonts w:ascii="Arial" w:cs="Arial" w:eastAsia="Arial" w:hAnsi="Arial"/>
-                <w:sz w:val="21"/>
-                <w:szCs w:val="21"/>
+                <w:sz w:val="19"/>
+                <w:szCs w:val="19"/>
               </w:rPr>
               <w:t xml:space="preserve"> reading the key    </w:t>
             </w:r>
@@ -10235,8 +10171,8 @@
             <w:r>
               <w:rPr>
                 <w:rFonts w:ascii="Arial" w:cs="Arial" w:eastAsia="Arial" w:hAnsi="Arial"/>
-                <w:sz w:val="21"/>
-                <w:szCs w:val="21"/>
+                <w:sz w:val="19"/>
+                <w:szCs w:val="19"/>
               </w:rPr>
               <w:t xml:space="preserve"> comparing    </w:t>
             </w:r>
@@ -10283,8 +10219,8 @@
             <w:r>
               <w:rPr>
                 <w:rFonts w:ascii="Arial" w:cs="Arial" w:eastAsia="Arial" w:hAnsi="Arial"/>
-                <w:sz w:val="21"/>
-                <w:szCs w:val="21"/>
+                <w:sz w:val="19"/>
+                <w:szCs w:val="19"/>
               </w:rPr>
               <w:t xml:space="preserve"> saying why    </w:t>
             </w:r>
@@ -10331,8 +10267,8 @@
             <w:r>
               <w:rPr>
                 <w:rFonts w:ascii="Arial" w:cs="Arial" w:eastAsia="Arial" w:hAnsi="Arial"/>
-                <w:sz w:val="21"/>
-                <w:szCs w:val="21"/>
+                <w:sz w:val="19"/>
+                <w:szCs w:val="19"/>
               </w:rPr>
               <w:t xml:space="preserve"> something else: ____________    </w:t>
             </w:r>
@@ -10340,15 +10276,15 @@
           <w:p>
             <w:pPr>
               <w:keepLines/>
-              <w:spacing w:after="40" w:before="0" w:line="300" w:lineRule="auto"/>
+              <w:spacing w:after="20" w:before="0" w:line="260" w:lineRule="auto"/>
             </w:pPr>
             <w:r>
               <w:rPr>
                 <w:rFonts w:ascii="Arial" w:cs="Arial" w:eastAsia="Arial" w:hAnsi="Arial"/>
                 <w:b/>
                 <w:bCs/>
-                <w:sz w:val="22"/>
-                <w:szCs w:val="22"/>
+                <w:sz w:val="20"/>
+                <w:szCs w:val="20"/>
               </w:rPr>
               <w:t xml:space="preserve">I got unstuck by ...   </w:t>
             </w:r>
@@ -10395,8 +10331,8 @@
             <w:r>
               <w:rPr>
                 <w:rFonts w:ascii="Arial" w:cs="Arial" w:eastAsia="Arial" w:hAnsi="Arial"/>
-                <w:sz w:val="21"/>
-                <w:szCs w:val="21"/>
+                <w:sz w:val="19"/>
+                <w:szCs w:val="19"/>
               </w:rPr>
               <w:t xml:space="preserve"> counters or objects    </w:t>
             </w:r>
@@ -10443,8 +10379,8 @@
             <w:r>
               <w:rPr>
                 <w:rFonts w:ascii="Arial" w:cs="Arial" w:eastAsia="Arial" w:hAnsi="Arial"/>
-                <w:sz w:val="21"/>
-                <w:szCs w:val="21"/>
+                <w:sz w:val="19"/>
+                <w:szCs w:val="19"/>
               </w:rPr>
               <w:t xml:space="preserve"> drawing it    </w:t>
             </w:r>
@@ -10491,8 +10427,8 @@
             <w:r>
               <w:rPr>
                 <w:rFonts w:ascii="Arial" w:cs="Arial" w:eastAsia="Arial" w:hAnsi="Arial"/>
-                <w:sz w:val="21"/>
-                <w:szCs w:val="21"/>
+                <w:sz w:val="19"/>
+                <w:szCs w:val="19"/>
               </w:rPr>
               <w:t xml:space="preserve"> asking someone    </w:t>
             </w:r>
@@ -10539,8 +10475,8 @@
             <w:r>
               <w:rPr>
                 <w:rFonts w:ascii="Arial" w:cs="Arial" w:eastAsia="Arial" w:hAnsi="Arial"/>
-                <w:sz w:val="21"/>
-                <w:szCs w:val="21"/>
+                <w:sz w:val="19"/>
+                <w:szCs w:val="19"/>
               </w:rPr>
               <w:t xml:space="preserve"> trying again    </w:t>
             </w:r>
@@ -10548,15 +10484,15 @@
           <w:p>
             <w:pPr>
               <w:keepLines/>
-              <w:spacing w:after="0" w:before="0" w:line="300" w:lineRule="auto"/>
+              <w:spacing w:after="0" w:before="0" w:line="260" w:lineRule="auto"/>
             </w:pPr>
             <w:r>
               <w:rPr>
                 <w:rFonts w:ascii="Arial" w:cs="Arial" w:eastAsia="Arial" w:hAnsi="Arial"/>
                 <w:b/>
                 <w:bCs/>
-                <w:sz w:val="22"/>
-                <w:szCs w:val="22"/>
+                <w:sz w:val="20"/>
+                <w:szCs w:val="20"/>
               </w:rPr>
               <w:t xml:space="preserve">Next time I will try ...  ______________________     It felt:  </w:t>
             </w:r>
@@ -10603,8 +10539,8 @@
             <w:r>
               <w:rPr>
                 <w:rFonts w:ascii="Arial" w:cs="Arial" w:eastAsia="Arial" w:hAnsi="Arial"/>
-                <w:sz w:val="21"/>
-                <w:szCs w:val="21"/>
+                <w:sz w:val="19"/>
+                <w:szCs w:val="19"/>
               </w:rPr>
               <w:t xml:space="preserve"> easy   </w:t>
             </w:r>
@@ -10651,8 +10587,8 @@
             <w:r>
               <w:rPr>
                 <w:rFonts w:ascii="Arial" w:cs="Arial" w:eastAsia="Arial" w:hAnsi="Arial"/>
-                <w:sz w:val="21"/>
-                <w:szCs w:val="21"/>
+                <w:sz w:val="19"/>
+                <w:szCs w:val="19"/>
               </w:rPr>
               <w:t xml:space="preserve"> OK   </w:t>
             </w:r>
@@ -10699,8 +10635,8 @@
             <w:r>
               <w:rPr>
                 <w:rFonts w:ascii="Arial" w:cs="Arial" w:eastAsia="Arial" w:hAnsi="Arial"/>
-                <w:sz w:val="21"/>
-                <w:szCs w:val="21"/>
+                <w:sz w:val="19"/>
+                <w:szCs w:val="19"/>
               </w:rPr>
               <w:t xml:space="preserve"> hard   </w:t>
             </w:r>
@@ -11517,20 +11453,6 @@
         <w:ind w:left="560"/>
       </w:pPr>
     </w:p>
-    <w:p>
-      <w:pPr>
-        <w:keepLines/>
-        <w:spacing w:after="120" w:before="0" w:line="320" w:lineRule="auto"/>
-      </w:pPr>
-      <w:r>
-        <w:rPr>
-          <w:rFonts w:ascii="Arial" w:cs="Arial" w:eastAsia="Arial" w:hAnsi="Arial"/>
-          <w:sz w:val="26"/>
-          <w:szCs w:val="26"/>
-        </w:rPr>
-        <w:t xml:space="preserve"/>
-      </w:r>
-    </w:p>
     <w:tbl>
       <w:tblPr>
         <w:tblW w:type="dxa" w:w="9900"/>
@@ -11592,7 +11514,7 @@
       <w:pPr>
         <w:keepNext/>
         <w:keepLines/>
-        <w:spacing w:after="40" w:before="100" w:line="320" w:lineRule="auto"/>
+        <w:spacing w:after="20" w:before="60" w:line="320" w:lineRule="auto"/>
         <w:ind w:left="560" w:hanging="560"/>
       </w:pPr>
       <w:r>
@@ -11621,33 +11543,6 @@
         </w:rPr>
         <w:t xml:space="preserve">A picture graph has 1 picture = 1 child: Cats 4, Dogs 6, Fish 2. Draw it again with 1 picture = 2 children. What stays the same? What changes? Could you use 1 picture = 3 children? Why or why not?</w:t>
       </w:r>
-    </w:p>
-    <w:p>
-      <w:pPr>
-        <w:pBdr>
-          <w:bottom w:val="single" w:color="777777" w:sz="6" w:space="1"/>
-        </w:pBdr>
-        <w:spacing w:after="80" w:before="280"/>
-        <w:ind w:left="560"/>
-      </w:pPr>
-    </w:p>
-    <w:p>
-      <w:pPr>
-        <w:pBdr>
-          <w:bottom w:val="single" w:color="777777" w:sz="6" w:space="1"/>
-        </w:pBdr>
-        <w:spacing w:after="80" w:before="280"/>
-        <w:ind w:left="560"/>
-      </w:pPr>
-    </w:p>
-    <w:p>
-      <w:pPr>
-        <w:pBdr>
-          <w:bottom w:val="single" w:color="777777" w:sz="6" w:space="1"/>
-        </w:pBdr>
-        <w:spacing w:after="80" w:before="280"/>
-        <w:ind w:left="560"/>
-      </w:pPr>
     </w:p>
     <w:p>
       <w:pPr>
@@ -11898,9 +11793,9 @@
             </w:tcBorders>
             <w:shd w:fill="E8F5F2" w:color="auto" w:val="clear"/>
             <w:tcMar>
-              <w:top w:type="dxa" w:w="60"/>
+              <w:top w:type="dxa" w:w="40"/>
               <w:left w:type="dxa" w:w="100"/>
-              <w:bottom w:type="dxa" w:w="60"/>
+              <w:bottom w:type="dxa" w:w="40"/>
               <w:right w:type="dxa" w:w="100"/>
             </w:tcMar>
             <w:vAlign w:val="center"/>
@@ -11908,7 +11803,7 @@
           <w:p>
             <w:pPr>
               <w:keepLines/>
-              <w:spacing w:after="0" w:before="0" w:line="260" w:lineRule="auto"/>
+              <w:spacing w:after="0" w:before="0" w:line="240" w:lineRule="auto"/>
             </w:pPr>
             <w:r>
               <w:rPr>
@@ -11916,16 +11811,16 @@
                 <w:b/>
                 <w:bCs/>
                 <w:color w:val="1F7A6F"/>
-                <w:sz w:val="21"/>
-                <w:szCs w:val="21"/>
+                <w:sz w:val="19"/>
+                <w:szCs w:val="19"/>
               </w:rPr>
               <w:t xml:space="preserve">Fast track. </w:t>
             </w:r>
             <w:r>
               <w:rPr>
                 <w:rFonts w:ascii="Arial" w:cs="Arial" w:eastAsia="Arial" w:hAnsi="Arial"/>
-                <w:sz w:val="21"/>
-                <w:szCs w:val="21"/>
+                <w:sz w:val="19"/>
+                <w:szCs w:val="19"/>
               </w:rPr>
               <w:t xml:space="preserve">Got both warm-up check questions right and can say why? Ask your tutor. You may go straight to the Think Harder and Challenge pages and the Open investigation while the group works on this page. Come back to the group for talk time.</w:t>
             </w:r>
@@ -11936,7 +11831,7 @@
     <w:p>
       <w:pPr>
         <w:keepLines/>
-        <w:spacing w:after="60" w:before="0" w:line="320" w:lineRule="auto"/>
+        <w:spacing w:after="40" w:before="0" w:line="320" w:lineRule="auto"/>
       </w:pPr>
       <w:r>
         <w:rPr>
@@ -13335,7 +13230,7 @@
     <w:p>
       <w:pPr>
         <w:keepLines/>
-        <w:spacing w:after="60" w:before="0" w:line="320" w:lineRule="auto"/>
+        <w:spacing w:after="30" w:before="0" w:line="320" w:lineRule="auto"/>
       </w:pPr>
       <w:r>
         <w:rPr>
@@ -13376,9 +13271,9 @@
             </w:tcBorders>
             <w:shd w:fill="FFFDF5" w:color="auto" w:val="clear"/>
             <w:tcMar>
-              <w:top w:type="dxa" w:w="80"/>
+              <w:top w:type="dxa" w:w="50"/>
               <w:left w:type="dxa" w:w="100"/>
-              <w:bottom w:type="dxa" w:w="80"/>
+              <w:bottom w:type="dxa" w:w="50"/>
               <w:right w:type="dxa" w:w="100"/>
             </w:tcMar>
             <w:vAlign w:val="center"/>
@@ -13386,7 +13281,7 @@
           <w:p>
             <w:pPr>
               <w:keepLines/>
-              <w:spacing w:after="60" w:before="0" w:line="320" w:lineRule="auto"/>
+              <w:spacing w:after="30" w:before="0" w:line="320" w:lineRule="auto"/>
             </w:pPr>
             <w:r>
               <w:rPr>
@@ -13402,8 +13297,8 @@
             <w:r>
               <w:rPr>
                 <w:rFonts w:ascii="Arial" w:cs="Arial" w:eastAsia="Arial" w:hAnsi="Arial"/>
-                <w:sz w:val="21"/>
-                <w:szCs w:val="21"/>
+                <w:sz w:val="19"/>
+                <w:szCs w:val="19"/>
               </w:rPr>
               <w:t xml:space="preserve">A one-minute look-back. There are no right answers. Tick or write.</w:t>
             </w:r>
@@ -13411,15 +13306,15 @@
           <w:p>
             <w:pPr>
               <w:keepLines/>
-              <w:spacing w:after="40" w:before="0" w:line="300" w:lineRule="auto"/>
+              <w:spacing w:after="20" w:before="0" w:line="260" w:lineRule="auto"/>
             </w:pPr>
             <w:r>
               <w:rPr>
                 <w:rFonts w:ascii="Arial" w:cs="Arial" w:eastAsia="Arial" w:hAnsi="Arial"/>
                 <w:b/>
                 <w:bCs/>
-                <w:sz w:val="22"/>
-                <w:szCs w:val="22"/>
+                <w:sz w:val="20"/>
+                <w:szCs w:val="20"/>
               </w:rPr>
               <w:t xml:space="preserve">The hardest part was ...   </w:t>
             </w:r>
@@ -13466,8 +13361,8 @@
             <w:r>
               <w:rPr>
                 <w:rFonts w:ascii="Arial" w:cs="Arial" w:eastAsia="Arial" w:hAnsi="Arial"/>
-                <w:sz w:val="21"/>
-                <w:szCs w:val="21"/>
+                <w:sz w:val="19"/>
+                <w:szCs w:val="19"/>
               </w:rPr>
               <w:t xml:space="preserve"> the core    </w:t>
             </w:r>
@@ -13514,8 +13409,8 @@
             <w:r>
               <w:rPr>
                 <w:rFonts w:ascii="Arial" w:cs="Arial" w:eastAsia="Arial" w:hAnsi="Arial"/>
-                <w:sz w:val="21"/>
-                <w:szCs w:val="21"/>
+                <w:sz w:val="19"/>
+                <w:szCs w:val="19"/>
               </w:rPr>
               <w:t xml:space="preserve"> the 30th place    </w:t>
             </w:r>
@@ -13562,8 +13457,8 @@
             <w:r>
               <w:rPr>
                 <w:rFonts w:ascii="Arial" w:cs="Arial" w:eastAsia="Arial" w:hAnsi="Arial"/>
-                <w:sz w:val="21"/>
-                <w:szCs w:val="21"/>
+                <w:sz w:val="19"/>
+                <w:szCs w:val="19"/>
               </w:rPr>
               <w:t xml:space="preserve"> the sticks    </w:t>
             </w:r>
@@ -13610,8 +13505,8 @@
             <w:r>
               <w:rPr>
                 <w:rFonts w:ascii="Arial" w:cs="Arial" w:eastAsia="Arial" w:hAnsi="Arial"/>
-                <w:sz w:val="21"/>
-                <w:szCs w:val="21"/>
+                <w:sz w:val="19"/>
+                <w:szCs w:val="19"/>
               </w:rPr>
               <w:t xml:space="preserve"> something else: ____________    </w:t>
             </w:r>
@@ -13619,15 +13514,15 @@
           <w:p>
             <w:pPr>
               <w:keepLines/>
-              <w:spacing w:after="40" w:before="0" w:line="300" w:lineRule="auto"/>
+              <w:spacing w:after="20" w:before="0" w:line="260" w:lineRule="auto"/>
             </w:pPr>
             <w:r>
               <w:rPr>
                 <w:rFonts w:ascii="Arial" w:cs="Arial" w:eastAsia="Arial" w:hAnsi="Arial"/>
                 <w:b/>
                 <w:bCs/>
-                <w:sz w:val="22"/>
-                <w:szCs w:val="22"/>
+                <w:sz w:val="20"/>
+                <w:szCs w:val="20"/>
               </w:rPr>
               <w:t xml:space="preserve">I got unstuck by ...   </w:t>
             </w:r>
@@ -13674,8 +13569,8 @@
             <w:r>
               <w:rPr>
                 <w:rFonts w:ascii="Arial" w:cs="Arial" w:eastAsia="Arial" w:hAnsi="Arial"/>
-                <w:sz w:val="21"/>
-                <w:szCs w:val="21"/>
+                <w:sz w:val="19"/>
+                <w:szCs w:val="19"/>
               </w:rPr>
               <w:t xml:space="preserve"> counters or objects    </w:t>
             </w:r>
@@ -13722,8 +13617,8 @@
             <w:r>
               <w:rPr>
                 <w:rFonts w:ascii="Arial" w:cs="Arial" w:eastAsia="Arial" w:hAnsi="Arial"/>
-                <w:sz w:val="21"/>
-                <w:szCs w:val="21"/>
+                <w:sz w:val="19"/>
+                <w:szCs w:val="19"/>
               </w:rPr>
               <w:t xml:space="preserve"> drawing it    </w:t>
             </w:r>
@@ -13770,8 +13665,8 @@
             <w:r>
               <w:rPr>
                 <w:rFonts w:ascii="Arial" w:cs="Arial" w:eastAsia="Arial" w:hAnsi="Arial"/>
-                <w:sz w:val="21"/>
-                <w:szCs w:val="21"/>
+                <w:sz w:val="19"/>
+                <w:szCs w:val="19"/>
               </w:rPr>
               <w:t xml:space="preserve"> asking someone    </w:t>
             </w:r>
@@ -13818,8 +13713,8 @@
             <w:r>
               <w:rPr>
                 <w:rFonts w:ascii="Arial" w:cs="Arial" w:eastAsia="Arial" w:hAnsi="Arial"/>
-                <w:sz w:val="21"/>
-                <w:szCs w:val="21"/>
+                <w:sz w:val="19"/>
+                <w:szCs w:val="19"/>
               </w:rPr>
               <w:t xml:space="preserve"> trying again    </w:t>
             </w:r>
@@ -13827,15 +13722,15 @@
           <w:p>
             <w:pPr>
               <w:keepLines/>
-              <w:spacing w:after="0" w:before="0" w:line="300" w:lineRule="auto"/>
+              <w:spacing w:after="0" w:before="0" w:line="260" w:lineRule="auto"/>
             </w:pPr>
             <w:r>
               <w:rPr>
                 <w:rFonts w:ascii="Arial" w:cs="Arial" w:eastAsia="Arial" w:hAnsi="Arial"/>
                 <w:b/>
                 <w:bCs/>
-                <w:sz w:val="22"/>
-                <w:szCs w:val="22"/>
+                <w:sz w:val="20"/>
+                <w:szCs w:val="20"/>
               </w:rPr>
               <w:t xml:space="preserve">Next time I will try ...  ______________________     It felt:  </w:t>
             </w:r>
@@ -13882,8 +13777,8 @@
             <w:r>
               <w:rPr>
                 <w:rFonts w:ascii="Arial" w:cs="Arial" w:eastAsia="Arial" w:hAnsi="Arial"/>
-                <w:sz w:val="21"/>
-                <w:szCs w:val="21"/>
+                <w:sz w:val="19"/>
+                <w:szCs w:val="19"/>
               </w:rPr>
               <w:t xml:space="preserve"> easy   </w:t>
             </w:r>
@@ -13930,8 +13825,8 @@
             <w:r>
               <w:rPr>
                 <w:rFonts w:ascii="Arial" w:cs="Arial" w:eastAsia="Arial" w:hAnsi="Arial"/>
-                <w:sz w:val="21"/>
-                <w:szCs w:val="21"/>
+                <w:sz w:val="19"/>
+                <w:szCs w:val="19"/>
               </w:rPr>
               <w:t xml:space="preserve"> OK   </w:t>
             </w:r>
@@ -13978,8 +13873,8 @@
             <w:r>
               <w:rPr>
                 <w:rFonts w:ascii="Arial" w:cs="Arial" w:eastAsia="Arial" w:hAnsi="Arial"/>
-                <w:sz w:val="21"/>
-                <w:szCs w:val="21"/>
+                <w:sz w:val="19"/>
+                <w:szCs w:val="19"/>
               </w:rPr>
               <w:t xml:space="preserve"> hard   </w:t>
             </w:r>
@@ -14796,20 +14691,6 @@
         <w:ind w:left="560"/>
       </w:pPr>
     </w:p>
-    <w:p>
-      <w:pPr>
-        <w:keepLines/>
-        <w:spacing w:after="120" w:before="0" w:line="320" w:lineRule="auto"/>
-      </w:pPr>
-      <w:r>
-        <w:rPr>
-          <w:rFonts w:ascii="Arial" w:cs="Arial" w:eastAsia="Arial" w:hAnsi="Arial"/>
-          <w:sz w:val="26"/>
-          <w:szCs w:val="26"/>
-        </w:rPr>
-        <w:t xml:space="preserve"/>
-      </w:r>
-    </w:p>
     <w:tbl>
       <w:tblPr>
         <w:tblW w:type="dxa" w:w="9900"/>
@@ -14871,7 +14752,7 @@
       <w:pPr>
         <w:keepNext/>
         <w:keepLines/>
-        <w:spacing w:after="40" w:before="100" w:line="320" w:lineRule="auto"/>
+        <w:spacing w:after="20" w:before="60" w:line="320" w:lineRule="auto"/>
         <w:ind w:left="560" w:hanging="560"/>
       </w:pPr>
       <w:r>
@@ -14900,24 +14781,6 @@
         </w:rPr>
         <w:t xml:space="preserve">Mei says: "In a pattern that repeats every 3 shapes, place 30 is the same shape as place 3." Draw your own 3-shape pattern up to place 9. Test Mei on places 6 and 9, then on place 30. Is she always right? What about a pattern that repeats every 4 shapes: which places match place 4?</w:t>
       </w:r>
-    </w:p>
-    <w:p>
-      <w:pPr>
-        <w:pBdr>
-          <w:bottom w:val="single" w:color="777777" w:sz="6" w:space="1"/>
-        </w:pBdr>
-        <w:spacing w:after="80" w:before="280"/>
-        <w:ind w:left="560"/>
-      </w:pPr>
-    </w:p>
-    <w:p>
-      <w:pPr>
-        <w:pBdr>
-          <w:bottom w:val="single" w:color="777777" w:sz="6" w:space="1"/>
-        </w:pBdr>
-        <w:spacing w:after="80" w:before="280"/>
-        <w:ind w:left="560"/>
-      </w:pPr>
     </w:p>
     <w:p>
       <w:pPr>
@@ -15168,9 +15031,9 @@
             </w:tcBorders>
             <w:shd w:fill="E8F5F2" w:color="auto" w:val="clear"/>
             <w:tcMar>
-              <w:top w:type="dxa" w:w="60"/>
+              <w:top w:type="dxa" w:w="40"/>
               <w:left w:type="dxa" w:w="100"/>
-              <w:bottom w:type="dxa" w:w="60"/>
+              <w:bottom w:type="dxa" w:w="40"/>
               <w:right w:type="dxa" w:w="100"/>
             </w:tcMar>
             <w:vAlign w:val="center"/>
@@ -15178,7 +15041,7 @@
           <w:p>
             <w:pPr>
               <w:keepLines/>
-              <w:spacing w:after="0" w:before="0" w:line="260" w:lineRule="auto"/>
+              <w:spacing w:after="0" w:before="0" w:line="240" w:lineRule="auto"/>
             </w:pPr>
             <w:r>
               <w:rPr>
@@ -15186,16 +15049,16 @@
                 <w:b/>
                 <w:bCs/>
                 <w:color w:val="1F7A6F"/>
-                <w:sz w:val="21"/>
-                <w:szCs w:val="21"/>
+                <w:sz w:val="19"/>
+                <w:szCs w:val="19"/>
               </w:rPr>
               <w:t xml:space="preserve">Fast track. </w:t>
             </w:r>
             <w:r>
               <w:rPr>
                 <w:rFonts w:ascii="Arial" w:cs="Arial" w:eastAsia="Arial" w:hAnsi="Arial"/>
-                <w:sz w:val="21"/>
-                <w:szCs w:val="21"/>
+                <w:sz w:val="19"/>
+                <w:szCs w:val="19"/>
               </w:rPr>
               <w:t xml:space="preserve">Got both warm-up check questions right and can say why? Ask your tutor. You may go straight to the Think Harder and Challenge pages and the Open investigation while the group works on this page. Come back to the group for talk time.</w:t>
             </w:r>
@@ -15206,7 +15069,7 @@
     <w:p>
       <w:pPr>
         <w:keepLines/>
-        <w:spacing w:after="60" w:before="0" w:line="320" w:lineRule="auto"/>
+        <w:spacing w:after="40" w:before="0" w:line="320" w:lineRule="auto"/>
       </w:pPr>
       <w:r>
         <w:rPr>
@@ -17264,7 +17127,7 @@
     <w:p>
       <w:pPr>
         <w:keepLines/>
-        <w:spacing w:after="60" w:before="0" w:line="320" w:lineRule="auto"/>
+        <w:spacing w:after="30" w:before="0" w:line="320" w:lineRule="auto"/>
       </w:pPr>
       <w:r>
         <w:rPr>
@@ -17305,9 +17168,9 @@
             </w:tcBorders>
             <w:shd w:fill="FFFDF5" w:color="auto" w:val="clear"/>
             <w:tcMar>
-              <w:top w:type="dxa" w:w="80"/>
+              <w:top w:type="dxa" w:w="50"/>
               <w:left w:type="dxa" w:w="100"/>
-              <w:bottom w:type="dxa" w:w="80"/>
+              <w:bottom w:type="dxa" w:w="50"/>
               <w:right w:type="dxa" w:w="100"/>
             </w:tcMar>
             <w:vAlign w:val="center"/>
@@ -17315,7 +17178,7 @@
           <w:p>
             <w:pPr>
               <w:keepLines/>
-              <w:spacing w:after="60" w:before="0" w:line="320" w:lineRule="auto"/>
+              <w:spacing w:after="30" w:before="0" w:line="320" w:lineRule="auto"/>
             </w:pPr>
             <w:r>
               <w:rPr>
@@ -17331,8 +17194,8 @@
             <w:r>
               <w:rPr>
                 <w:rFonts w:ascii="Arial" w:cs="Arial" w:eastAsia="Arial" w:hAnsi="Arial"/>
-                <w:sz w:val="21"/>
-                <w:szCs w:val="21"/>
+                <w:sz w:val="19"/>
+                <w:szCs w:val="19"/>
               </w:rPr>
               <w:t xml:space="preserve">A one-minute look-back. There are no right answers. Tick or write.</w:t>
             </w:r>
@@ -17340,15 +17203,15 @@
           <w:p>
             <w:pPr>
               <w:keepLines/>
-              <w:spacing w:after="40" w:before="0" w:line="300" w:lineRule="auto"/>
+              <w:spacing w:after="20" w:before="0" w:line="260" w:lineRule="auto"/>
             </w:pPr>
             <w:r>
               <w:rPr>
                 <w:rFonts w:ascii="Arial" w:cs="Arial" w:eastAsia="Arial" w:hAnsi="Arial"/>
                 <w:b/>
                 <w:bCs/>
-                <w:sz w:val="22"/>
-                <w:szCs w:val="22"/>
+                <w:sz w:val="20"/>
+                <w:szCs w:val="20"/>
               </w:rPr>
               <w:t xml:space="preserve">The hardest part was ...   </w:t>
             </w:r>
@@ -17395,8 +17258,8 @@
             <w:r>
               <w:rPr>
                 <w:rFonts w:ascii="Arial" w:cs="Arial" w:eastAsia="Arial" w:hAnsi="Arial"/>
-                <w:sz w:val="21"/>
-                <w:szCs w:val="21"/>
+                <w:sz w:val="19"/>
+                <w:szCs w:val="19"/>
               </w:rPr>
               <w:t xml:space="preserve"> the machine    </w:t>
             </w:r>
@@ -17443,8 +17306,8 @@
             <w:r>
               <w:rPr>
                 <w:rFonts w:ascii="Arial" w:cs="Arial" w:eastAsia="Arial" w:hAnsi="Arial"/>
-                <w:sz w:val="21"/>
-                <w:szCs w:val="21"/>
+                <w:sz w:val="19"/>
+                <w:szCs w:val="19"/>
               </w:rPr>
               <w:t xml:space="preserve"> undoing the steps    </w:t>
             </w:r>
@@ -17491,8 +17354,8 @@
             <w:r>
               <w:rPr>
                 <w:rFonts w:ascii="Arial" w:cs="Arial" w:eastAsia="Arial" w:hAnsi="Arial"/>
-                <w:sz w:val="21"/>
-                <w:szCs w:val="21"/>
+                <w:sz w:val="19"/>
+                <w:szCs w:val="19"/>
               </w:rPr>
               <w:t xml:space="preserve"> the queue    </w:t>
             </w:r>
@@ -17539,8 +17402,8 @@
             <w:r>
               <w:rPr>
                 <w:rFonts w:ascii="Arial" w:cs="Arial" w:eastAsia="Arial" w:hAnsi="Arial"/>
-                <w:sz w:val="21"/>
-                <w:szCs w:val="21"/>
+                <w:sz w:val="19"/>
+                <w:szCs w:val="19"/>
               </w:rPr>
               <w:t xml:space="preserve"> something else: ____________    </w:t>
             </w:r>
@@ -17548,15 +17411,15 @@
           <w:p>
             <w:pPr>
               <w:keepLines/>
-              <w:spacing w:after="40" w:before="0" w:line="300" w:lineRule="auto"/>
+              <w:spacing w:after="20" w:before="0" w:line="260" w:lineRule="auto"/>
             </w:pPr>
             <w:r>
               <w:rPr>
                 <w:rFonts w:ascii="Arial" w:cs="Arial" w:eastAsia="Arial" w:hAnsi="Arial"/>
                 <w:b/>
                 <w:bCs/>
-                <w:sz w:val="22"/>
-                <w:szCs w:val="22"/>
+                <w:sz w:val="20"/>
+                <w:szCs w:val="20"/>
               </w:rPr>
               <w:t xml:space="preserve">I got unstuck by ...   </w:t>
             </w:r>
@@ -17603,8 +17466,8 @@
             <w:r>
               <w:rPr>
                 <w:rFonts w:ascii="Arial" w:cs="Arial" w:eastAsia="Arial" w:hAnsi="Arial"/>
-                <w:sz w:val="21"/>
-                <w:szCs w:val="21"/>
+                <w:sz w:val="19"/>
+                <w:szCs w:val="19"/>
               </w:rPr>
               <w:t xml:space="preserve"> counters or objects    </w:t>
             </w:r>
@@ -17651,8 +17514,8 @@
             <w:r>
               <w:rPr>
                 <w:rFonts w:ascii="Arial" w:cs="Arial" w:eastAsia="Arial" w:hAnsi="Arial"/>
-                <w:sz w:val="21"/>
-                <w:szCs w:val="21"/>
+                <w:sz w:val="19"/>
+                <w:szCs w:val="19"/>
               </w:rPr>
               <w:t xml:space="preserve"> drawing it    </w:t>
             </w:r>
@@ -17699,8 +17562,8 @@
             <w:r>
               <w:rPr>
                 <w:rFonts w:ascii="Arial" w:cs="Arial" w:eastAsia="Arial" w:hAnsi="Arial"/>
-                <w:sz w:val="21"/>
-                <w:szCs w:val="21"/>
+                <w:sz w:val="19"/>
+                <w:szCs w:val="19"/>
               </w:rPr>
               <w:t xml:space="preserve"> asking someone    </w:t>
             </w:r>
@@ -17747,8 +17610,8 @@
             <w:r>
               <w:rPr>
                 <w:rFonts w:ascii="Arial" w:cs="Arial" w:eastAsia="Arial" w:hAnsi="Arial"/>
-                <w:sz w:val="21"/>
-                <w:szCs w:val="21"/>
+                <w:sz w:val="19"/>
+                <w:szCs w:val="19"/>
               </w:rPr>
               <w:t xml:space="preserve"> trying again    </w:t>
             </w:r>
@@ -17756,15 +17619,15 @@
           <w:p>
             <w:pPr>
               <w:keepLines/>
-              <w:spacing w:after="0" w:before="0" w:line="300" w:lineRule="auto"/>
+              <w:spacing w:after="0" w:before="0" w:line="260" w:lineRule="auto"/>
             </w:pPr>
             <w:r>
               <w:rPr>
                 <w:rFonts w:ascii="Arial" w:cs="Arial" w:eastAsia="Arial" w:hAnsi="Arial"/>
                 <w:b/>
                 <w:bCs/>
-                <w:sz w:val="22"/>
-                <w:szCs w:val="22"/>
+                <w:sz w:val="20"/>
+                <w:szCs w:val="20"/>
               </w:rPr>
               <w:t xml:space="preserve">Next time I will try ...  ______________________     It felt:  </w:t>
             </w:r>
@@ -17811,8 +17674,8 @@
             <w:r>
               <w:rPr>
                 <w:rFonts w:ascii="Arial" w:cs="Arial" w:eastAsia="Arial" w:hAnsi="Arial"/>
-                <w:sz w:val="21"/>
-                <w:szCs w:val="21"/>
+                <w:sz w:val="19"/>
+                <w:szCs w:val="19"/>
               </w:rPr>
               <w:t xml:space="preserve"> easy   </w:t>
             </w:r>
@@ -17859,8 +17722,8 @@
             <w:r>
               <w:rPr>
                 <w:rFonts w:ascii="Arial" w:cs="Arial" w:eastAsia="Arial" w:hAnsi="Arial"/>
-                <w:sz w:val="21"/>
-                <w:szCs w:val="21"/>
+                <w:sz w:val="19"/>
+                <w:szCs w:val="19"/>
               </w:rPr>
               <w:t xml:space="preserve"> OK   </w:t>
             </w:r>
@@ -17907,8 +17770,8 @@
             <w:r>
               <w:rPr>
                 <w:rFonts w:ascii="Arial" w:cs="Arial" w:eastAsia="Arial" w:hAnsi="Arial"/>
-                <w:sz w:val="21"/>
-                <w:szCs w:val="21"/>
+                <w:sz w:val="19"/>
+                <w:szCs w:val="19"/>
               </w:rPr>
               <w:t xml:space="preserve"> hard   </w:t>
             </w:r>
@@ -18725,20 +18588,6 @@
         <w:ind w:left="560"/>
       </w:pPr>
     </w:p>
-    <w:p>
-      <w:pPr>
-        <w:keepLines/>
-        <w:spacing w:after="120" w:before="0" w:line="320" w:lineRule="auto"/>
-      </w:pPr>
-      <w:r>
-        <w:rPr>
-          <w:rFonts w:ascii="Arial" w:cs="Arial" w:eastAsia="Arial" w:hAnsi="Arial"/>
-          <w:sz w:val="26"/>
-          <w:szCs w:val="26"/>
-        </w:rPr>
-        <w:t xml:space="preserve"/>
-      </w:r>
-    </w:p>
     <w:tbl>
       <w:tblPr>
         <w:tblW w:type="dxa" w:w="9900"/>
@@ -18800,7 +18649,7 @@
       <w:pPr>
         <w:keepNext/>
         <w:keepLines/>
-        <w:spacing w:after="40" w:before="100" w:line="320" w:lineRule="auto"/>
+        <w:spacing w:after="20" w:before="60" w:line="320" w:lineRule="auto"/>
         <w:ind w:left="560" w:hanging="560"/>
       </w:pPr>
       <w:r>
@@ -18829,24 +18678,6 @@
         </w:rPr>
         <w:t xml:space="preserve">A number machine adds 6 and then takes away 6. Mei says: "OUT is always the same as IN." Test IN = 3, 10 and 25, and one number you choose. Is Mei always right? Now change the machine: add 6, then take away 4. What happens to every number? Why?</w:t>
       </w:r>
-    </w:p>
-    <w:p>
-      <w:pPr>
-        <w:pBdr>
-          <w:bottom w:val="single" w:color="777777" w:sz="6" w:space="1"/>
-        </w:pBdr>
-        <w:spacing w:after="80" w:before="280"/>
-        <w:ind w:left="560"/>
-      </w:pPr>
-    </w:p>
-    <w:p>
-      <w:pPr>
-        <w:pBdr>
-          <w:bottom w:val="single" w:color="777777" w:sz="6" w:space="1"/>
-        </w:pBdr>
-        <w:spacing w:after="80" w:before="280"/>
-        <w:ind w:left="560"/>
-      </w:pPr>
     </w:p>
     <w:p>
       <w:pPr>
@@ -19097,9 +18928,9 @@
             </w:tcBorders>
             <w:shd w:fill="E8F5F2" w:color="auto" w:val="clear"/>
             <w:tcMar>
-              <w:top w:type="dxa" w:w="60"/>
+              <w:top w:type="dxa" w:w="40"/>
               <w:left w:type="dxa" w:w="100"/>
-              <w:bottom w:type="dxa" w:w="60"/>
+              <w:bottom w:type="dxa" w:w="40"/>
               <w:right w:type="dxa" w:w="100"/>
             </w:tcMar>
             <w:vAlign w:val="center"/>
@@ -19107,7 +18938,7 @@
           <w:p>
             <w:pPr>
               <w:keepLines/>
-              <w:spacing w:after="0" w:before="0" w:line="260" w:lineRule="auto"/>
+              <w:spacing w:after="0" w:before="0" w:line="240" w:lineRule="auto"/>
             </w:pPr>
             <w:r>
               <w:rPr>
@@ -19115,16 +18946,16 @@
                 <w:b/>
                 <w:bCs/>
                 <w:color w:val="1F7A6F"/>
-                <w:sz w:val="21"/>
-                <w:szCs w:val="21"/>
+                <w:sz w:val="19"/>
+                <w:szCs w:val="19"/>
               </w:rPr>
               <w:t xml:space="preserve">Fast track. </w:t>
             </w:r>
             <w:r>
               <w:rPr>
                 <w:rFonts w:ascii="Arial" w:cs="Arial" w:eastAsia="Arial" w:hAnsi="Arial"/>
-                <w:sz w:val="21"/>
-                <w:szCs w:val="21"/>
+                <w:sz w:val="19"/>
+                <w:szCs w:val="19"/>
               </w:rPr>
               <w:t xml:space="preserve">Got both warm-up check questions right and can say why? Ask your tutor. You may go straight to the Think Harder and Challenge pages and the Open investigation while the group works on this page. Come back to the group for talk time.</w:t>
             </w:r>
@@ -19135,7 +18966,7 @@
     <w:p>
       <w:pPr>
         <w:keepLines/>
-        <w:spacing w:after="60" w:before="0" w:line="320" w:lineRule="auto"/>
+        <w:spacing w:after="40" w:before="0" w:line="320" w:lineRule="auto"/>
       </w:pPr>
       <w:r>
         <w:rPr>
@@ -20669,7 +20500,7 @@
     <w:p>
       <w:pPr>
         <w:keepLines/>
-        <w:spacing w:after="60" w:before="0" w:line="320" w:lineRule="auto"/>
+        <w:spacing w:after="30" w:before="0" w:line="320" w:lineRule="auto"/>
       </w:pPr>
       <w:r>
         <w:rPr>
@@ -20710,9 +20541,9 @@
             </w:tcBorders>
             <w:shd w:fill="FFFDF5" w:color="auto" w:val="clear"/>
             <w:tcMar>
-              <w:top w:type="dxa" w:w="80"/>
+              <w:top w:type="dxa" w:w="50"/>
               <w:left w:type="dxa" w:w="100"/>
-              <w:bottom w:type="dxa" w:w="80"/>
+              <w:bottom w:type="dxa" w:w="50"/>
               <w:right w:type="dxa" w:w="100"/>
             </w:tcMar>
             <w:vAlign w:val="center"/>
@@ -20720,7 +20551,7 @@
           <w:p>
             <w:pPr>
               <w:keepLines/>
-              <w:spacing w:after="60" w:before="0" w:line="320" w:lineRule="auto"/>
+              <w:spacing w:after="30" w:before="0" w:line="320" w:lineRule="auto"/>
             </w:pPr>
             <w:r>
               <w:rPr>
@@ -20736,8 +20567,8 @@
             <w:r>
               <w:rPr>
                 <w:rFonts w:ascii="Arial" w:cs="Arial" w:eastAsia="Arial" w:hAnsi="Arial"/>
-                <w:sz w:val="21"/>
-                <w:szCs w:val="21"/>
+                <w:sz w:val="19"/>
+                <w:szCs w:val="19"/>
               </w:rPr>
               <w:t xml:space="preserve">A one-minute look-back. There are no right answers. Tick or write.</w:t>
             </w:r>
@@ -20745,15 +20576,15 @@
           <w:p>
             <w:pPr>
               <w:keepLines/>
-              <w:spacing w:after="40" w:before="0" w:line="300" w:lineRule="auto"/>
+              <w:spacing w:after="20" w:before="0" w:line="260" w:lineRule="auto"/>
             </w:pPr>
             <w:r>
               <w:rPr>
                 <w:rFonts w:ascii="Arial" w:cs="Arial" w:eastAsia="Arial" w:hAnsi="Arial"/>
                 <w:b/>
                 <w:bCs/>
-                <w:sz w:val="22"/>
-                <w:szCs w:val="22"/>
+                <w:sz w:val="20"/>
+                <w:szCs w:val="20"/>
               </w:rPr>
               <w:t xml:space="preserve">The hardest part was ...   </w:t>
             </w:r>
@@ -20800,8 +20631,8 @@
             <w:r>
               <w:rPr>
                 <w:rFonts w:ascii="Arial" w:cs="Arial" w:eastAsia="Arial" w:hAnsi="Arial"/>
-                <w:sz w:val="21"/>
-                <w:szCs w:val="21"/>
+                <w:sz w:val="19"/>
+                <w:szCs w:val="19"/>
               </w:rPr>
               <w:t xml:space="preserve"> finding all the ways    </w:t>
             </w:r>
@@ -20848,8 +20679,8 @@
             <w:r>
               <w:rPr>
                 <w:rFonts w:ascii="Arial" w:cs="Arial" w:eastAsia="Arial" w:hAnsi="Arial"/>
-                <w:sz w:val="21"/>
-                <w:szCs w:val="21"/>
+                <w:sz w:val="19"/>
+                <w:szCs w:val="19"/>
               </w:rPr>
               <w:t xml:space="preserve"> knowing I had them all    </w:t>
             </w:r>
@@ -20896,8 +20727,8 @@
             <w:r>
               <w:rPr>
                 <w:rFonts w:ascii="Arial" w:cs="Arial" w:eastAsia="Arial" w:hAnsi="Arial"/>
-                <w:sz w:val="21"/>
-                <w:szCs w:val="21"/>
+                <w:sz w:val="19"/>
+                <w:szCs w:val="19"/>
               </w:rPr>
               <w:t xml:space="preserve"> the dollars    </w:t>
             </w:r>
@@ -20944,8 +20775,8 @@
             <w:r>
               <w:rPr>
                 <w:rFonts w:ascii="Arial" w:cs="Arial" w:eastAsia="Arial" w:hAnsi="Arial"/>
-                <w:sz w:val="21"/>
-                <w:szCs w:val="21"/>
+                <w:sz w:val="19"/>
+                <w:szCs w:val="19"/>
               </w:rPr>
               <w:t xml:space="preserve"> something else: ____________    </w:t>
             </w:r>
@@ -20953,15 +20784,15 @@
           <w:p>
             <w:pPr>
               <w:keepLines/>
-              <w:spacing w:after="40" w:before="0" w:line="300" w:lineRule="auto"/>
+              <w:spacing w:after="20" w:before="0" w:line="260" w:lineRule="auto"/>
             </w:pPr>
             <w:r>
               <w:rPr>
                 <w:rFonts w:ascii="Arial" w:cs="Arial" w:eastAsia="Arial" w:hAnsi="Arial"/>
                 <w:b/>
                 <w:bCs/>
-                <w:sz w:val="22"/>
-                <w:szCs w:val="22"/>
+                <w:sz w:val="20"/>
+                <w:szCs w:val="20"/>
               </w:rPr>
               <w:t xml:space="preserve">I got unstuck by ...   </w:t>
             </w:r>
@@ -21008,8 +20839,8 @@
             <w:r>
               <w:rPr>
                 <w:rFonts w:ascii="Arial" w:cs="Arial" w:eastAsia="Arial" w:hAnsi="Arial"/>
-                <w:sz w:val="21"/>
-                <w:szCs w:val="21"/>
+                <w:sz w:val="19"/>
+                <w:szCs w:val="19"/>
               </w:rPr>
               <w:t xml:space="preserve"> counters or objects    </w:t>
             </w:r>
@@ -21056,8 +20887,8 @@
             <w:r>
               <w:rPr>
                 <w:rFonts w:ascii="Arial" w:cs="Arial" w:eastAsia="Arial" w:hAnsi="Arial"/>
-                <w:sz w:val="21"/>
-                <w:szCs w:val="21"/>
+                <w:sz w:val="19"/>
+                <w:szCs w:val="19"/>
               </w:rPr>
               <w:t xml:space="preserve"> drawing it    </w:t>
             </w:r>
@@ -21104,8 +20935,8 @@
             <w:r>
               <w:rPr>
                 <w:rFonts w:ascii="Arial" w:cs="Arial" w:eastAsia="Arial" w:hAnsi="Arial"/>
-                <w:sz w:val="21"/>
-                <w:szCs w:val="21"/>
+                <w:sz w:val="19"/>
+                <w:szCs w:val="19"/>
               </w:rPr>
               <w:t xml:space="preserve"> asking someone    </w:t>
             </w:r>
@@ -21152,8 +20983,8 @@
             <w:r>
               <w:rPr>
                 <w:rFonts w:ascii="Arial" w:cs="Arial" w:eastAsia="Arial" w:hAnsi="Arial"/>
-                <w:sz w:val="21"/>
-                <w:szCs w:val="21"/>
+                <w:sz w:val="19"/>
+                <w:szCs w:val="19"/>
               </w:rPr>
               <w:t xml:space="preserve"> trying again    </w:t>
             </w:r>
@@ -21161,15 +20992,15 @@
           <w:p>
             <w:pPr>
               <w:keepLines/>
-              <w:spacing w:after="0" w:before="0" w:line="300" w:lineRule="auto"/>
+              <w:spacing w:after="0" w:before="0" w:line="260" w:lineRule="auto"/>
             </w:pPr>
             <w:r>
               <w:rPr>
                 <w:rFonts w:ascii="Arial" w:cs="Arial" w:eastAsia="Arial" w:hAnsi="Arial"/>
                 <w:b/>
                 <w:bCs/>
-                <w:sz w:val="22"/>
-                <w:szCs w:val="22"/>
+                <w:sz w:val="20"/>
+                <w:szCs w:val="20"/>
               </w:rPr>
               <w:t xml:space="preserve">Next time I will try ...  ______________________     It felt:  </w:t>
             </w:r>
@@ -21216,8 +21047,8 @@
             <w:r>
               <w:rPr>
                 <w:rFonts w:ascii="Arial" w:cs="Arial" w:eastAsia="Arial" w:hAnsi="Arial"/>
-                <w:sz w:val="21"/>
-                <w:szCs w:val="21"/>
+                <w:sz w:val="19"/>
+                <w:szCs w:val="19"/>
               </w:rPr>
               <w:t xml:space="preserve"> easy   </w:t>
             </w:r>
@@ -21264,8 +21095,8 @@
             <w:r>
               <w:rPr>
                 <w:rFonts w:ascii="Arial" w:cs="Arial" w:eastAsia="Arial" w:hAnsi="Arial"/>
-                <w:sz w:val="21"/>
-                <w:szCs w:val="21"/>
+                <w:sz w:val="19"/>
+                <w:szCs w:val="19"/>
               </w:rPr>
               <w:t xml:space="preserve"> OK   </w:t>
             </w:r>
@@ -21312,8 +21143,8 @@
             <w:r>
               <w:rPr>
                 <w:rFonts w:ascii="Arial" w:cs="Arial" w:eastAsia="Arial" w:hAnsi="Arial"/>
-                <w:sz w:val="21"/>
-                <w:szCs w:val="21"/>
+                <w:sz w:val="19"/>
+                <w:szCs w:val="19"/>
               </w:rPr>
               <w:t xml:space="preserve"> hard   </w:t>
             </w:r>
@@ -22130,20 +21961,6 @@
         <w:ind w:left="560"/>
       </w:pPr>
     </w:p>
-    <w:p>
-      <w:pPr>
-        <w:keepLines/>
-        <w:spacing w:after="120" w:before="0" w:line="320" w:lineRule="auto"/>
-      </w:pPr>
-      <w:r>
-        <w:rPr>
-          <w:rFonts w:ascii="Arial" w:cs="Arial" w:eastAsia="Arial" w:hAnsi="Arial"/>
-          <w:sz w:val="26"/>
-          <w:szCs w:val="26"/>
-        </w:rPr>
-        <w:t xml:space="preserve"/>
-      </w:r>
-    </w:p>
     <w:tbl>
       <w:tblPr>
         <w:tblW w:type="dxa" w:w="9900"/>
@@ -22205,7 +22022,7 @@
       <w:pPr>
         <w:keepNext/>
         <w:keepLines/>
-        <w:spacing w:after="40" w:before="100" w:line="320" w:lineRule="auto"/>
+        <w:spacing w:after="20" w:before="60" w:line="320" w:lineRule="auto"/>
         <w:ind w:left="560" w:hanging="560"/>
       </w:pPr>
       <w:r>
@@ -22234,24 +22051,6 @@
         </w:rPr>
         <w:t xml:space="preserve">Our coins are 5¢, 10¢, 20¢ and 50¢. Put the 5¢ coin away. Which amounts from 5¢ to 50¢ (5¢, 10¢, 15¢ ... 50¢) can you NOT make with the 10¢, 20¢ and 50¢ coins? What do those amounts have in common? Why? (Use your coins.)</w:t>
       </w:r>
-    </w:p>
-    <w:p>
-      <w:pPr>
-        <w:pBdr>
-          <w:bottom w:val="single" w:color="777777" w:sz="6" w:space="1"/>
-        </w:pBdr>
-        <w:spacing w:after="80" w:before="280"/>
-        <w:ind w:left="560"/>
-      </w:pPr>
-    </w:p>
-    <w:p>
-      <w:pPr>
-        <w:pBdr>
-          <w:bottom w:val="single" w:color="777777" w:sz="6" w:space="1"/>
-        </w:pBdr>
-        <w:spacing w:after="80" w:before="280"/>
-        <w:ind w:left="560"/>
-      </w:pPr>
     </w:p>
     <w:p>
       <w:pPr>
@@ -22502,9 +22301,9 @@
             </w:tcBorders>
             <w:shd w:fill="E8F5F2" w:color="auto" w:val="clear"/>
             <w:tcMar>
-              <w:top w:type="dxa" w:w="60"/>
+              <w:top w:type="dxa" w:w="40"/>
               <w:left w:type="dxa" w:w="100"/>
-              <w:bottom w:type="dxa" w:w="60"/>
+              <w:bottom w:type="dxa" w:w="40"/>
               <w:right w:type="dxa" w:w="100"/>
             </w:tcMar>
             <w:vAlign w:val="center"/>
@@ -22512,7 +22311,7 @@
           <w:p>
             <w:pPr>
               <w:keepLines/>
-              <w:spacing w:after="0" w:before="0" w:line="260" w:lineRule="auto"/>
+              <w:spacing w:after="0" w:before="0" w:line="240" w:lineRule="auto"/>
             </w:pPr>
             <w:r>
               <w:rPr>
@@ -22520,16 +22319,16 @@
                 <w:b/>
                 <w:bCs/>
                 <w:color w:val="1F7A6F"/>
-                <w:sz w:val="21"/>
-                <w:szCs w:val="21"/>
+                <w:sz w:val="19"/>
+                <w:szCs w:val="19"/>
               </w:rPr>
               <w:t xml:space="preserve">Fast track. </w:t>
             </w:r>
             <w:r>
               <w:rPr>
                 <w:rFonts w:ascii="Arial" w:cs="Arial" w:eastAsia="Arial" w:hAnsi="Arial"/>
-                <w:sz w:val="21"/>
-                <w:szCs w:val="21"/>
+                <w:sz w:val="19"/>
+                <w:szCs w:val="19"/>
               </w:rPr>
               <w:t xml:space="preserve">Got both warm-up check questions right and can say why? Ask your tutor. You may go straight to the Think Harder and Challenge pages and the Open investigation while the group works on this page. Come back to the group for talk time.</w:t>
             </w:r>
@@ -22540,7 +22339,7 @@
     <w:p>
       <w:pPr>
         <w:keepLines/>
-        <w:spacing w:after="60" w:before="0" w:line="320" w:lineRule="auto"/>
+        <w:spacing w:after="40" w:before="0" w:line="320" w:lineRule="auto"/>
       </w:pPr>
       <w:r>
         <w:rPr>
@@ -24314,7 +24113,7 @@
     <w:p>
       <w:pPr>
         <w:keepLines/>
-        <w:spacing w:after="60" w:before="0" w:line="320" w:lineRule="auto"/>
+        <w:spacing w:after="30" w:before="0" w:line="320" w:lineRule="auto"/>
       </w:pPr>
       <w:r>
         <w:rPr>
@@ -24355,9 +24154,9 @@
             </w:tcBorders>
             <w:shd w:fill="FFFDF5" w:color="auto" w:val="clear"/>
             <w:tcMar>
-              <w:top w:type="dxa" w:w="80"/>
+              <w:top w:type="dxa" w:w="50"/>
               <w:left w:type="dxa" w:w="100"/>
-              <w:bottom w:type="dxa" w:w="80"/>
+              <w:bottom w:type="dxa" w:w="50"/>
               <w:right w:type="dxa" w:w="100"/>
             </w:tcMar>
             <w:vAlign w:val="center"/>
@@ -24365,7 +24164,7 @@
           <w:p>
             <w:pPr>
               <w:keepLines/>
-              <w:spacing w:after="60" w:before="0" w:line="320" w:lineRule="auto"/>
+              <w:spacing w:after="30" w:before="0" w:line="320" w:lineRule="auto"/>
             </w:pPr>
             <w:r>
               <w:rPr>
@@ -24381,8 +24180,8 @@
             <w:r>
               <w:rPr>
                 <w:rFonts w:ascii="Arial" w:cs="Arial" w:eastAsia="Arial" w:hAnsi="Arial"/>
-                <w:sz w:val="21"/>
-                <w:szCs w:val="21"/>
+                <w:sz w:val="19"/>
+                <w:szCs w:val="19"/>
               </w:rPr>
               <w:t xml:space="preserve">A one-minute look-back. There are no right answers. Tick or write.</w:t>
             </w:r>
@@ -24390,15 +24189,15 @@
           <w:p>
             <w:pPr>
               <w:keepLines/>
-              <w:spacing w:after="40" w:before="0" w:line="300" w:lineRule="auto"/>
+              <w:spacing w:after="20" w:before="0" w:line="260" w:lineRule="auto"/>
             </w:pPr>
             <w:r>
               <w:rPr>
                 <w:rFonts w:ascii="Arial" w:cs="Arial" w:eastAsia="Arial" w:hAnsi="Arial"/>
                 <w:b/>
                 <w:bCs/>
-                <w:sz w:val="22"/>
-                <w:szCs w:val="22"/>
+                <w:sz w:val="20"/>
+                <w:szCs w:val="20"/>
               </w:rPr>
               <w:t xml:space="preserve">The hardest part was ...   </w:t>
             </w:r>
@@ -24445,8 +24244,8 @@
             <w:r>
               <w:rPr>
                 <w:rFonts w:ascii="Arial" w:cs="Arial" w:eastAsia="Arial" w:hAnsi="Arial"/>
-                <w:sz w:val="21"/>
-                <w:szCs w:val="21"/>
+                <w:sz w:val="19"/>
+                <w:szCs w:val="19"/>
               </w:rPr>
               <w:t xml:space="preserve"> sides and corners    </w:t>
             </w:r>
@@ -24493,8 +24292,8 @@
             <w:r>
               <w:rPr>
                 <w:rFonts w:ascii="Arial" w:cs="Arial" w:eastAsia="Arial" w:hAnsi="Arial"/>
-                <w:sz w:val="21"/>
-                <w:szCs w:val="21"/>
+                <w:sz w:val="19"/>
+                <w:szCs w:val="19"/>
               </w:rPr>
               <w:t xml:space="preserve"> counting triangles    </w:t>
             </w:r>
@@ -24541,8 +24340,8 @@
             <w:r>
               <w:rPr>
                 <w:rFonts w:ascii="Arial" w:cs="Arial" w:eastAsia="Arial" w:hAnsi="Arial"/>
-                <w:sz w:val="21"/>
-                <w:szCs w:val="21"/>
+                <w:sz w:val="19"/>
+                <w:szCs w:val="19"/>
               </w:rPr>
               <w:t xml:space="preserve"> naming shapes    </w:t>
             </w:r>
@@ -24589,8 +24388,8 @@
             <w:r>
               <w:rPr>
                 <w:rFonts w:ascii="Arial" w:cs="Arial" w:eastAsia="Arial" w:hAnsi="Arial"/>
-                <w:sz w:val="21"/>
-                <w:szCs w:val="21"/>
+                <w:sz w:val="19"/>
+                <w:szCs w:val="19"/>
               </w:rPr>
               <w:t xml:space="preserve"> something else: ____________    </w:t>
             </w:r>
@@ -24598,15 +24397,15 @@
           <w:p>
             <w:pPr>
               <w:keepLines/>
-              <w:spacing w:after="40" w:before="0" w:line="300" w:lineRule="auto"/>
+              <w:spacing w:after="20" w:before="0" w:line="260" w:lineRule="auto"/>
             </w:pPr>
             <w:r>
               <w:rPr>
                 <w:rFonts w:ascii="Arial" w:cs="Arial" w:eastAsia="Arial" w:hAnsi="Arial"/>
                 <w:b/>
                 <w:bCs/>
-                <w:sz w:val="22"/>
-                <w:szCs w:val="22"/>
+                <w:sz w:val="20"/>
+                <w:szCs w:val="20"/>
               </w:rPr>
               <w:t xml:space="preserve">I got unstuck by ...   </w:t>
             </w:r>
@@ -24653,8 +24452,8 @@
             <w:r>
               <w:rPr>
                 <w:rFonts w:ascii="Arial" w:cs="Arial" w:eastAsia="Arial" w:hAnsi="Arial"/>
-                <w:sz w:val="21"/>
-                <w:szCs w:val="21"/>
+                <w:sz w:val="19"/>
+                <w:szCs w:val="19"/>
               </w:rPr>
               <w:t xml:space="preserve"> counters or objects    </w:t>
             </w:r>
@@ -24701,8 +24500,8 @@
             <w:r>
               <w:rPr>
                 <w:rFonts w:ascii="Arial" w:cs="Arial" w:eastAsia="Arial" w:hAnsi="Arial"/>
-                <w:sz w:val="21"/>
-                <w:szCs w:val="21"/>
+                <w:sz w:val="19"/>
+                <w:szCs w:val="19"/>
               </w:rPr>
               <w:t xml:space="preserve"> drawing it    </w:t>
             </w:r>
@@ -24749,8 +24548,8 @@
             <w:r>
               <w:rPr>
                 <w:rFonts w:ascii="Arial" w:cs="Arial" w:eastAsia="Arial" w:hAnsi="Arial"/>
-                <w:sz w:val="21"/>
-                <w:szCs w:val="21"/>
+                <w:sz w:val="19"/>
+                <w:szCs w:val="19"/>
               </w:rPr>
               <w:t xml:space="preserve"> asking someone    </w:t>
             </w:r>
@@ -24797,8 +24596,8 @@
             <w:r>
               <w:rPr>
                 <w:rFonts w:ascii="Arial" w:cs="Arial" w:eastAsia="Arial" w:hAnsi="Arial"/>
-                <w:sz w:val="21"/>
-                <w:szCs w:val="21"/>
+                <w:sz w:val="19"/>
+                <w:szCs w:val="19"/>
               </w:rPr>
               <w:t xml:space="preserve"> trying again    </w:t>
             </w:r>
@@ -24806,15 +24605,15 @@
           <w:p>
             <w:pPr>
               <w:keepLines/>
-              <w:spacing w:after="0" w:before="0" w:line="300" w:lineRule="auto"/>
+              <w:spacing w:after="0" w:before="0" w:line="260" w:lineRule="auto"/>
             </w:pPr>
             <w:r>
               <w:rPr>
                 <w:rFonts w:ascii="Arial" w:cs="Arial" w:eastAsia="Arial" w:hAnsi="Arial"/>
                 <w:b/>
                 <w:bCs/>
-                <w:sz w:val="22"/>
-                <w:szCs w:val="22"/>
+                <w:sz w:val="20"/>
+                <w:szCs w:val="20"/>
               </w:rPr>
               <w:t xml:space="preserve">Next time I will try ...  ______________________     It felt:  </w:t>
             </w:r>
@@ -24861,8 +24660,8 @@
             <w:r>
               <w:rPr>
                 <w:rFonts w:ascii="Arial" w:cs="Arial" w:eastAsia="Arial" w:hAnsi="Arial"/>
-                <w:sz w:val="21"/>
-                <w:szCs w:val="21"/>
+                <w:sz w:val="19"/>
+                <w:szCs w:val="19"/>
               </w:rPr>
               <w:t xml:space="preserve"> easy   </w:t>
             </w:r>
@@ -24909,8 +24708,8 @@
             <w:r>
               <w:rPr>
                 <w:rFonts w:ascii="Arial" w:cs="Arial" w:eastAsia="Arial" w:hAnsi="Arial"/>
-                <w:sz w:val="21"/>
-                <w:szCs w:val="21"/>
+                <w:sz w:val="19"/>
+                <w:szCs w:val="19"/>
               </w:rPr>
               <w:t xml:space="preserve"> OK   </w:t>
             </w:r>
@@ -24957,8 +24756,8 @@
             <w:r>
               <w:rPr>
                 <w:rFonts w:ascii="Arial" w:cs="Arial" w:eastAsia="Arial" w:hAnsi="Arial"/>
-                <w:sz w:val="21"/>
-                <w:szCs w:val="21"/>
+                <w:sz w:val="19"/>
+                <w:szCs w:val="19"/>
               </w:rPr>
               <w:t xml:space="preserve"> hard   </w:t>
             </w:r>
@@ -25775,20 +25574,6 @@
         <w:ind w:left="560"/>
       </w:pPr>
     </w:p>
-    <w:p>
-      <w:pPr>
-        <w:keepLines/>
-        <w:spacing w:after="120" w:before="0" w:line="320" w:lineRule="auto"/>
-      </w:pPr>
-      <w:r>
-        <w:rPr>
-          <w:rFonts w:ascii="Arial" w:cs="Arial" w:eastAsia="Arial" w:hAnsi="Arial"/>
-          <w:sz w:val="26"/>
-          <w:szCs w:val="26"/>
-        </w:rPr>
-        <w:t xml:space="preserve"/>
-      </w:r>
-    </w:p>
     <w:tbl>
       <w:tblPr>
         <w:tblW w:type="dxa" w:w="9900"/>
@@ -25850,7 +25635,7 @@
       <w:pPr>
         <w:keepNext/>
         <w:keepLines/>
-        <w:spacing w:after="40" w:before="100" w:line="320" w:lineRule="auto"/>
+        <w:spacing w:after="20" w:before="60" w:line="320" w:lineRule="auto"/>
         <w:ind w:left="560" w:hanging="560"/>
       </w:pPr>
       <w:r>
@@ -25879,42 +25664,6 @@
         </w:rPr>
         <w:t xml:space="preserve">Join 3 squares so that whole sides touch. How many different shapes can you make? Turning or flipping a shape does not make a new one. Draw each shape you find. Then try with 4 squares. Use paper squares or counters to help.</w:t>
       </w:r>
-    </w:p>
-    <w:p>
-      <w:pPr>
-        <w:pBdr>
-          <w:bottom w:val="single" w:color="777777" w:sz="6" w:space="1"/>
-        </w:pBdr>
-        <w:spacing w:after="80" w:before="280"/>
-        <w:ind w:left="560"/>
-      </w:pPr>
-    </w:p>
-    <w:p>
-      <w:pPr>
-        <w:pBdr>
-          <w:bottom w:val="single" w:color="777777" w:sz="6" w:space="1"/>
-        </w:pBdr>
-        <w:spacing w:after="80" w:before="280"/>
-        <w:ind w:left="560"/>
-      </w:pPr>
-    </w:p>
-    <w:p>
-      <w:pPr>
-        <w:pBdr>
-          <w:bottom w:val="single" w:color="777777" w:sz="6" w:space="1"/>
-        </w:pBdr>
-        <w:spacing w:after="80" w:before="280"/>
-        <w:ind w:left="560"/>
-      </w:pPr>
-    </w:p>
-    <w:p>
-      <w:pPr>
-        <w:pBdr>
-          <w:bottom w:val="single" w:color="777777" w:sz="6" w:space="1"/>
-        </w:pBdr>
-        <w:spacing w:after="80" w:before="280"/>
-        <w:ind w:left="560"/>
-      </w:pPr>
     </w:p>
     <w:p>
       <w:pPr>
@@ -26165,9 +25914,9 @@
             </w:tcBorders>
             <w:shd w:fill="E8F5F2" w:color="auto" w:val="clear"/>
             <w:tcMar>
-              <w:top w:type="dxa" w:w="60"/>
+              <w:top w:type="dxa" w:w="40"/>
               <w:left w:type="dxa" w:w="100"/>
-              <w:bottom w:type="dxa" w:w="60"/>
+              <w:bottom w:type="dxa" w:w="40"/>
               <w:right w:type="dxa" w:w="100"/>
             </w:tcMar>
             <w:vAlign w:val="center"/>
@@ -26175,7 +25924,7 @@
           <w:p>
             <w:pPr>
               <w:keepLines/>
-              <w:spacing w:after="0" w:before="0" w:line="260" w:lineRule="auto"/>
+              <w:spacing w:after="0" w:before="0" w:line="240" w:lineRule="auto"/>
             </w:pPr>
             <w:r>
               <w:rPr>
@@ -26183,16 +25932,16 @@
                 <w:b/>
                 <w:bCs/>
                 <w:color w:val="1F7A6F"/>
-                <w:sz w:val="21"/>
-                <w:szCs w:val="21"/>
+                <w:sz w:val="19"/>
+                <w:szCs w:val="19"/>
               </w:rPr>
               <w:t xml:space="preserve">Fast track. </w:t>
             </w:r>
             <w:r>
               <w:rPr>
                 <w:rFonts w:ascii="Arial" w:cs="Arial" w:eastAsia="Arial" w:hAnsi="Arial"/>
-                <w:sz w:val="21"/>
-                <w:szCs w:val="21"/>
+                <w:sz w:val="19"/>
+                <w:szCs w:val="19"/>
               </w:rPr>
               <w:t xml:space="preserve">Got both warm-up check questions right and can say why? Ask your tutor. You may go straight to the Think Harder and Challenge pages and the Open investigation while the group works on this page. Come back to the group for talk time.</w:t>
             </w:r>
@@ -26203,7 +25952,7 @@
     <w:p>
       <w:pPr>
         <w:keepLines/>
-        <w:spacing w:after="60" w:before="0" w:line="320" w:lineRule="auto"/>
+        <w:spacing w:after="40" w:before="0" w:line="320" w:lineRule="auto"/>
       </w:pPr>
       <w:r>
         <w:rPr>
@@ -27768,7 +27517,7 @@
     <w:p>
       <w:pPr>
         <w:keepLines/>
-        <w:spacing w:after="60" w:before="0" w:line="320" w:lineRule="auto"/>
+        <w:spacing w:after="30" w:before="0" w:line="320" w:lineRule="auto"/>
       </w:pPr>
       <w:r>
         <w:rPr>
@@ -27809,9 +27558,9 @@
             </w:tcBorders>
             <w:shd w:fill="FFFDF5" w:color="auto" w:val="clear"/>
             <w:tcMar>
-              <w:top w:type="dxa" w:w="80"/>
+              <w:top w:type="dxa" w:w="50"/>
               <w:left w:type="dxa" w:w="100"/>
-              <w:bottom w:type="dxa" w:w="80"/>
+              <w:bottom w:type="dxa" w:w="50"/>
               <w:right w:type="dxa" w:w="100"/>
             </w:tcMar>
             <w:vAlign w:val="center"/>
@@ -27819,7 +27568,7 @@
           <w:p>
             <w:pPr>
               <w:keepLines/>
-              <w:spacing w:after="60" w:before="0" w:line="320" w:lineRule="auto"/>
+              <w:spacing w:after="30" w:before="0" w:line="320" w:lineRule="auto"/>
             </w:pPr>
             <w:r>
               <w:rPr>
@@ -27835,8 +27584,8 @@
             <w:r>
               <w:rPr>
                 <w:rFonts w:ascii="Arial" w:cs="Arial" w:eastAsia="Arial" w:hAnsi="Arial"/>
-                <w:sz w:val="21"/>
-                <w:szCs w:val="21"/>
+                <w:sz w:val="19"/>
+                <w:szCs w:val="19"/>
               </w:rPr>
               <w:t xml:space="preserve">A one-minute look-back. There are no right answers. Tick or write.</w:t>
             </w:r>
@@ -27844,15 +27593,15 @@
           <w:p>
             <w:pPr>
               <w:keepLines/>
-              <w:spacing w:after="40" w:before="0" w:line="300" w:lineRule="auto"/>
+              <w:spacing w:after="20" w:before="0" w:line="260" w:lineRule="auto"/>
             </w:pPr>
             <w:r>
               <w:rPr>
                 <w:rFonts w:ascii="Arial" w:cs="Arial" w:eastAsia="Arial" w:hAnsi="Arial"/>
                 <w:b/>
                 <w:bCs/>
-                <w:sz w:val="22"/>
-                <w:szCs w:val="22"/>
+                <w:sz w:val="20"/>
+                <w:szCs w:val="20"/>
               </w:rPr>
               <w:t xml:space="preserve">The hardest part was ...   </w:t>
             </w:r>
@@ -27899,8 +27648,8 @@
             <w:r>
               <w:rPr>
                 <w:rFonts w:ascii="Arial" w:cs="Arial" w:eastAsia="Arial" w:hAnsi="Arial"/>
-                <w:sz w:val="21"/>
-                <w:szCs w:val="21"/>
+                <w:sz w:val="19"/>
+                <w:szCs w:val="19"/>
               </w:rPr>
               <w:t xml:space="preserve"> the grid    </w:t>
             </w:r>
@@ -27947,8 +27696,8 @@
             <w:r>
               <w:rPr>
                 <w:rFonts w:ascii="Arial" w:cs="Arial" w:eastAsia="Arial" w:hAnsi="Arial"/>
-                <w:sz w:val="21"/>
-                <w:szCs w:val="21"/>
+                <w:sz w:val="19"/>
+                <w:szCs w:val="19"/>
               </w:rPr>
               <w:t xml:space="preserve"> the two-loop picture    </w:t>
             </w:r>
@@ -27995,8 +27744,8 @@
             <w:r>
               <w:rPr>
                 <w:rFonts w:ascii="Arial" w:cs="Arial" w:eastAsia="Arial" w:hAnsi="Arial"/>
-                <w:sz w:val="21"/>
-                <w:szCs w:val="21"/>
+                <w:sz w:val="19"/>
+                <w:szCs w:val="19"/>
               </w:rPr>
               <w:t xml:space="preserve"> the clues    </w:t>
             </w:r>
@@ -28043,8 +27792,8 @@
             <w:r>
               <w:rPr>
                 <w:rFonts w:ascii="Arial" w:cs="Arial" w:eastAsia="Arial" w:hAnsi="Arial"/>
-                <w:sz w:val="21"/>
-                <w:szCs w:val="21"/>
+                <w:sz w:val="19"/>
+                <w:szCs w:val="19"/>
               </w:rPr>
               <w:t xml:space="preserve"> something else: ____________    </w:t>
             </w:r>
@@ -28052,15 +27801,15 @@
           <w:p>
             <w:pPr>
               <w:keepLines/>
-              <w:spacing w:after="40" w:before="0" w:line="300" w:lineRule="auto"/>
+              <w:spacing w:after="20" w:before="0" w:line="260" w:lineRule="auto"/>
             </w:pPr>
             <w:r>
               <w:rPr>
                 <w:rFonts w:ascii="Arial" w:cs="Arial" w:eastAsia="Arial" w:hAnsi="Arial"/>
                 <w:b/>
                 <w:bCs/>
-                <w:sz w:val="22"/>
-                <w:szCs w:val="22"/>
+                <w:sz w:val="20"/>
+                <w:szCs w:val="20"/>
               </w:rPr>
               <w:t xml:space="preserve">I got unstuck by ...   </w:t>
             </w:r>
@@ -28107,8 +27856,8 @@
             <w:r>
               <w:rPr>
                 <w:rFonts w:ascii="Arial" w:cs="Arial" w:eastAsia="Arial" w:hAnsi="Arial"/>
-                <w:sz w:val="21"/>
-                <w:szCs w:val="21"/>
+                <w:sz w:val="19"/>
+                <w:szCs w:val="19"/>
               </w:rPr>
               <w:t xml:space="preserve"> counters or objects    </w:t>
             </w:r>
@@ -28155,8 +27904,8 @@
             <w:r>
               <w:rPr>
                 <w:rFonts w:ascii="Arial" w:cs="Arial" w:eastAsia="Arial" w:hAnsi="Arial"/>
-                <w:sz w:val="21"/>
-                <w:szCs w:val="21"/>
+                <w:sz w:val="19"/>
+                <w:szCs w:val="19"/>
               </w:rPr>
               <w:t xml:space="preserve"> drawing it    </w:t>
             </w:r>
@@ -28203,8 +27952,8 @@
             <w:r>
               <w:rPr>
                 <w:rFonts w:ascii="Arial" w:cs="Arial" w:eastAsia="Arial" w:hAnsi="Arial"/>
-                <w:sz w:val="21"/>
-                <w:szCs w:val="21"/>
+                <w:sz w:val="19"/>
+                <w:szCs w:val="19"/>
               </w:rPr>
               <w:t xml:space="preserve"> asking someone    </w:t>
             </w:r>
@@ -28251,8 +28000,8 @@
             <w:r>
               <w:rPr>
                 <w:rFonts w:ascii="Arial" w:cs="Arial" w:eastAsia="Arial" w:hAnsi="Arial"/>
-                <w:sz w:val="21"/>
-                <w:szCs w:val="21"/>
+                <w:sz w:val="19"/>
+                <w:szCs w:val="19"/>
               </w:rPr>
               <w:t xml:space="preserve"> trying again    </w:t>
             </w:r>
@@ -28260,15 +28009,15 @@
           <w:p>
             <w:pPr>
               <w:keepLines/>
-              <w:spacing w:after="0" w:before="0" w:line="300" w:lineRule="auto"/>
+              <w:spacing w:after="0" w:before="0" w:line="260" w:lineRule="auto"/>
             </w:pPr>
             <w:r>
               <w:rPr>
                 <w:rFonts w:ascii="Arial" w:cs="Arial" w:eastAsia="Arial" w:hAnsi="Arial"/>
                 <w:b/>
                 <w:bCs/>
-                <w:sz w:val="22"/>
-                <w:szCs w:val="22"/>
+                <w:sz w:val="20"/>
+                <w:szCs w:val="20"/>
               </w:rPr>
               <w:t xml:space="preserve">Next time I will try ...  ______________________     It felt:  </w:t>
             </w:r>
@@ -28315,8 +28064,8 @@
             <w:r>
               <w:rPr>
                 <w:rFonts w:ascii="Arial" w:cs="Arial" w:eastAsia="Arial" w:hAnsi="Arial"/>
-                <w:sz w:val="21"/>
-                <w:szCs w:val="21"/>
+                <w:sz w:val="19"/>
+                <w:szCs w:val="19"/>
               </w:rPr>
               <w:t xml:space="preserve"> easy   </w:t>
             </w:r>
@@ -28363,8 +28112,8 @@
             <w:r>
               <w:rPr>
                 <w:rFonts w:ascii="Arial" w:cs="Arial" w:eastAsia="Arial" w:hAnsi="Arial"/>
-                <w:sz w:val="21"/>
-                <w:szCs w:val="21"/>
+                <w:sz w:val="19"/>
+                <w:szCs w:val="19"/>
               </w:rPr>
               <w:t xml:space="preserve"> OK   </w:t>
             </w:r>
@@ -28411,8 +28160,8 @@
             <w:r>
               <w:rPr>
                 <w:rFonts w:ascii="Arial" w:cs="Arial" w:eastAsia="Arial" w:hAnsi="Arial"/>
-                <w:sz w:val="21"/>
-                <w:szCs w:val="21"/>
+                <w:sz w:val="19"/>
+                <w:szCs w:val="19"/>
               </w:rPr>
               <w:t xml:space="preserve"> hard   </w:t>
             </w:r>
@@ -29229,20 +28978,6 @@
         <w:ind w:left="560"/>
       </w:pPr>
     </w:p>
-    <w:p>
-      <w:pPr>
-        <w:keepLines/>
-        <w:spacing w:after="120" w:before="0" w:line="320" w:lineRule="auto"/>
-      </w:pPr>
-      <w:r>
-        <w:rPr>
-          <w:rFonts w:ascii="Arial" w:cs="Arial" w:eastAsia="Arial" w:hAnsi="Arial"/>
-          <w:sz w:val="26"/>
-          <w:szCs w:val="26"/>
-        </w:rPr>
-        <w:t xml:space="preserve"/>
-      </w:r>
-    </w:p>
     <w:tbl>
       <w:tblPr>
         <w:tblW w:type="dxa" w:w="9900"/>
@@ -29304,7 +29039,7 @@
       <w:pPr>
         <w:keepNext/>
         <w:keepLines/>
-        <w:spacing w:after="40" w:before="100" w:line="320" w:lineRule="auto"/>
+        <w:spacing w:after="20" w:before="60" w:line="320" w:lineRule="auto"/>
         <w:ind w:left="560" w:hanging="560"/>
       </w:pPr>
       <w:r>
@@ -29333,33 +29068,6 @@
         </w:rPr>
         <w:t xml:space="preserve">Ali, Mei and Ben stand in a line. Write ALL the different orders they can stand in. How do you know you have them all? Now add a clue: "Ali is not first." How many orders are left? Make up your own clue so that only ONE order is left.</w:t>
       </w:r>
-    </w:p>
-    <w:p>
-      <w:pPr>
-        <w:pBdr>
-          <w:bottom w:val="single" w:color="777777" w:sz="6" w:space="1"/>
-        </w:pBdr>
-        <w:spacing w:after="80" w:before="280"/>
-        <w:ind w:left="560"/>
-      </w:pPr>
-    </w:p>
-    <w:p>
-      <w:pPr>
-        <w:pBdr>
-          <w:bottom w:val="single" w:color="777777" w:sz="6" w:space="1"/>
-        </w:pBdr>
-        <w:spacing w:after="80" w:before="280"/>
-        <w:ind w:left="560"/>
-      </w:pPr>
-    </w:p>
-    <w:p>
-      <w:pPr>
-        <w:pBdr>
-          <w:bottom w:val="single" w:color="777777" w:sz="6" w:space="1"/>
-        </w:pBdr>
-        <w:spacing w:after="80" w:before="280"/>
-        <w:ind w:left="560"/>
-      </w:pPr>
     </w:p>
     <w:p>
       <w:pPr>
@@ -29610,9 +29318,9 @@
             </w:tcBorders>
             <w:shd w:fill="E8F5F2" w:color="auto" w:val="clear"/>
             <w:tcMar>
-              <w:top w:type="dxa" w:w="60"/>
+              <w:top w:type="dxa" w:w="40"/>
               <w:left w:type="dxa" w:w="100"/>
-              <w:bottom w:type="dxa" w:w="60"/>
+              <w:bottom w:type="dxa" w:w="40"/>
               <w:right w:type="dxa" w:w="100"/>
             </w:tcMar>
             <w:vAlign w:val="center"/>
@@ -29620,7 +29328,7 @@
           <w:p>
             <w:pPr>
               <w:keepLines/>
-              <w:spacing w:after="0" w:before="0" w:line="260" w:lineRule="auto"/>
+              <w:spacing w:after="0" w:before="0" w:line="240" w:lineRule="auto"/>
             </w:pPr>
             <w:r>
               <w:rPr>
@@ -29628,16 +29336,16 @@
                 <w:b/>
                 <w:bCs/>
                 <w:color w:val="1F7A6F"/>
-                <w:sz w:val="21"/>
-                <w:szCs w:val="21"/>
+                <w:sz w:val="19"/>
+                <w:szCs w:val="19"/>
               </w:rPr>
               <w:t xml:space="preserve">Fast track. </w:t>
             </w:r>
             <w:r>
               <w:rPr>
                 <w:rFonts w:ascii="Arial" w:cs="Arial" w:eastAsia="Arial" w:hAnsi="Arial"/>
-                <w:sz w:val="21"/>
-                <w:szCs w:val="21"/>
+                <w:sz w:val="19"/>
+                <w:szCs w:val="19"/>
               </w:rPr>
               <w:t xml:space="preserve">Got both warm-up check questions right and can say why? Ask your tutor. You may go straight to the Think Harder and Challenge pages and the Open investigation while the group works on this page. Come back to the group for talk time.</w:t>
             </w:r>
@@ -29648,7 +29356,7 @@
     <w:p>
       <w:pPr>
         <w:keepLines/>
-        <w:spacing w:after="60" w:before="0" w:line="320" w:lineRule="auto"/>
+        <w:spacing w:after="40" w:before="0" w:line="320" w:lineRule="auto"/>
       </w:pPr>
       <w:r>
         <w:rPr>
@@ -31030,7 +30738,7 @@
     <w:p>
       <w:pPr>
         <w:keepLines/>
-        <w:spacing w:after="60" w:before="0" w:line="320" w:lineRule="auto"/>
+        <w:spacing w:after="30" w:before="0" w:line="320" w:lineRule="auto"/>
       </w:pPr>
       <w:r>
         <w:rPr>
@@ -31071,9 +30779,9 @@
             </w:tcBorders>
             <w:shd w:fill="FFFDF5" w:color="auto" w:val="clear"/>
             <w:tcMar>
-              <w:top w:type="dxa" w:w="80"/>
+              <w:top w:type="dxa" w:w="50"/>
               <w:left w:type="dxa" w:w="100"/>
-              <w:bottom w:type="dxa" w:w="80"/>
+              <w:bottom w:type="dxa" w:w="50"/>
               <w:right w:type="dxa" w:w="100"/>
             </w:tcMar>
             <w:vAlign w:val="center"/>
@@ -31081,7 +30789,7 @@
           <w:p>
             <w:pPr>
               <w:keepLines/>
-              <w:spacing w:after="60" w:before="0" w:line="320" w:lineRule="auto"/>
+              <w:spacing w:after="30" w:before="0" w:line="320" w:lineRule="auto"/>
             </w:pPr>
             <w:r>
               <w:rPr>
@@ -31097,8 +30805,8 @@
             <w:r>
               <w:rPr>
                 <w:rFonts w:ascii="Arial" w:cs="Arial" w:eastAsia="Arial" w:hAnsi="Arial"/>
-                <w:sz w:val="21"/>
-                <w:szCs w:val="21"/>
+                <w:sz w:val="19"/>
+                <w:szCs w:val="19"/>
               </w:rPr>
               <w:t xml:space="preserve">A one-minute look-back. There are no right answers. Tick or write.</w:t>
             </w:r>
@@ -31106,15 +30814,15 @@
           <w:p>
             <w:pPr>
               <w:keepLines/>
-              <w:spacing w:after="40" w:before="0" w:line="300" w:lineRule="auto"/>
+              <w:spacing w:after="20" w:before="0" w:line="260" w:lineRule="auto"/>
             </w:pPr>
             <w:r>
               <w:rPr>
                 <w:rFonts w:ascii="Arial" w:cs="Arial" w:eastAsia="Arial" w:hAnsi="Arial"/>
                 <w:b/>
                 <w:bCs/>
-                <w:sz w:val="22"/>
-                <w:szCs w:val="22"/>
+                <w:sz w:val="20"/>
+                <w:szCs w:val="20"/>
               </w:rPr>
               <w:t xml:space="preserve">The hardest part was ...   </w:t>
             </w:r>
@@ -31161,8 +30869,8 @@
             <w:r>
               <w:rPr>
                 <w:rFonts w:ascii="Arial" w:cs="Arial" w:eastAsia="Arial" w:hAnsi="Arial"/>
-                <w:sz w:val="21"/>
-                <w:szCs w:val="21"/>
+                <w:sz w:val="19"/>
+                <w:szCs w:val="19"/>
               </w:rPr>
               <w:t xml:space="preserve"> the ruler    </w:t>
             </w:r>
@@ -31209,8 +30917,8 @@
             <w:r>
               <w:rPr>
                 <w:rFonts w:ascii="Arial" w:cs="Arial" w:eastAsia="Arial" w:hAnsi="Arial"/>
-                <w:sz w:val="21"/>
-                <w:szCs w:val="21"/>
+                <w:sz w:val="19"/>
+                <w:szCs w:val="19"/>
               </w:rPr>
               <w:t xml:space="preserve"> the units    </w:t>
             </w:r>
@@ -31257,8 +30965,8 @@
             <w:r>
               <w:rPr>
                 <w:rFonts w:ascii="Arial" w:cs="Arial" w:eastAsia="Arial" w:hAnsi="Arial"/>
-                <w:sz w:val="21"/>
-                <w:szCs w:val="21"/>
+                <w:sz w:val="19"/>
+                <w:szCs w:val="19"/>
               </w:rPr>
               <w:t xml:space="preserve"> guessing    </w:t>
             </w:r>
@@ -31305,8 +31013,8 @@
             <w:r>
               <w:rPr>
                 <w:rFonts w:ascii="Arial" w:cs="Arial" w:eastAsia="Arial" w:hAnsi="Arial"/>
-                <w:sz w:val="21"/>
-                <w:szCs w:val="21"/>
+                <w:sz w:val="19"/>
+                <w:szCs w:val="19"/>
               </w:rPr>
               <w:t xml:space="preserve"> something else: ____________    </w:t>
             </w:r>
@@ -31314,15 +31022,15 @@
           <w:p>
             <w:pPr>
               <w:keepLines/>
-              <w:spacing w:after="40" w:before="0" w:line="300" w:lineRule="auto"/>
+              <w:spacing w:after="20" w:before="0" w:line="260" w:lineRule="auto"/>
             </w:pPr>
             <w:r>
               <w:rPr>
                 <w:rFonts w:ascii="Arial" w:cs="Arial" w:eastAsia="Arial" w:hAnsi="Arial"/>
                 <w:b/>
                 <w:bCs/>
-                <w:sz w:val="22"/>
-                <w:szCs w:val="22"/>
+                <w:sz w:val="20"/>
+                <w:szCs w:val="20"/>
               </w:rPr>
               <w:t xml:space="preserve">I got unstuck by ...   </w:t>
             </w:r>
@@ -31369,8 +31077,8 @@
             <w:r>
               <w:rPr>
                 <w:rFonts w:ascii="Arial" w:cs="Arial" w:eastAsia="Arial" w:hAnsi="Arial"/>
-                <w:sz w:val="21"/>
-                <w:szCs w:val="21"/>
+                <w:sz w:val="19"/>
+                <w:szCs w:val="19"/>
               </w:rPr>
               <w:t xml:space="preserve"> counters or objects    </w:t>
             </w:r>
@@ -31417,8 +31125,8 @@
             <w:r>
               <w:rPr>
                 <w:rFonts w:ascii="Arial" w:cs="Arial" w:eastAsia="Arial" w:hAnsi="Arial"/>
-                <w:sz w:val="21"/>
-                <w:szCs w:val="21"/>
+                <w:sz w:val="19"/>
+                <w:szCs w:val="19"/>
               </w:rPr>
               <w:t xml:space="preserve"> drawing it    </w:t>
             </w:r>
@@ -31465,8 +31173,8 @@
             <w:r>
               <w:rPr>
                 <w:rFonts w:ascii="Arial" w:cs="Arial" w:eastAsia="Arial" w:hAnsi="Arial"/>
-                <w:sz w:val="21"/>
-                <w:szCs w:val="21"/>
+                <w:sz w:val="19"/>
+                <w:szCs w:val="19"/>
               </w:rPr>
               <w:t xml:space="preserve"> asking someone    </w:t>
             </w:r>
@@ -31513,8 +31221,8 @@
             <w:r>
               <w:rPr>
                 <w:rFonts w:ascii="Arial" w:cs="Arial" w:eastAsia="Arial" w:hAnsi="Arial"/>
-                <w:sz w:val="21"/>
-                <w:szCs w:val="21"/>
+                <w:sz w:val="19"/>
+                <w:szCs w:val="19"/>
               </w:rPr>
               <w:t xml:space="preserve"> trying again    </w:t>
             </w:r>
@@ -31522,15 +31230,15 @@
           <w:p>
             <w:pPr>
               <w:keepLines/>
-              <w:spacing w:after="0" w:before="0" w:line="300" w:lineRule="auto"/>
+              <w:spacing w:after="0" w:before="0" w:line="260" w:lineRule="auto"/>
             </w:pPr>
             <w:r>
               <w:rPr>
                 <w:rFonts w:ascii="Arial" w:cs="Arial" w:eastAsia="Arial" w:hAnsi="Arial"/>
                 <w:b/>
                 <w:bCs/>
-                <w:sz w:val="22"/>
-                <w:szCs w:val="22"/>
+                <w:sz w:val="20"/>
+                <w:szCs w:val="20"/>
               </w:rPr>
               <w:t xml:space="preserve">Next time I will try ...  ______________________     It felt:  </w:t>
             </w:r>
@@ -31577,8 +31285,8 @@
             <w:r>
               <w:rPr>
                 <w:rFonts w:ascii="Arial" w:cs="Arial" w:eastAsia="Arial" w:hAnsi="Arial"/>
-                <w:sz w:val="21"/>
-                <w:szCs w:val="21"/>
+                <w:sz w:val="19"/>
+                <w:szCs w:val="19"/>
               </w:rPr>
               <w:t xml:space="preserve"> easy   </w:t>
             </w:r>
@@ -31625,8 +31333,8 @@
             <w:r>
               <w:rPr>
                 <w:rFonts w:ascii="Arial" w:cs="Arial" w:eastAsia="Arial" w:hAnsi="Arial"/>
-                <w:sz w:val="21"/>
-                <w:szCs w:val="21"/>
+                <w:sz w:val="19"/>
+                <w:szCs w:val="19"/>
               </w:rPr>
               <w:t xml:space="preserve"> OK   </w:t>
             </w:r>
@@ -31673,8 +31381,8 @@
             <w:r>
               <w:rPr>
                 <w:rFonts w:ascii="Arial" w:cs="Arial" w:eastAsia="Arial" w:hAnsi="Arial"/>
-                <w:sz w:val="21"/>
-                <w:szCs w:val="21"/>
+                <w:sz w:val="19"/>
+                <w:szCs w:val="19"/>
               </w:rPr>
               <w:t xml:space="preserve"> hard   </w:t>
             </w:r>
@@ -32491,20 +32199,6 @@
         <w:ind w:left="560"/>
       </w:pPr>
     </w:p>
-    <w:p>
-      <w:pPr>
-        <w:keepLines/>
-        <w:spacing w:after="120" w:before="0" w:line="320" w:lineRule="auto"/>
-      </w:pPr>
-      <w:r>
-        <w:rPr>
-          <w:rFonts w:ascii="Arial" w:cs="Arial" w:eastAsia="Arial" w:hAnsi="Arial"/>
-          <w:sz w:val="26"/>
-          <w:szCs w:val="26"/>
-        </w:rPr>
-        <w:t xml:space="preserve"/>
-      </w:r>
-    </w:p>
     <w:tbl>
       <w:tblPr>
         <w:tblW w:type="dxa" w:w="9900"/>
@@ -32566,7 +32260,7 @@
       <w:pPr>
         <w:keepNext/>
         <w:keepLines/>
-        <w:spacing w:after="40" w:before="100" w:line="320" w:lineRule="auto"/>
+        <w:spacing w:after="20" w:before="60" w:line="320" w:lineRule="auto"/>
         <w:ind w:left="560" w:hanging="560"/>
       </w:pPr>
       <w:r>
@@ -32595,24 +32289,6 @@
         </w:rPr>
         <w:t xml:space="preserve">Ben says: "If I measure the same thing with a SHORTER unit, I always get a BIGGER number." Measure your pencil with the cube strip, then with a paper clip (or your finger width). Which unit is shorter? Which one gave the bigger number? Is Ben right? Guess: if a unit is half as long as a cube, what number would you get for your pencil?</w:t>
       </w:r>
-    </w:p>
-    <w:p>
-      <w:pPr>
-        <w:pBdr>
-          <w:bottom w:val="single" w:color="777777" w:sz="6" w:space="1"/>
-        </w:pBdr>
-        <w:spacing w:after="80" w:before="280"/>
-        <w:ind w:left="560"/>
-      </w:pPr>
-    </w:p>
-    <w:p>
-      <w:pPr>
-        <w:pBdr>
-          <w:bottom w:val="single" w:color="777777" w:sz="6" w:space="1"/>
-        </w:pBdr>
-        <w:spacing w:after="80" w:before="280"/>
-        <w:ind w:left="560"/>
-      </w:pPr>
     </w:p>
     <w:p>
       <w:pPr>
@@ -32863,9 +32539,9 @@
             </w:tcBorders>
             <w:shd w:fill="E8F5F2" w:color="auto" w:val="clear"/>
             <w:tcMar>
-              <w:top w:type="dxa" w:w="60"/>
+              <w:top w:type="dxa" w:w="40"/>
               <w:left w:type="dxa" w:w="100"/>
-              <w:bottom w:type="dxa" w:w="60"/>
+              <w:bottom w:type="dxa" w:w="40"/>
               <w:right w:type="dxa" w:w="100"/>
             </w:tcMar>
             <w:vAlign w:val="center"/>
@@ -32873,7 +32549,7 @@
           <w:p>
             <w:pPr>
               <w:keepLines/>
-              <w:spacing w:after="0" w:before="0" w:line="260" w:lineRule="auto"/>
+              <w:spacing w:after="0" w:before="0" w:line="240" w:lineRule="auto"/>
             </w:pPr>
             <w:r>
               <w:rPr>
@@ -32881,16 +32557,16 @@
                 <w:b/>
                 <w:bCs/>
                 <w:color w:val="1F7A6F"/>
-                <w:sz w:val="21"/>
-                <w:szCs w:val="21"/>
+                <w:sz w:val="19"/>
+                <w:szCs w:val="19"/>
               </w:rPr>
               <w:t xml:space="preserve">Fast track. </w:t>
             </w:r>
             <w:r>
               <w:rPr>
                 <w:rFonts w:ascii="Arial" w:cs="Arial" w:eastAsia="Arial" w:hAnsi="Arial"/>
-                <w:sz w:val="21"/>
-                <w:szCs w:val="21"/>
+                <w:sz w:val="19"/>
+                <w:szCs w:val="19"/>
               </w:rPr>
               <w:t xml:space="preserve">Got both warm-up check questions right and can say why? Ask your tutor. You may go straight to the Think Harder and Challenge pages and the Open investigation while the group works on this page. Come back to the group for talk time.</w:t>
             </w:r>
@@ -32901,7 +32577,7 @@
     <w:p>
       <w:pPr>
         <w:keepLines/>
-        <w:spacing w:after="60" w:before="0" w:line="320" w:lineRule="auto"/>
+        <w:spacing w:after="40" w:before="0" w:line="320" w:lineRule="auto"/>
       </w:pPr>
       <w:r>
         <w:rPr>
@@ -34047,7 +33723,7 @@
     <w:p>
       <w:pPr>
         <w:keepLines/>
-        <w:spacing w:after="60" w:before="0" w:line="320" w:lineRule="auto"/>
+        <w:spacing w:after="30" w:before="0" w:line="320" w:lineRule="auto"/>
       </w:pPr>
       <w:r>
         <w:rPr>
@@ -34088,9 +33764,9 @@
             </w:tcBorders>
             <w:shd w:fill="FFFDF5" w:color="auto" w:val="clear"/>
             <w:tcMar>
-              <w:top w:type="dxa" w:w="80"/>
+              <w:top w:type="dxa" w:w="50"/>
               <w:left w:type="dxa" w:w="100"/>
-              <w:bottom w:type="dxa" w:w="80"/>
+              <w:bottom w:type="dxa" w:w="50"/>
               <w:right w:type="dxa" w:w="100"/>
             </w:tcMar>
             <w:vAlign w:val="center"/>
@@ -34098,7 +33774,7 @@
           <w:p>
             <w:pPr>
               <w:keepLines/>
-              <w:spacing w:after="60" w:before="0" w:line="320" w:lineRule="auto"/>
+              <w:spacing w:after="30" w:before="0" w:line="320" w:lineRule="auto"/>
             </w:pPr>
             <w:r>
               <w:rPr>
@@ -34114,8 +33790,8 @@
             <w:r>
               <w:rPr>
                 <w:rFonts w:ascii="Arial" w:cs="Arial" w:eastAsia="Arial" w:hAnsi="Arial"/>
-                <w:sz w:val="21"/>
-                <w:szCs w:val="21"/>
+                <w:sz w:val="19"/>
+                <w:szCs w:val="19"/>
               </w:rPr>
               <w:t xml:space="preserve">A one-minute look-back. There are no right answers. Tick or write.</w:t>
             </w:r>
@@ -34123,15 +33799,15 @@
           <w:p>
             <w:pPr>
               <w:keepLines/>
-              <w:spacing w:after="40" w:before="0" w:line="300" w:lineRule="auto"/>
+              <w:spacing w:after="20" w:before="0" w:line="260" w:lineRule="auto"/>
             </w:pPr>
             <w:r>
               <w:rPr>
                 <w:rFonts w:ascii="Arial" w:cs="Arial" w:eastAsia="Arial" w:hAnsi="Arial"/>
                 <w:b/>
                 <w:bCs/>
-                <w:sz w:val="22"/>
-                <w:szCs w:val="22"/>
+                <w:sz w:val="20"/>
+                <w:szCs w:val="20"/>
               </w:rPr>
               <w:t xml:space="preserve">The hardest part was ...   </w:t>
             </w:r>
@@ -34178,8 +33854,8 @@
             <w:r>
               <w:rPr>
                 <w:rFonts w:ascii="Arial" w:cs="Arial" w:eastAsia="Arial" w:hAnsi="Arial"/>
-                <w:sz w:val="21"/>
-                <w:szCs w:val="21"/>
+                <w:sz w:val="19"/>
+                <w:szCs w:val="19"/>
               </w:rPr>
               <w:t xml:space="preserve"> the patterns    </w:t>
             </w:r>
@@ -34226,8 +33902,8 @@
             <w:r>
               <w:rPr>
                 <w:rFonts w:ascii="Arial" w:cs="Arial" w:eastAsia="Arial" w:hAnsi="Arial"/>
-                <w:sz w:val="21"/>
-                <w:szCs w:val="21"/>
+                <w:sz w:val="19"/>
+                <w:szCs w:val="19"/>
               </w:rPr>
               <w:t xml:space="preserve"> the puzzles    </w:t>
             </w:r>
@@ -34274,8 +33950,8 @@
             <w:r>
               <w:rPr>
                 <w:rFonts w:ascii="Arial" w:cs="Arial" w:eastAsia="Arial" w:hAnsi="Arial"/>
-                <w:sz w:val="21"/>
-                <w:szCs w:val="21"/>
+                <w:sz w:val="19"/>
+                <w:szCs w:val="19"/>
               </w:rPr>
               <w:t xml:space="preserve"> the explaining    </w:t>
             </w:r>
@@ -34322,8 +33998,8 @@
             <w:r>
               <w:rPr>
                 <w:rFonts w:ascii="Arial" w:cs="Arial" w:eastAsia="Arial" w:hAnsi="Arial"/>
-                <w:sz w:val="21"/>
-                <w:szCs w:val="21"/>
+                <w:sz w:val="19"/>
+                <w:szCs w:val="19"/>
               </w:rPr>
               <w:t xml:space="preserve"> something else: ____________    </w:t>
             </w:r>
@@ -34331,15 +34007,15 @@
           <w:p>
             <w:pPr>
               <w:keepLines/>
-              <w:spacing w:after="40" w:before="0" w:line="300" w:lineRule="auto"/>
+              <w:spacing w:after="20" w:before="0" w:line="260" w:lineRule="auto"/>
             </w:pPr>
             <w:r>
               <w:rPr>
                 <w:rFonts w:ascii="Arial" w:cs="Arial" w:eastAsia="Arial" w:hAnsi="Arial"/>
                 <w:b/>
                 <w:bCs/>
-                <w:sz w:val="22"/>
-                <w:szCs w:val="22"/>
+                <w:sz w:val="20"/>
+                <w:szCs w:val="20"/>
               </w:rPr>
               <w:t xml:space="preserve">I got unstuck by ...   </w:t>
             </w:r>
@@ -34386,8 +34062,8 @@
             <w:r>
               <w:rPr>
                 <w:rFonts w:ascii="Arial" w:cs="Arial" w:eastAsia="Arial" w:hAnsi="Arial"/>
-                <w:sz w:val="21"/>
-                <w:szCs w:val="21"/>
+                <w:sz w:val="19"/>
+                <w:szCs w:val="19"/>
               </w:rPr>
               <w:t xml:space="preserve"> counters or objects    </w:t>
             </w:r>
@@ -34434,8 +34110,8 @@
             <w:r>
               <w:rPr>
                 <w:rFonts w:ascii="Arial" w:cs="Arial" w:eastAsia="Arial" w:hAnsi="Arial"/>
-                <w:sz w:val="21"/>
-                <w:szCs w:val="21"/>
+                <w:sz w:val="19"/>
+                <w:szCs w:val="19"/>
               </w:rPr>
               <w:t xml:space="preserve"> drawing it    </w:t>
             </w:r>
@@ -34482,8 +34158,8 @@
             <w:r>
               <w:rPr>
                 <w:rFonts w:ascii="Arial" w:cs="Arial" w:eastAsia="Arial" w:hAnsi="Arial"/>
-                <w:sz w:val="21"/>
-                <w:szCs w:val="21"/>
+                <w:sz w:val="19"/>
+                <w:szCs w:val="19"/>
               </w:rPr>
               <w:t xml:space="preserve"> asking someone    </w:t>
             </w:r>
@@ -34530,8 +34206,8 @@
             <w:r>
               <w:rPr>
                 <w:rFonts w:ascii="Arial" w:cs="Arial" w:eastAsia="Arial" w:hAnsi="Arial"/>
-                <w:sz w:val="21"/>
-                <w:szCs w:val="21"/>
+                <w:sz w:val="19"/>
+                <w:szCs w:val="19"/>
               </w:rPr>
               <w:t xml:space="preserve"> trying again    </w:t>
             </w:r>
@@ -34539,15 +34215,15 @@
           <w:p>
             <w:pPr>
               <w:keepLines/>
-              <w:spacing w:after="0" w:before="0" w:line="300" w:lineRule="auto"/>
+              <w:spacing w:after="0" w:before="0" w:line="260" w:lineRule="auto"/>
             </w:pPr>
             <w:r>
               <w:rPr>
                 <w:rFonts w:ascii="Arial" w:cs="Arial" w:eastAsia="Arial" w:hAnsi="Arial"/>
                 <w:b/>
                 <w:bCs/>
-                <w:sz w:val="22"/>
-                <w:szCs w:val="22"/>
+                <w:sz w:val="20"/>
+                <w:szCs w:val="20"/>
               </w:rPr>
               <w:t xml:space="preserve">Next time I will try ...  ______________________     It felt:  </w:t>
             </w:r>
@@ -34594,8 +34270,8 @@
             <w:r>
               <w:rPr>
                 <w:rFonts w:ascii="Arial" w:cs="Arial" w:eastAsia="Arial" w:hAnsi="Arial"/>
-                <w:sz w:val="21"/>
-                <w:szCs w:val="21"/>
+                <w:sz w:val="19"/>
+                <w:szCs w:val="19"/>
               </w:rPr>
               <w:t xml:space="preserve"> easy   </w:t>
             </w:r>
@@ -34642,8 +34318,8 @@
             <w:r>
               <w:rPr>
                 <w:rFonts w:ascii="Arial" w:cs="Arial" w:eastAsia="Arial" w:hAnsi="Arial"/>
-                <w:sz w:val="21"/>
-                <w:szCs w:val="21"/>
+                <w:sz w:val="19"/>
+                <w:szCs w:val="19"/>
               </w:rPr>
               <w:t xml:space="preserve"> OK   </w:t>
             </w:r>
@@ -34690,8 +34366,8 @@
             <w:r>
               <w:rPr>
                 <w:rFonts w:ascii="Arial" w:cs="Arial" w:eastAsia="Arial" w:hAnsi="Arial"/>
-                <w:sz w:val="21"/>
-                <w:szCs w:val="21"/>
+                <w:sz w:val="19"/>
+                <w:szCs w:val="19"/>
               </w:rPr>
               <w:t xml:space="preserve"> hard   </w:t>
             </w:r>
@@ -35508,20 +35184,6 @@
         <w:ind w:left="560"/>
       </w:pPr>
     </w:p>
-    <w:p>
-      <w:pPr>
-        <w:keepLines/>
-        <w:spacing w:after="120" w:before="0" w:line="320" w:lineRule="auto"/>
-      </w:pPr>
-      <w:r>
-        <w:rPr>
-          <w:rFonts w:ascii="Arial" w:cs="Arial" w:eastAsia="Arial" w:hAnsi="Arial"/>
-          <w:sz w:val="26"/>
-          <w:szCs w:val="26"/>
-        </w:rPr>
-        <w:t xml:space="preserve"/>
-      </w:r>
-    </w:p>
     <w:tbl>
       <w:tblPr>
         <w:tblW w:type="dxa" w:w="9900"/>
@@ -35583,7 +35245,7 @@
       <w:pPr>
         <w:keepNext/>
         <w:keepLines/>
-        <w:spacing w:after="40" w:before="100" w:line="320" w:lineRule="auto"/>
+        <w:spacing w:after="20" w:before="60" w:line="320" w:lineRule="auto"/>
         <w:ind w:left="560" w:hanging="560"/>
       </w:pPr>
       <w:r>
@@ -35612,24 +35274,6 @@
         </w:rPr>
         <w:t xml:space="preserve">Three numbers in a row start at 5 and jump by 3: 5, 8, 11. Their total is 24. Change the jump to 1, 2, 4 and 5 and find each total. What stays the same? What changes? Can you find a shortcut for the total?</w:t>
       </w:r>
-    </w:p>
-    <w:p>
-      <w:pPr>
-        <w:pBdr>
-          <w:bottom w:val="single" w:color="777777" w:sz="6" w:space="1"/>
-        </w:pBdr>
-        <w:spacing w:after="80" w:before="280"/>
-        <w:ind w:left="560"/>
-      </w:pPr>
-    </w:p>
-    <w:p>
-      <w:pPr>
-        <w:pBdr>
-          <w:bottom w:val="single" w:color="777777" w:sz="6" w:space="1"/>
-        </w:pBdr>
-        <w:spacing w:after="80" w:before="280"/>
-        <w:ind w:left="560"/>
-      </w:pPr>
     </w:p>
     <w:p>
       <w:pPr>

</xml_diff>

<commit_message>
P6: safeguarding revert, whole-group invitations, no private messages to children
Co-Authored-By: Claude Sonnet 5.5 <noreply@anthropic.com>
Claude-Session: https://claude.ai/code/session_01NYgB3ju57UwWRpkPPM6X7F
</commit_message>
<xml_diff>
--- a/hp/P1_Holiday_Program_Student_Workbook.docx
+++ b/hp/P1_Holiday_Program_Student_Workbook.docx
@@ -3716,7 +3716,7 @@
                 <w:sz w:val="19"/>
                 <w:szCs w:val="19"/>
               </w:rPr>
-              <w:t xml:space="preserve">Two minutes. There are no right answers. You can pass. Only your tutor may read this, privately.</w:t>
+              <w:t xml:space="preserve">Two minutes. There are no right answers. You can pass. Nobody reads it out.</w:t>
             </w:r>
           </w:p>
           <w:p>
@@ -4250,7 +4250,7 @@
                 <w:sz w:val="19"/>
                 <w:szCs w:val="19"/>
               </w:rPr>
-              <w:t xml:space="preserve"> I am still stuck (my tutor will check in privately)    </w:t>
+              <w:t xml:space="preserve"> I am still stuck (my tutor will come and help)    </w:t>
             </w:r>
             <w:r>
               <w:drawing>
@@ -6528,7 +6528,7 @@
                 <w:sz w:val="19"/>
                 <w:szCs w:val="19"/>
               </w:rPr>
-              <w:t xml:space="preserve">Two minutes. There are no right answers. You can pass. Only your tutor may read this, privately.</w:t>
+              <w:t xml:space="preserve">Two minutes. There are no right answers. You can pass. Nobody reads it out.</w:t>
             </w:r>
           </w:p>
           <w:p>
@@ -7062,7 +7062,7 @@
                 <w:sz w:val="19"/>
                 <w:szCs w:val="19"/>
               </w:rPr>
-              <w:t xml:space="preserve"> I am still stuck (my tutor will check in privately)    </w:t>
+              <w:t xml:space="preserve"> I am still stuck (my tutor will come and help)    </w:t>
             </w:r>
             <w:r>
               <w:drawing>
@@ -10538,7 +10538,7 @@
                 <w:sz w:val="19"/>
                 <w:szCs w:val="19"/>
               </w:rPr>
-              <w:t xml:space="preserve">Two minutes. There are no right answers. You can pass. Only your tutor may read this, privately.</w:t>
+              <w:t xml:space="preserve">Two minutes. There are no right answers. You can pass. Nobody reads it out.</w:t>
             </w:r>
           </w:p>
           <w:p>
@@ -11072,7 +11072,7 @@
                 <w:sz w:val="19"/>
                 <w:szCs w:val="19"/>
               </w:rPr>
-              <w:t xml:space="preserve"> I am still stuck (my tutor will check in privately)    </w:t>
+              <w:t xml:space="preserve"> I am still stuck (my tutor will come and help)    </w:t>
             </w:r>
             <w:r>
               <w:drawing>
@@ -13901,7 +13901,7 @@
                 <w:sz w:val="19"/>
                 <w:szCs w:val="19"/>
               </w:rPr>
-              <w:t xml:space="preserve">Two minutes. There are no right answers. You can pass. Only your tutor may read this, privately.</w:t>
+              <w:t xml:space="preserve">Two minutes. There are no right answers. You can pass. Nobody reads it out.</w:t>
             </w:r>
           </w:p>
           <w:p>
@@ -14435,7 +14435,7 @@
                 <w:sz w:val="19"/>
                 <w:szCs w:val="19"/>
               </w:rPr>
-              <w:t xml:space="preserve"> I am still stuck (my tutor will check in privately)    </w:t>
+              <w:t xml:space="preserve"> I am still stuck (my tutor will come and help)    </w:t>
             </w:r>
             <w:r>
               <w:drawing>
@@ -19469,7 +19469,7 @@
                 <w:sz w:val="19"/>
                 <w:szCs w:val="19"/>
               </w:rPr>
-              <w:t xml:space="preserve">Two minutes. There are no right answers. You can pass. Only your tutor may read this, privately.</w:t>
+              <w:t xml:space="preserve">Two minutes. There are no right answers. You can pass. Nobody reads it out.</w:t>
             </w:r>
           </w:p>
           <w:p>
@@ -20003,7 +20003,7 @@
                 <w:sz w:val="19"/>
                 <w:szCs w:val="19"/>
               </w:rPr>
-              <w:t xml:space="preserve"> I am still stuck (my tutor will check in privately)    </w:t>
+              <w:t xml:space="preserve"> I am still stuck (my tutor will come and help)    </w:t>
             </w:r>
             <w:r>
               <w:drawing>
@@ -22788,7 +22788,7 @@
                 <w:sz w:val="19"/>
                 <w:szCs w:val="19"/>
               </w:rPr>
-              <w:t xml:space="preserve">Two minutes. There are no right answers. You can pass. Only your tutor may read this, privately.</w:t>
+              <w:t xml:space="preserve">Two minutes. There are no right answers. You can pass. Nobody reads it out.</w:t>
             </w:r>
           </w:p>
           <w:p>
@@ -23322,7 +23322,7 @@
                 <w:sz w:val="19"/>
                 <w:szCs w:val="19"/>
               </w:rPr>
-              <w:t xml:space="preserve"> I am still stuck (my tutor will check in privately)    </w:t>
+              <w:t xml:space="preserve"> I am still stuck (my tutor will come and help)    </w:t>
             </w:r>
             <w:r>
               <w:drawing>
@@ -26566,7 +26566,7 @@
                 <w:sz w:val="19"/>
                 <w:szCs w:val="19"/>
               </w:rPr>
-              <w:t xml:space="preserve">Two minutes. There are no right answers. You can pass. Only your tutor may read this, privately.</w:t>
+              <w:t xml:space="preserve">Two minutes. There are no right answers. You can pass. Nobody reads it out.</w:t>
             </w:r>
           </w:p>
           <w:p>
@@ -27100,7 +27100,7 @@
                 <w:sz w:val="19"/>
                 <w:szCs w:val="19"/>
               </w:rPr>
-              <w:t xml:space="preserve"> I am still stuck (my tutor will check in privately)    </w:t>
+              <w:t xml:space="preserve"> I am still stuck (my tutor will come and help)    </w:t>
             </w:r>
             <w:r>
               <w:drawing>
@@ -30135,7 +30135,7 @@
                 <w:sz w:val="19"/>
                 <w:szCs w:val="19"/>
               </w:rPr>
-              <w:t xml:space="preserve">Two minutes. There are no right answers. You can pass. Only your tutor may read this, privately.</w:t>
+              <w:t xml:space="preserve">Two minutes. There are no right answers. You can pass. Nobody reads it out.</w:t>
             </w:r>
           </w:p>
           <w:p>
@@ -30669,7 +30669,7 @@
                 <w:sz w:val="19"/>
                 <w:szCs w:val="19"/>
               </w:rPr>
-              <w:t xml:space="preserve"> I am still stuck (my tutor will check in privately)    </w:t>
+              <w:t xml:space="preserve"> I am still stuck (my tutor will come and help)    </w:t>
             </w:r>
             <w:r>
               <w:drawing>
@@ -33568,7 +33568,7 @@
                 <w:sz w:val="19"/>
                 <w:szCs w:val="19"/>
               </w:rPr>
-              <w:t xml:space="preserve">Two minutes. There are no right answers. You can pass. Only your tutor may read this, privately.</w:t>
+              <w:t xml:space="preserve">Two minutes. There are no right answers. You can pass. Nobody reads it out.</w:t>
             </w:r>
           </w:p>
           <w:p>
@@ -34102,7 +34102,7 @@
                 <w:sz w:val="19"/>
                 <w:szCs w:val="19"/>
               </w:rPr>
-              <w:t xml:space="preserve"> I am still stuck (my tutor will check in privately)    </w:t>
+              <w:t xml:space="preserve"> I am still stuck (my tutor will come and help)    </w:t>
             </w:r>
             <w:r>
               <w:drawing>
@@ -36678,7 +36678,7 @@
                 <w:sz w:val="19"/>
                 <w:szCs w:val="19"/>
               </w:rPr>
-              <w:t xml:space="preserve">Two minutes. There are no right answers. You can pass. Only your tutor may read this, privately.</w:t>
+              <w:t xml:space="preserve">Two minutes. There are no right answers. You can pass. Nobody reads it out.</w:t>
             </w:r>
           </w:p>
           <w:p>
@@ -37212,7 +37212,7 @@
                 <w:sz w:val="19"/>
                 <w:szCs w:val="19"/>
               </w:rPr>
-              <w:t xml:space="preserve"> I am still stuck (my tutor will check in privately)    </w:t>
+              <w:t xml:space="preserve"> I am still stuck (my tutor will come and help)    </w:t>
             </w:r>
             <w:r>
               <w:drawing>

</xml_diff>

<commit_message>
WIP: story integration (Level 2 done, others in progress)
Co-Authored-By: Claude Sonnet 5.5 <noreply@anthropic.com>
Claude-Session: https://claude.ai/code/session_01NYgB3ju57UwWRpkPPM6X7F
</commit_message>
<xml_diff>
--- a/hp/P1_Holiday_Program_Student_Workbook.docx
+++ b/hp/P1_Holiday_Program_Student_Workbook.docx
@@ -4307,6 +4307,147 @@
     <w:p>
       <w:pPr>
         <w:keepLines/>
+        <w:spacing w:after="60" w:before="0" w:line="320" w:lineRule="auto"/>
+      </w:pPr>
+      <w:r>
+        <w:rPr>
+          <w:rFonts w:ascii="Arial" w:cs="Arial" w:eastAsia="Arial" w:hAnsi="Arial"/>
+          <w:sz w:val="26"/>
+          <w:szCs w:val="26"/>
+        </w:rPr>
+        <w:t xml:space="preserve"/>
+      </w:r>
+    </w:p>
+    <w:tbl>
+      <w:tblPr>
+        <w:tblW w:type="dxa" w:w="9900"/>
+        <w:tblBorders>
+          <w:top w:val="single" w:color="auto" w:sz="4"/>
+          <w:left w:val="single" w:color="auto" w:sz="4"/>
+          <w:bottom w:val="single" w:color="auto" w:sz="4"/>
+          <w:right w:val="single" w:color="auto" w:sz="4"/>
+          <w:insideH w:val="single" w:color="auto" w:sz="4"/>
+          <w:insideV w:val="single" w:color="auto" w:sz="4"/>
+        </w:tblBorders>
+      </w:tblPr>
+      <w:tblGrid>
+        <w:gridCol w:w="9900"/>
+      </w:tblGrid>
+      <w:tr>
+        <w:trPr>
+          <w:cantSplit/>
+        </w:trPr>
+        <w:tc>
+          <w:tcPr>
+            <w:tcW w:type="dxa" w:w="9900"/>
+            <w:tcBorders>
+              <w:top w:val="single" w:color="000000" w:sz="8"/>
+              <w:left w:val="single" w:color="000000" w:sz="8"/>
+              <w:bottom w:val="single" w:color="000000" w:sz="8"/>
+              <w:right w:val="single" w:color="000000" w:sz="8"/>
+            </w:tcBorders>
+            <w:shd w:fill="FFF6D6" w:color="auto" w:val="clear"/>
+            <w:tcMar>
+              <w:top w:type="dxa" w:w="50"/>
+              <w:left w:type="dxa" w:w="100"/>
+              <w:bottom w:type="dxa" w:w="50"/>
+              <w:right w:type="dxa" w:w="100"/>
+            </w:tcMar>
+            <w:vAlign w:val="center"/>
+          </w:tcPr>
+          <w:p>
+            <w:pPr>
+              <w:keepLines/>
+              <w:spacing w:after="30" w:before="0" w:line="320" w:lineRule="auto"/>
+            </w:pPr>
+            <w:r>
+              <w:rPr>
+                <w:rFonts w:ascii="Arial" w:cs="Arial" w:eastAsia="Arial" w:hAnsi="Arial"/>
+                <w:b/>
+                <w:bCs/>
+                <w:color w:val="1F7A6F"/>
+                <w:sz w:val="22"/>
+                <w:szCs w:val="22"/>
+              </w:rPr>
+              <w:t xml:space="preserve">Story corner: Julia Robinson  </w:t>
+            </w:r>
+            <w:r>
+              <w:rPr>
+                <w:rFonts w:ascii="Arial" w:cs="Arial" w:eastAsia="Arial" w:hAnsi="Arial"/>
+                <w:sz w:val="18"/>
+                <w:szCs w:val="18"/>
+              </w:rPr>
+              <w:t xml:space="preserve">Just for fun. You can pass.</w:t>
+            </w:r>
+          </w:p>
+          <w:p>
+            <w:pPr>
+              <w:keepLines/>
+              <w:spacing w:after="30" w:before="0" w:line="260" w:lineRule="auto"/>
+            </w:pPr>
+            <w:r>
+              <w:rPr>
+                <w:rFonts w:ascii="Arial" w:cs="Arial" w:eastAsia="Arial" w:hAnsi="Arial"/>
+                <w:sz w:val="20"/>
+                <w:szCs w:val="20"/>
+              </w:rPr>
+              <w:t xml:space="preserve">Julia Robinson (USA, 1919-1985) loved the counting numbers, and as a small child she liked arranging pebbles. She grew up to be a mathematician who worked on hard number puzzles.</w:t>
+            </w:r>
+          </w:p>
+          <w:p>
+            <w:pPr>
+              <w:keepLines/>
+              <w:spacing w:after="30" w:before="0" w:line="260" w:lineRule="auto"/>
+            </w:pPr>
+            <w:r>
+              <w:rPr>
+                <w:rFonts w:ascii="Arial" w:cs="Arial" w:eastAsia="Arial" w:hAnsi="Arial"/>
+                <w:b/>
+                <w:bCs/>
+                <w:sz w:val="20"/>
+                <w:szCs w:val="20"/>
+              </w:rPr>
+              <w:t xml:space="preserve">Try it: </w:t>
+            </w:r>
+            <w:r>
+              <w:rPr>
+                <w:rFonts w:ascii="Arial" w:cs="Arial" w:eastAsia="Arial" w:hAnsi="Arial"/>
+                <w:sz w:val="20"/>
+                <w:szCs w:val="20"/>
+              </w:rPr>
+              <w:t xml:space="preserve">Julia puts pebbles in rows. Row 1 has 3 pebbles, row 2 has 6, row 3 has 9. How many pebbles are in row 5? What is the rule?</w:t>
+            </w:r>
+          </w:p>
+          <w:p>
+            <w:pPr>
+              <w:keepLines/>
+              <w:spacing w:after="0" w:before="0" w:line="320" w:lineRule="auto"/>
+            </w:pPr>
+            <w:r>
+              <w:rPr>
+                <w:rFonts w:ascii="Arial" w:cs="Arial" w:eastAsia="Arial" w:hAnsi="Arial"/>
+                <w:b/>
+                <w:bCs/>
+                <w:sz w:val="20"/>
+                <w:szCs w:val="20"/>
+              </w:rPr>
+              <w:t xml:space="preserve">My answer: </w:t>
+            </w:r>
+            <w:r>
+              <w:rPr>
+                <w:rFonts w:ascii="Arial" w:cs="Arial" w:eastAsia="Arial" w:hAnsi="Arial"/>
+                <w:sz w:val="20"/>
+                <w:szCs w:val="20"/>
+              </w:rPr>
+              <w:t xml:space="preserve">______________________________</w:t>
+            </w:r>
+          </w:p>
+        </w:tc>
+      </w:tr>
+    </w:tbl>
+    <w:p>
+      <w:pPr>
+        <w:keepLines/>
         <w:pageBreakBefore/>
         <w:spacing w:after="60" w:before="0" w:line="320" w:lineRule="auto"/>
         <w:jc w:val="right"/>
@@ -7119,6 +7260,147 @@
     <w:p>
       <w:pPr>
         <w:keepLines/>
+        <w:spacing w:after="60" w:before="0" w:line="320" w:lineRule="auto"/>
+      </w:pPr>
+      <w:r>
+        <w:rPr>
+          <w:rFonts w:ascii="Arial" w:cs="Arial" w:eastAsia="Arial" w:hAnsi="Arial"/>
+          <w:sz w:val="26"/>
+          <w:szCs w:val="26"/>
+        </w:rPr>
+        <w:t xml:space="preserve"/>
+      </w:r>
+    </w:p>
+    <w:tbl>
+      <w:tblPr>
+        <w:tblW w:type="dxa" w:w="9900"/>
+        <w:tblBorders>
+          <w:top w:val="single" w:color="auto" w:sz="4"/>
+          <w:left w:val="single" w:color="auto" w:sz="4"/>
+          <w:bottom w:val="single" w:color="auto" w:sz="4"/>
+          <w:right w:val="single" w:color="auto" w:sz="4"/>
+          <w:insideH w:val="single" w:color="auto" w:sz="4"/>
+          <w:insideV w:val="single" w:color="auto" w:sz="4"/>
+        </w:tblBorders>
+      </w:tblPr>
+      <w:tblGrid>
+        <w:gridCol w:w="9900"/>
+      </w:tblGrid>
+      <w:tr>
+        <w:trPr>
+          <w:cantSplit/>
+        </w:trPr>
+        <w:tc>
+          <w:tcPr>
+            <w:tcW w:type="dxa" w:w="9900"/>
+            <w:tcBorders>
+              <w:top w:val="single" w:color="000000" w:sz="8"/>
+              <w:left w:val="single" w:color="000000" w:sz="8"/>
+              <w:bottom w:val="single" w:color="000000" w:sz="8"/>
+              <w:right w:val="single" w:color="000000" w:sz="8"/>
+            </w:tcBorders>
+            <w:shd w:fill="FFF6D6" w:color="auto" w:val="clear"/>
+            <w:tcMar>
+              <w:top w:type="dxa" w:w="50"/>
+              <w:left w:type="dxa" w:w="100"/>
+              <w:bottom w:type="dxa" w:w="50"/>
+              <w:right w:type="dxa" w:w="100"/>
+            </w:tcMar>
+            <w:vAlign w:val="center"/>
+          </w:tcPr>
+          <w:p>
+            <w:pPr>
+              <w:keepLines/>
+              <w:spacing w:after="30" w:before="0" w:line="320" w:lineRule="auto"/>
+            </w:pPr>
+            <w:r>
+              <w:rPr>
+                <w:rFonts w:ascii="Arial" w:cs="Arial" w:eastAsia="Arial" w:hAnsi="Arial"/>
+                <w:b/>
+                <w:bCs/>
+                <w:color w:val="1F7A6F"/>
+                <w:sz w:val="22"/>
+                <w:szCs w:val="22"/>
+              </w:rPr>
+              <w:t xml:space="preserve">Story corner: Robert Recorde  </w:t>
+            </w:r>
+            <w:r>
+              <w:rPr>
+                <w:rFonts w:ascii="Arial" w:cs="Arial" w:eastAsia="Arial" w:hAnsi="Arial"/>
+                <w:sz w:val="18"/>
+                <w:szCs w:val="18"/>
+              </w:rPr>
+              <w:t xml:space="preserve">Just for fun. You can pass.</w:t>
+            </w:r>
+          </w:p>
+          <w:p>
+            <w:pPr>
+              <w:keepLines/>
+              <w:spacing w:after="30" w:before="0" w:line="260" w:lineRule="auto"/>
+            </w:pPr>
+            <w:r>
+              <w:rPr>
+                <w:rFonts w:ascii="Arial" w:cs="Arial" w:eastAsia="Arial" w:hAnsi="Arial"/>
+                <w:sz w:val="20"/>
+                <w:szCs w:val="20"/>
+              </w:rPr>
+              <w:t xml:space="preserve">Robert Recorde (Wales, about 1510-1558) was a doctor who wrote maths books. In 1557 he used the sign = for the first time in a book, because no two things can be more equal than two straight lines of the same length.</w:t>
+            </w:r>
+          </w:p>
+          <w:p>
+            <w:pPr>
+              <w:keepLines/>
+              <w:spacing w:after="30" w:before="0" w:line="260" w:lineRule="auto"/>
+            </w:pPr>
+            <w:r>
+              <w:rPr>
+                <w:rFonts w:ascii="Arial" w:cs="Arial" w:eastAsia="Arial" w:hAnsi="Arial"/>
+                <w:b/>
+                <w:bCs/>
+                <w:sz w:val="20"/>
+                <w:szCs w:val="20"/>
+              </w:rPr>
+              <w:t xml:space="preserve">Try it: </w:t>
+            </w:r>
+            <w:r>
+              <w:rPr>
+                <w:rFonts w:ascii="Arial" w:cs="Arial" w:eastAsia="Arial" w:hAnsi="Arial"/>
+                <w:sz w:val="20"/>
+                <w:szCs w:val="20"/>
+              </w:rPr>
+              <w:t xml:space="preserve">Use Recorde's sign. Fill in the missing number so that both sides are equal: 4 + 4 = 5 + __</w:t>
+            </w:r>
+          </w:p>
+          <w:p>
+            <w:pPr>
+              <w:keepLines/>
+              <w:spacing w:after="0" w:before="0" w:line="320" w:lineRule="auto"/>
+            </w:pPr>
+            <w:r>
+              <w:rPr>
+                <w:rFonts w:ascii="Arial" w:cs="Arial" w:eastAsia="Arial" w:hAnsi="Arial"/>
+                <w:b/>
+                <w:bCs/>
+                <w:sz w:val="20"/>
+                <w:szCs w:val="20"/>
+              </w:rPr>
+              <w:t xml:space="preserve">My answer: </w:t>
+            </w:r>
+            <w:r>
+              <w:rPr>
+                <w:rFonts w:ascii="Arial" w:cs="Arial" w:eastAsia="Arial" w:hAnsi="Arial"/>
+                <w:sz w:val="20"/>
+                <w:szCs w:val="20"/>
+              </w:rPr>
+              <w:t xml:space="preserve">______________________________</w:t>
+            </w:r>
+          </w:p>
+        </w:tc>
+      </w:tr>
+    </w:tbl>
+    <w:p>
+      <w:pPr>
+        <w:keepLines/>
         <w:pageBreakBefore/>
         <w:spacing w:after="60" w:before="0" w:line="320" w:lineRule="auto"/>
         <w:jc w:val="right"/>
@@ -11121,6 +11403,147 @@
                 <w:szCs w:val="19"/>
               </w:rPr>
               <w:t xml:space="preserve"> I would like to pass    </w:t>
+            </w:r>
+          </w:p>
+        </w:tc>
+      </w:tr>
+    </w:tbl>
+    <w:p>
+      <w:pPr>
+        <w:keepLines/>
+        <w:spacing w:after="60" w:before="0" w:line="320" w:lineRule="auto"/>
+      </w:pPr>
+      <w:r>
+        <w:rPr>
+          <w:rFonts w:ascii="Arial" w:cs="Arial" w:eastAsia="Arial" w:hAnsi="Arial"/>
+          <w:sz w:val="26"/>
+          <w:szCs w:val="26"/>
+        </w:rPr>
+        <w:t xml:space="preserve"/>
+      </w:r>
+    </w:p>
+    <w:tbl>
+      <w:tblPr>
+        <w:tblW w:type="dxa" w:w="9900"/>
+        <w:tblBorders>
+          <w:top w:val="single" w:color="auto" w:sz="4"/>
+          <w:left w:val="single" w:color="auto" w:sz="4"/>
+          <w:bottom w:val="single" w:color="auto" w:sz="4"/>
+          <w:right w:val="single" w:color="auto" w:sz="4"/>
+          <w:insideH w:val="single" w:color="auto" w:sz="4"/>
+          <w:insideV w:val="single" w:color="auto" w:sz="4"/>
+        </w:tblBorders>
+      </w:tblPr>
+      <w:tblGrid>
+        <w:gridCol w:w="9900"/>
+      </w:tblGrid>
+      <w:tr>
+        <w:trPr>
+          <w:cantSplit/>
+        </w:trPr>
+        <w:tc>
+          <w:tcPr>
+            <w:tcW w:type="dxa" w:w="9900"/>
+            <w:tcBorders>
+              <w:top w:val="single" w:color="000000" w:sz="8"/>
+              <w:left w:val="single" w:color="000000" w:sz="8"/>
+              <w:bottom w:val="single" w:color="000000" w:sz="8"/>
+              <w:right w:val="single" w:color="000000" w:sz="8"/>
+            </w:tcBorders>
+            <w:shd w:fill="FFF6D6" w:color="auto" w:val="clear"/>
+            <w:tcMar>
+              <w:top w:type="dxa" w:w="50"/>
+              <w:left w:type="dxa" w:w="100"/>
+              <w:bottom w:type="dxa" w:w="50"/>
+              <w:right w:type="dxa" w:w="100"/>
+            </w:tcMar>
+            <w:vAlign w:val="center"/>
+          </w:tcPr>
+          <w:p>
+            <w:pPr>
+              <w:keepLines/>
+              <w:spacing w:after="30" w:before="0" w:line="320" w:lineRule="auto"/>
+            </w:pPr>
+            <w:r>
+              <w:rPr>
+                <w:rFonts w:ascii="Arial" w:cs="Arial" w:eastAsia="Arial" w:hAnsi="Arial"/>
+                <w:b/>
+                <w:bCs/>
+                <w:color w:val="1F7A6F"/>
+                <w:sz w:val="22"/>
+                <w:szCs w:val="22"/>
+              </w:rPr>
+              <w:t xml:space="preserve">Story corner: Marie Neurath  </w:t>
+            </w:r>
+            <w:r>
+              <w:rPr>
+                <w:rFonts w:ascii="Arial" w:cs="Arial" w:eastAsia="Arial" w:hAnsi="Arial"/>
+                <w:sz w:val="18"/>
+                <w:szCs w:val="18"/>
+              </w:rPr>
+              <w:t xml:space="preserve">Just for fun. You can pass.</w:t>
+            </w:r>
+          </w:p>
+          <w:p>
+            <w:pPr>
+              <w:keepLines/>
+              <w:spacing w:after="30" w:before="0" w:line="260" w:lineRule="auto"/>
+            </w:pPr>
+            <w:r>
+              <w:rPr>
+                <w:rFonts w:ascii="Arial" w:cs="Arial" w:eastAsia="Arial" w:hAnsi="Arial"/>
+                <w:sz w:val="20"/>
+                <w:szCs w:val="20"/>
+              </w:rPr>
+              <w:t xml:space="preserve">Marie Neurath (Germany, 1898-1986) helped make Isotype, a way of showing numbers with little pictures. More of something means more pictures, all the same size.</w:t>
+            </w:r>
+          </w:p>
+          <w:p>
+            <w:pPr>
+              <w:keepLines/>
+              <w:spacing w:after="30" w:before="0" w:line="260" w:lineRule="auto"/>
+            </w:pPr>
+            <w:r>
+              <w:rPr>
+                <w:rFonts w:ascii="Arial" w:cs="Arial" w:eastAsia="Arial" w:hAnsi="Arial"/>
+                <w:b/>
+                <w:bCs/>
+                <w:sz w:val="20"/>
+                <w:szCs w:val="20"/>
+              </w:rPr>
+              <w:t xml:space="preserve">Try it: </w:t>
+            </w:r>
+            <w:r>
+              <w:rPr>
+                <w:rFonts w:ascii="Arial" w:cs="Arial" w:eastAsia="Arial" w:hAnsi="Arial"/>
+                <w:sz w:val="20"/>
+                <w:szCs w:val="20"/>
+              </w:rPr>
+              <w:t xml:space="preserve">Marie draws one small apple picture for each child who chose apples. 6 children chose apples and 4 chose pears. How many apple pictures does she draw? How many more apple pictures than pear pictures?</w:t>
+            </w:r>
+          </w:p>
+          <w:p>
+            <w:pPr>
+              <w:keepLines/>
+              <w:spacing w:after="0" w:before="0" w:line="320" w:lineRule="auto"/>
+            </w:pPr>
+            <w:r>
+              <w:rPr>
+                <w:rFonts w:ascii="Arial" w:cs="Arial" w:eastAsia="Arial" w:hAnsi="Arial"/>
+                <w:b/>
+                <w:bCs/>
+                <w:sz w:val="20"/>
+                <w:szCs w:val="20"/>
+              </w:rPr>
+              <w:t xml:space="preserve">My answer: </w:t>
+            </w:r>
+            <w:r>
+              <w:rPr>
+                <w:rFonts w:ascii="Arial" w:cs="Arial" w:eastAsia="Arial" w:hAnsi="Arial"/>
+                <w:sz w:val="20"/>
+                <w:szCs w:val="20"/>
+              </w:rPr>
+              <w:t xml:space="preserve">______________________________</w:t>
             </w:r>
           </w:p>
         </w:tc>
@@ -14484,6 +14907,147 @@
                 <w:szCs w:val="19"/>
               </w:rPr>
               <w:t xml:space="preserve"> I would like to pass    </w:t>
+            </w:r>
+          </w:p>
+        </w:tc>
+      </w:tr>
+    </w:tbl>
+    <w:p>
+      <w:pPr>
+        <w:keepLines/>
+        <w:spacing w:after="60" w:before="0" w:line="320" w:lineRule="auto"/>
+      </w:pPr>
+      <w:r>
+        <w:rPr>
+          <w:rFonts w:ascii="Arial" w:cs="Arial" w:eastAsia="Arial" w:hAnsi="Arial"/>
+          <w:sz w:val="26"/>
+          <w:szCs w:val="26"/>
+        </w:rPr>
+        <w:t xml:space="preserve"/>
+      </w:r>
+    </w:p>
+    <w:tbl>
+      <w:tblPr>
+        <w:tblW w:type="dxa" w:w="9900"/>
+        <w:tblBorders>
+          <w:top w:val="single" w:color="auto" w:sz="4"/>
+          <w:left w:val="single" w:color="auto" w:sz="4"/>
+          <w:bottom w:val="single" w:color="auto" w:sz="4"/>
+          <w:right w:val="single" w:color="auto" w:sz="4"/>
+          <w:insideH w:val="single" w:color="auto" w:sz="4"/>
+          <w:insideV w:val="single" w:color="auto" w:sz="4"/>
+        </w:tblBorders>
+      </w:tblPr>
+      <w:tblGrid>
+        <w:gridCol w:w="9900"/>
+      </w:tblGrid>
+      <w:tr>
+        <w:trPr>
+          <w:cantSplit/>
+        </w:trPr>
+        <w:tc>
+          <w:tcPr>
+            <w:tcW w:type="dxa" w:w="9900"/>
+            <w:tcBorders>
+              <w:top w:val="single" w:color="000000" w:sz="8"/>
+              <w:left w:val="single" w:color="000000" w:sz="8"/>
+              <w:bottom w:val="single" w:color="000000" w:sz="8"/>
+              <w:right w:val="single" w:color="000000" w:sz="8"/>
+            </w:tcBorders>
+            <w:shd w:fill="FFF6D6" w:color="auto" w:val="clear"/>
+            <w:tcMar>
+              <w:top w:type="dxa" w:w="50"/>
+              <w:left w:type="dxa" w:w="100"/>
+              <w:bottom w:type="dxa" w:w="50"/>
+              <w:right w:type="dxa" w:w="100"/>
+            </w:tcMar>
+            <w:vAlign w:val="center"/>
+          </w:tcPr>
+          <w:p>
+            <w:pPr>
+              <w:keepLines/>
+              <w:spacing w:after="30" w:before="0" w:line="320" w:lineRule="auto"/>
+            </w:pPr>
+            <w:r>
+              <w:rPr>
+                <w:rFonts w:ascii="Arial" w:cs="Arial" w:eastAsia="Arial" w:hAnsi="Arial"/>
+                <w:b/>
+                <w:bCs/>
+                <w:color w:val="1F7A6F"/>
+                <w:sz w:val="22"/>
+                <w:szCs w:val="22"/>
+              </w:rPr>
+              <w:t xml:space="preserve">Story corner: Ingrid Daubechies  </w:t>
+            </w:r>
+            <w:r>
+              <w:rPr>
+                <w:rFonts w:ascii="Arial" w:cs="Arial" w:eastAsia="Arial" w:hAnsi="Arial"/>
+                <w:sz w:val="18"/>
+                <w:szCs w:val="18"/>
+              </w:rPr>
+              <w:t xml:space="preserve">Just for fun. You can pass.</w:t>
+            </w:r>
+          </w:p>
+          <w:p>
+            <w:pPr>
+              <w:keepLines/>
+              <w:spacing w:after="30" w:before="0" w:line="260" w:lineRule="auto"/>
+            </w:pPr>
+            <w:r>
+              <w:rPr>
+                <w:rFonts w:ascii="Arial" w:cs="Arial" w:eastAsia="Arial" w:hAnsi="Arial"/>
+                <w:sz w:val="20"/>
+                <w:szCs w:val="20"/>
+              </w:rPr>
+              <w:t xml:space="preserve">Ingrid Daubechies (Belgium, born 1954) liked weaving as a girl. When she could not sleep she doubled numbers in her head: 2, 4, 8, 16 and on. Now she is a maths professor.</w:t>
+            </w:r>
+          </w:p>
+          <w:p>
+            <w:pPr>
+              <w:keepLines/>
+              <w:spacing w:after="30" w:before="0" w:line="260" w:lineRule="auto"/>
+            </w:pPr>
+            <w:r>
+              <w:rPr>
+                <w:rFonts w:ascii="Arial" w:cs="Arial" w:eastAsia="Arial" w:hAnsi="Arial"/>
+                <w:b/>
+                <w:bCs/>
+                <w:sz w:val="20"/>
+                <w:szCs w:val="20"/>
+              </w:rPr>
+              <w:t xml:space="preserve">Try it: </w:t>
+            </w:r>
+            <w:r>
+              <w:rPr>
+                <w:rFonts w:ascii="Arial" w:cs="Arial" w:eastAsia="Arial" w:hAnsi="Arial"/>
+                <w:sz w:val="20"/>
+                <w:szCs w:val="20"/>
+              </w:rPr>
+              <w:t xml:space="preserve">Try Ingrid's doubling game: 1, 2, 4, 8, __, __. What is the rule? What are the next two numbers?</w:t>
+            </w:r>
+          </w:p>
+          <w:p>
+            <w:pPr>
+              <w:keepLines/>
+              <w:spacing w:after="0" w:before="0" w:line="320" w:lineRule="auto"/>
+            </w:pPr>
+            <w:r>
+              <w:rPr>
+                <w:rFonts w:ascii="Arial" w:cs="Arial" w:eastAsia="Arial" w:hAnsi="Arial"/>
+                <w:b/>
+                <w:bCs/>
+                <w:sz w:val="20"/>
+                <w:szCs w:val="20"/>
+              </w:rPr>
+              <w:t xml:space="preserve">My answer: </w:t>
+            </w:r>
+            <w:r>
+              <w:rPr>
+                <w:rFonts w:ascii="Arial" w:cs="Arial" w:eastAsia="Arial" w:hAnsi="Arial"/>
+                <w:sz w:val="20"/>
+                <w:szCs w:val="20"/>
+              </w:rPr>
+              <w:t xml:space="preserve">______________________________</w:t>
             </w:r>
           </w:p>
         </w:tc>
@@ -20060,6 +20624,147 @@
     <w:p>
       <w:pPr>
         <w:keepLines/>
+        <w:spacing w:after="60" w:before="0" w:line="320" w:lineRule="auto"/>
+      </w:pPr>
+      <w:r>
+        <w:rPr>
+          <w:rFonts w:ascii="Arial" w:cs="Arial" w:eastAsia="Arial" w:hAnsi="Arial"/>
+          <w:sz w:val="26"/>
+          <w:szCs w:val="26"/>
+        </w:rPr>
+        <w:t xml:space="preserve"/>
+      </w:r>
+    </w:p>
+    <w:tbl>
+      <w:tblPr>
+        <w:tblW w:type="dxa" w:w="9900"/>
+        <w:tblBorders>
+          <w:top w:val="single" w:color="auto" w:sz="4"/>
+          <w:left w:val="single" w:color="auto" w:sz="4"/>
+          <w:bottom w:val="single" w:color="auto" w:sz="4"/>
+          <w:right w:val="single" w:color="auto" w:sz="4"/>
+          <w:insideH w:val="single" w:color="auto" w:sz="4"/>
+          <w:insideV w:val="single" w:color="auto" w:sz="4"/>
+        </w:tblBorders>
+      </w:tblPr>
+      <w:tblGrid>
+        <w:gridCol w:w="9900"/>
+      </w:tblGrid>
+      <w:tr>
+        <w:trPr>
+          <w:cantSplit/>
+        </w:trPr>
+        <w:tc>
+          <w:tcPr>
+            <w:tcW w:type="dxa" w:w="9900"/>
+            <w:tcBorders>
+              <w:top w:val="single" w:color="000000" w:sz="8"/>
+              <w:left w:val="single" w:color="000000" w:sz="8"/>
+              <w:bottom w:val="single" w:color="000000" w:sz="8"/>
+              <w:right w:val="single" w:color="000000" w:sz="8"/>
+            </w:tcBorders>
+            <w:shd w:fill="FFF6D6" w:color="auto" w:val="clear"/>
+            <w:tcMar>
+              <w:top w:type="dxa" w:w="50"/>
+              <w:left w:type="dxa" w:w="100"/>
+              <w:bottom w:type="dxa" w:w="50"/>
+              <w:right w:type="dxa" w:w="100"/>
+            </w:tcMar>
+            <w:vAlign w:val="center"/>
+          </w:tcPr>
+          <w:p>
+            <w:pPr>
+              <w:keepLines/>
+              <w:spacing w:after="30" w:before="0" w:line="320" w:lineRule="auto"/>
+            </w:pPr>
+            <w:r>
+              <w:rPr>
+                <w:rFonts w:ascii="Arial" w:cs="Arial" w:eastAsia="Arial" w:hAnsi="Arial"/>
+                <w:b/>
+                <w:bCs/>
+                <w:color w:val="1F7A6F"/>
+                <w:sz w:val="22"/>
+                <w:szCs w:val="22"/>
+              </w:rPr>
+              <w:t xml:space="preserve">Story corner: René Descartes  </w:t>
+            </w:r>
+            <w:r>
+              <w:rPr>
+                <w:rFonts w:ascii="Arial" w:cs="Arial" w:eastAsia="Arial" w:hAnsi="Arial"/>
+                <w:sz w:val="18"/>
+                <w:szCs w:val="18"/>
+              </w:rPr>
+              <w:t xml:space="preserve">Just for fun. You can pass.</w:t>
+            </w:r>
+          </w:p>
+          <w:p>
+            <w:pPr>
+              <w:keepLines/>
+              <w:spacing w:after="30" w:before="0" w:line="260" w:lineRule="auto"/>
+            </w:pPr>
+            <w:r>
+              <w:rPr>
+                <w:rFonts w:ascii="Arial" w:cs="Arial" w:eastAsia="Arial" w:hAnsi="Arial"/>
+                <w:sz w:val="20"/>
+                <w:szCs w:val="20"/>
+              </w:rPr>
+              <w:t xml:space="preserve">René Descartes (France, 1596-1650) wrote a book in 1637 that used x, y and z for numbers we do not know yet. We still call a mystery number x.</w:t>
+            </w:r>
+          </w:p>
+          <w:p>
+            <w:pPr>
+              <w:keepLines/>
+              <w:spacing w:after="30" w:before="0" w:line="260" w:lineRule="auto"/>
+            </w:pPr>
+            <w:r>
+              <w:rPr>
+                <w:rFonts w:ascii="Arial" w:cs="Arial" w:eastAsia="Arial" w:hAnsi="Arial"/>
+                <w:b/>
+                <w:bCs/>
+                <w:sz w:val="20"/>
+                <w:szCs w:val="20"/>
+              </w:rPr>
+              <w:t xml:space="preserve">Try it: </w:t>
+            </w:r>
+            <w:r>
+              <w:rPr>
+                <w:rFonts w:ascii="Arial" w:cs="Arial" w:eastAsia="Arial" w:hAnsi="Arial"/>
+                <w:sz w:val="20"/>
+                <w:szCs w:val="20"/>
+              </w:rPr>
+              <w:t xml:space="preserve">Call the mystery number x. x + 8 = 14. Work backwards: what is x?</w:t>
+            </w:r>
+          </w:p>
+          <w:p>
+            <w:pPr>
+              <w:keepLines/>
+              <w:spacing w:after="0" w:before="0" w:line="320" w:lineRule="auto"/>
+            </w:pPr>
+            <w:r>
+              <w:rPr>
+                <w:rFonts w:ascii="Arial" w:cs="Arial" w:eastAsia="Arial" w:hAnsi="Arial"/>
+                <w:b/>
+                <w:bCs/>
+                <w:sz w:val="20"/>
+                <w:szCs w:val="20"/>
+              </w:rPr>
+              <w:t xml:space="preserve">My answer: </w:t>
+            </w:r>
+            <w:r>
+              <w:rPr>
+                <w:rFonts w:ascii="Arial" w:cs="Arial" w:eastAsia="Arial" w:hAnsi="Arial"/>
+                <w:sz w:val="20"/>
+                <w:szCs w:val="20"/>
+              </w:rPr>
+              <w:t xml:space="preserve">______________________________</w:t>
+            </w:r>
+          </w:p>
+        </w:tc>
+      </w:tr>
+    </w:tbl>
+    <w:p>
+      <w:pPr>
+        <w:keepLines/>
         <w:pageBreakBefore/>
         <w:spacing w:after="60" w:before="0" w:line="320" w:lineRule="auto"/>
         <w:jc w:val="right"/>
@@ -23379,6 +24084,147 @@
     <w:p>
       <w:pPr>
         <w:keepLines/>
+        <w:spacing w:after="60" w:before="0" w:line="320" w:lineRule="auto"/>
+      </w:pPr>
+      <w:r>
+        <w:rPr>
+          <w:rFonts w:ascii="Arial" w:cs="Arial" w:eastAsia="Arial" w:hAnsi="Arial"/>
+          <w:sz w:val="26"/>
+          <w:szCs w:val="26"/>
+        </w:rPr>
+        <w:t xml:space="preserve"/>
+      </w:r>
+    </w:p>
+    <w:tbl>
+      <w:tblPr>
+        <w:tblW w:type="dxa" w:w="9900"/>
+        <w:tblBorders>
+          <w:top w:val="single" w:color="auto" w:sz="4"/>
+          <w:left w:val="single" w:color="auto" w:sz="4"/>
+          <w:bottom w:val="single" w:color="auto" w:sz="4"/>
+          <w:right w:val="single" w:color="auto" w:sz="4"/>
+          <w:insideH w:val="single" w:color="auto" w:sz="4"/>
+          <w:insideV w:val="single" w:color="auto" w:sz="4"/>
+        </w:tblBorders>
+      </w:tblPr>
+      <w:tblGrid>
+        <w:gridCol w:w="9900"/>
+      </w:tblGrid>
+      <w:tr>
+        <w:trPr>
+          <w:cantSplit/>
+        </w:trPr>
+        <w:tc>
+          <w:tcPr>
+            <w:tcW w:type="dxa" w:w="9900"/>
+            <w:tcBorders>
+              <w:top w:val="single" w:color="000000" w:sz="8"/>
+              <w:left w:val="single" w:color="000000" w:sz="8"/>
+              <w:bottom w:val="single" w:color="000000" w:sz="8"/>
+              <w:right w:val="single" w:color="000000" w:sz="8"/>
+            </w:tcBorders>
+            <w:shd w:fill="FFF6D6" w:color="auto" w:val="clear"/>
+            <w:tcMar>
+              <w:top w:type="dxa" w:w="50"/>
+              <w:left w:type="dxa" w:w="100"/>
+              <w:bottom w:type="dxa" w:w="50"/>
+              <w:right w:type="dxa" w:w="100"/>
+            </w:tcMar>
+            <w:vAlign w:val="center"/>
+          </w:tcPr>
+          <w:p>
+            <w:pPr>
+              <w:keepLines/>
+              <w:spacing w:after="30" w:before="0" w:line="320" w:lineRule="auto"/>
+            </w:pPr>
+            <w:r>
+              <w:rPr>
+                <w:rFonts w:ascii="Arial" w:cs="Arial" w:eastAsia="Arial" w:hAnsi="Arial"/>
+                <w:b/>
+                <w:bCs/>
+                <w:color w:val="1F7A6F"/>
+                <w:sz w:val="22"/>
+                <w:szCs w:val="22"/>
+              </w:rPr>
+              <w:t xml:space="preserve">Story corner: Isaac Newton  </w:t>
+            </w:r>
+            <w:r>
+              <w:rPr>
+                <w:rFonts w:ascii="Arial" w:cs="Arial" w:eastAsia="Arial" w:hAnsi="Arial"/>
+                <w:sz w:val="18"/>
+                <w:szCs w:val="18"/>
+              </w:rPr>
+              <w:t xml:space="preserve">Just for fun. You can pass.</w:t>
+            </w:r>
+          </w:p>
+          <w:p>
+            <w:pPr>
+              <w:keepLines/>
+              <w:spacing w:after="30" w:before="0" w:line="260" w:lineRule="auto"/>
+            </w:pPr>
+            <w:r>
+              <w:rPr>
+                <w:rFonts w:ascii="Arial" w:cs="Arial" w:eastAsia="Arial" w:hAnsi="Arial"/>
+                <w:sz w:val="20"/>
+                <w:szCs w:val="20"/>
+              </w:rPr>
+              <w:t xml:space="preserve">Isaac Newton (England, 1642-1727) is famous for science, but he also worked at the Royal Mint, where English coins were made. The Mint cared that every coin had the right weight.</w:t>
+            </w:r>
+          </w:p>
+          <w:p>
+            <w:pPr>
+              <w:keepLines/>
+              <w:spacing w:after="30" w:before="0" w:line="260" w:lineRule="auto"/>
+            </w:pPr>
+            <w:r>
+              <w:rPr>
+                <w:rFonts w:ascii="Arial" w:cs="Arial" w:eastAsia="Arial" w:hAnsi="Arial"/>
+                <w:b/>
+                <w:bCs/>
+                <w:sz w:val="20"/>
+                <w:szCs w:val="20"/>
+              </w:rPr>
+              <w:t xml:space="preserve">Try it: </w:t>
+            </w:r>
+            <w:r>
+              <w:rPr>
+                <w:rFonts w:ascii="Arial" w:cs="Arial" w:eastAsia="Arial" w:hAnsi="Arial"/>
+                <w:sz w:val="20"/>
+                <w:szCs w:val="20"/>
+              </w:rPr>
+              <w:t xml:space="preserve">You have one 10-cent coin and some 5-cent coins. You want 20 cents. How many 5-cent coins do you need?</w:t>
+            </w:r>
+          </w:p>
+          <w:p>
+            <w:pPr>
+              <w:keepLines/>
+              <w:spacing w:after="0" w:before="0" w:line="320" w:lineRule="auto"/>
+            </w:pPr>
+            <w:r>
+              <w:rPr>
+                <w:rFonts w:ascii="Arial" w:cs="Arial" w:eastAsia="Arial" w:hAnsi="Arial"/>
+                <w:b/>
+                <w:bCs/>
+                <w:sz w:val="20"/>
+                <w:szCs w:val="20"/>
+              </w:rPr>
+              <w:t xml:space="preserve">My answer: </w:t>
+            </w:r>
+            <w:r>
+              <w:rPr>
+                <w:rFonts w:ascii="Arial" w:cs="Arial" w:eastAsia="Arial" w:hAnsi="Arial"/>
+                <w:sz w:val="20"/>
+                <w:szCs w:val="20"/>
+              </w:rPr>
+              <w:t xml:space="preserve">______________________________</w:t>
+            </w:r>
+          </w:p>
+        </w:tc>
+      </w:tr>
+    </w:tbl>
+    <w:p>
+      <w:pPr>
+        <w:keepLines/>
         <w:pageBreakBefore/>
         <w:spacing w:after="60" w:before="0" w:line="320" w:lineRule="auto"/>
         <w:jc w:val="right"/>
@@ -27157,6 +28003,147 @@
     <w:p>
       <w:pPr>
         <w:keepLines/>
+        <w:spacing w:after="60" w:before="0" w:line="320" w:lineRule="auto"/>
+      </w:pPr>
+      <w:r>
+        <w:rPr>
+          <w:rFonts w:ascii="Arial" w:cs="Arial" w:eastAsia="Arial" w:hAnsi="Arial"/>
+          <w:sz w:val="26"/>
+          <w:szCs w:val="26"/>
+        </w:rPr>
+        <w:t xml:space="preserve"/>
+      </w:r>
+    </w:p>
+    <w:tbl>
+      <w:tblPr>
+        <w:tblW w:type="dxa" w:w="9900"/>
+        <w:tblBorders>
+          <w:top w:val="single" w:color="auto" w:sz="4"/>
+          <w:left w:val="single" w:color="auto" w:sz="4"/>
+          <w:bottom w:val="single" w:color="auto" w:sz="4"/>
+          <w:right w:val="single" w:color="auto" w:sz="4"/>
+          <w:insideH w:val="single" w:color="auto" w:sz="4"/>
+          <w:insideV w:val="single" w:color="auto" w:sz="4"/>
+        </w:tblBorders>
+      </w:tblPr>
+      <w:tblGrid>
+        <w:gridCol w:w="9900"/>
+      </w:tblGrid>
+      <w:tr>
+        <w:trPr>
+          <w:cantSplit/>
+        </w:trPr>
+        <w:tc>
+          <w:tcPr>
+            <w:tcW w:type="dxa" w:w="9900"/>
+            <w:tcBorders>
+              <w:top w:val="single" w:color="000000" w:sz="8"/>
+              <w:left w:val="single" w:color="000000" w:sz="8"/>
+              <w:bottom w:val="single" w:color="000000" w:sz="8"/>
+              <w:right w:val="single" w:color="000000" w:sz="8"/>
+            </w:tcBorders>
+            <w:shd w:fill="FFF6D6" w:color="auto" w:val="clear"/>
+            <w:tcMar>
+              <w:top w:type="dxa" w:w="50"/>
+              <w:left w:type="dxa" w:w="100"/>
+              <w:bottom w:type="dxa" w:w="50"/>
+              <w:right w:type="dxa" w:w="100"/>
+            </w:tcMar>
+            <w:vAlign w:val="center"/>
+          </w:tcPr>
+          <w:p>
+            <w:pPr>
+              <w:keepLines/>
+              <w:spacing w:after="30" w:before="0" w:line="320" w:lineRule="auto"/>
+            </w:pPr>
+            <w:r>
+              <w:rPr>
+                <w:rFonts w:ascii="Arial" w:cs="Arial" w:eastAsia="Arial" w:hAnsi="Arial"/>
+                <w:b/>
+                <w:bCs/>
+                <w:color w:val="1F7A6F"/>
+                <w:sz w:val="22"/>
+                <w:szCs w:val="22"/>
+              </w:rPr>
+              <w:t xml:space="preserve">Story corner: Johannes Kepler  </w:t>
+            </w:r>
+            <w:r>
+              <w:rPr>
+                <w:rFonts w:ascii="Arial" w:cs="Arial" w:eastAsia="Arial" w:hAnsi="Arial"/>
+                <w:sz w:val="18"/>
+                <w:szCs w:val="18"/>
+              </w:rPr>
+              <w:t xml:space="preserve">Just for fun. You can pass.</w:t>
+            </w:r>
+          </w:p>
+          <w:p>
+            <w:pPr>
+              <w:keepLines/>
+              <w:spacing w:after="30" w:before="0" w:line="260" w:lineRule="auto"/>
+            </w:pPr>
+            <w:r>
+              <w:rPr>
+                <w:rFonts w:ascii="Arial" w:cs="Arial" w:eastAsia="Arial" w:hAnsi="Arial"/>
+                <w:sz w:val="20"/>
+                <w:szCs w:val="20"/>
+              </w:rPr>
+              <w:t xml:space="preserve">Johannes Kepler (Germany, 1571-1630) was an astronomer. In 1611 he noticed that snowflakes have six corners and asked why.</w:t>
+            </w:r>
+          </w:p>
+          <w:p>
+            <w:pPr>
+              <w:keepLines/>
+              <w:spacing w:after="30" w:before="0" w:line="260" w:lineRule="auto"/>
+            </w:pPr>
+            <w:r>
+              <w:rPr>
+                <w:rFonts w:ascii="Arial" w:cs="Arial" w:eastAsia="Arial" w:hAnsi="Arial"/>
+                <w:b/>
+                <w:bCs/>
+                <w:sz w:val="20"/>
+                <w:szCs w:val="20"/>
+              </w:rPr>
+              <w:t xml:space="preserve">Try it: </w:t>
+            </w:r>
+            <w:r>
+              <w:rPr>
+                <w:rFonts w:ascii="Arial" w:cs="Arial" w:eastAsia="Arial" w:hAnsi="Arial"/>
+                <w:sz w:val="20"/>
+                <w:szCs w:val="20"/>
+              </w:rPr>
+              <w:t xml:space="preserve">Kepler's snowflake has six corners. What shape has 6 straight sides and 6 corners? How many sides do two of these shapes have altogether?</w:t>
+            </w:r>
+          </w:p>
+          <w:p>
+            <w:pPr>
+              <w:keepLines/>
+              <w:spacing w:after="0" w:before="0" w:line="320" w:lineRule="auto"/>
+            </w:pPr>
+            <w:r>
+              <w:rPr>
+                <w:rFonts w:ascii="Arial" w:cs="Arial" w:eastAsia="Arial" w:hAnsi="Arial"/>
+                <w:b/>
+                <w:bCs/>
+                <w:sz w:val="20"/>
+                <w:szCs w:val="20"/>
+              </w:rPr>
+              <w:t xml:space="preserve">My answer: </w:t>
+            </w:r>
+            <w:r>
+              <w:rPr>
+                <w:rFonts w:ascii="Arial" w:cs="Arial" w:eastAsia="Arial" w:hAnsi="Arial"/>
+                <w:sz w:val="20"/>
+                <w:szCs w:val="20"/>
+              </w:rPr>
+              <w:t xml:space="preserve">______________________________</w:t>
+            </w:r>
+          </w:p>
+        </w:tc>
+      </w:tr>
+    </w:tbl>
+    <w:p>
+      <w:pPr>
+        <w:keepLines/>
         <w:pageBreakBefore/>
         <w:spacing w:after="60" w:before="0" w:line="320" w:lineRule="auto"/>
         <w:jc w:val="right"/>
@@ -30726,6 +31713,147 @@
     <w:p>
       <w:pPr>
         <w:keepLines/>
+        <w:spacing w:after="60" w:before="0" w:line="320" w:lineRule="auto"/>
+      </w:pPr>
+      <w:r>
+        <w:rPr>
+          <w:rFonts w:ascii="Arial" w:cs="Arial" w:eastAsia="Arial" w:hAnsi="Arial"/>
+          <w:sz w:val="26"/>
+          <w:szCs w:val="26"/>
+        </w:rPr>
+        <w:t xml:space="preserve"/>
+      </w:r>
+    </w:p>
+    <w:tbl>
+      <w:tblPr>
+        <w:tblW w:type="dxa" w:w="9900"/>
+        <w:tblBorders>
+          <w:top w:val="single" w:color="auto" w:sz="4"/>
+          <w:left w:val="single" w:color="auto" w:sz="4"/>
+          <w:bottom w:val="single" w:color="auto" w:sz="4"/>
+          <w:right w:val="single" w:color="auto" w:sz="4"/>
+          <w:insideH w:val="single" w:color="auto" w:sz="4"/>
+          <w:insideV w:val="single" w:color="auto" w:sz="4"/>
+        </w:tblBorders>
+      </w:tblPr>
+      <w:tblGrid>
+        <w:gridCol w:w="9900"/>
+      </w:tblGrid>
+      <w:tr>
+        <w:trPr>
+          <w:cantSplit/>
+        </w:trPr>
+        <w:tc>
+          <w:tcPr>
+            <w:tcW w:type="dxa" w:w="9900"/>
+            <w:tcBorders>
+              <w:top w:val="single" w:color="000000" w:sz="8"/>
+              <w:left w:val="single" w:color="000000" w:sz="8"/>
+              <w:bottom w:val="single" w:color="000000" w:sz="8"/>
+              <w:right w:val="single" w:color="000000" w:sz="8"/>
+            </w:tcBorders>
+            <w:shd w:fill="FFF6D6" w:color="auto" w:val="clear"/>
+            <w:tcMar>
+              <w:top w:type="dxa" w:w="50"/>
+              <w:left w:type="dxa" w:w="100"/>
+              <w:bottom w:type="dxa" w:w="50"/>
+              <w:right w:type="dxa" w:w="100"/>
+            </w:tcMar>
+            <w:vAlign w:val="center"/>
+          </w:tcPr>
+          <w:p>
+            <w:pPr>
+              <w:keepLines/>
+              <w:spacing w:after="30" w:before="0" w:line="320" w:lineRule="auto"/>
+            </w:pPr>
+            <w:r>
+              <w:rPr>
+                <w:rFonts w:ascii="Arial" w:cs="Arial" w:eastAsia="Arial" w:hAnsi="Arial"/>
+                <w:b/>
+                <w:bCs/>
+                <w:color w:val="1F7A6F"/>
+                <w:sz w:val="22"/>
+                <w:szCs w:val="22"/>
+              </w:rPr>
+              <w:t xml:space="preserve">Story corner: Leonhard Euler  </w:t>
+            </w:r>
+            <w:r>
+              <w:rPr>
+                <w:rFonts w:ascii="Arial" w:cs="Arial" w:eastAsia="Arial" w:hAnsi="Arial"/>
+                <w:sz w:val="18"/>
+                <w:szCs w:val="18"/>
+              </w:rPr>
+              <w:t xml:space="preserve">Just for fun. You can pass.</w:t>
+            </w:r>
+          </w:p>
+          <w:p>
+            <w:pPr>
+              <w:keepLines/>
+              <w:spacing w:after="30" w:before="0" w:line="260" w:lineRule="auto"/>
+            </w:pPr>
+            <w:r>
+              <w:rPr>
+                <w:rFonts w:ascii="Arial" w:cs="Arial" w:eastAsia="Arial" w:hAnsi="Arial"/>
+                <w:sz w:val="20"/>
+                <w:szCs w:val="20"/>
+              </w:rPr>
+              <w:t xml:space="preserve">Leonhard Euler (Switzerland, 1707-1783) drew circles in his letters to show groups. A small circle inside a big circle is a smaller group inside a bigger one.</w:t>
+            </w:r>
+          </w:p>
+          <w:p>
+            <w:pPr>
+              <w:keepLines/>
+              <w:spacing w:after="30" w:before="0" w:line="260" w:lineRule="auto"/>
+            </w:pPr>
+            <w:r>
+              <w:rPr>
+                <w:rFonts w:ascii="Arial" w:cs="Arial" w:eastAsia="Arial" w:hAnsi="Arial"/>
+                <w:b/>
+                <w:bCs/>
+                <w:sz w:val="20"/>
+                <w:szCs w:val="20"/>
+              </w:rPr>
+              <w:t xml:space="preserve">Try it: </w:t>
+            </w:r>
+            <w:r>
+              <w:rPr>
+                <w:rFonts w:ascii="Arial" w:cs="Arial" w:eastAsia="Arial" w:hAnsi="Arial"/>
+                <w:sz w:val="20"/>
+                <w:szCs w:val="20"/>
+              </w:rPr>
+              <w:t xml:space="preserve">Draw a big circle for animals and a small circle inside it for cats. Is every cat an animal? Is every animal a cat?</w:t>
+            </w:r>
+          </w:p>
+          <w:p>
+            <w:pPr>
+              <w:keepLines/>
+              <w:spacing w:after="0" w:before="0" w:line="320" w:lineRule="auto"/>
+            </w:pPr>
+            <w:r>
+              <w:rPr>
+                <w:rFonts w:ascii="Arial" w:cs="Arial" w:eastAsia="Arial" w:hAnsi="Arial"/>
+                <w:b/>
+                <w:bCs/>
+                <w:sz w:val="20"/>
+                <w:szCs w:val="20"/>
+              </w:rPr>
+              <w:t xml:space="preserve">My answer: </w:t>
+            </w:r>
+            <w:r>
+              <w:rPr>
+                <w:rFonts w:ascii="Arial" w:cs="Arial" w:eastAsia="Arial" w:hAnsi="Arial"/>
+                <w:sz w:val="20"/>
+                <w:szCs w:val="20"/>
+              </w:rPr>
+              <w:t xml:space="preserve">______________________________</w:t>
+            </w:r>
+          </w:p>
+        </w:tc>
+      </w:tr>
+    </w:tbl>
+    <w:p>
+      <w:pPr>
+        <w:keepLines/>
         <w:pageBreakBefore/>
         <w:spacing w:after="60" w:before="0" w:line="320" w:lineRule="auto"/>
         <w:jc w:val="right"/>
@@ -34159,6 +35287,147 @@
     <w:p>
       <w:pPr>
         <w:keepLines/>
+        <w:spacing w:after="60" w:before="0" w:line="320" w:lineRule="auto"/>
+      </w:pPr>
+      <w:r>
+        <w:rPr>
+          <w:rFonts w:ascii="Arial" w:cs="Arial" w:eastAsia="Arial" w:hAnsi="Arial"/>
+          <w:sz w:val="26"/>
+          <w:szCs w:val="26"/>
+        </w:rPr>
+        <w:t xml:space="preserve"/>
+      </w:r>
+    </w:p>
+    <w:tbl>
+      <w:tblPr>
+        <w:tblW w:type="dxa" w:w="9900"/>
+        <w:tblBorders>
+          <w:top w:val="single" w:color="auto" w:sz="4"/>
+          <w:left w:val="single" w:color="auto" w:sz="4"/>
+          <w:bottom w:val="single" w:color="auto" w:sz="4"/>
+          <w:right w:val="single" w:color="auto" w:sz="4"/>
+          <w:insideH w:val="single" w:color="auto" w:sz="4"/>
+          <w:insideV w:val="single" w:color="auto" w:sz="4"/>
+        </w:tblBorders>
+      </w:tblPr>
+      <w:tblGrid>
+        <w:gridCol w:w="9900"/>
+      </w:tblGrid>
+      <w:tr>
+        <w:trPr>
+          <w:cantSplit/>
+        </w:trPr>
+        <w:tc>
+          <w:tcPr>
+            <w:tcW w:type="dxa" w:w="9900"/>
+            <w:tcBorders>
+              <w:top w:val="single" w:color="000000" w:sz="8"/>
+              <w:left w:val="single" w:color="000000" w:sz="8"/>
+              <w:bottom w:val="single" w:color="000000" w:sz="8"/>
+              <w:right w:val="single" w:color="000000" w:sz="8"/>
+            </w:tcBorders>
+            <w:shd w:fill="FFF6D6" w:color="auto" w:val="clear"/>
+            <w:tcMar>
+              <w:top w:type="dxa" w:w="50"/>
+              <w:left w:type="dxa" w:w="100"/>
+              <w:bottom w:type="dxa" w:w="50"/>
+              <w:right w:type="dxa" w:w="100"/>
+            </w:tcMar>
+            <w:vAlign w:val="center"/>
+          </w:tcPr>
+          <w:p>
+            <w:pPr>
+              <w:keepLines/>
+              <w:spacing w:after="30" w:before="0" w:line="320" w:lineRule="auto"/>
+            </w:pPr>
+            <w:r>
+              <w:rPr>
+                <w:rFonts w:ascii="Arial" w:cs="Arial" w:eastAsia="Arial" w:hAnsi="Arial"/>
+                <w:b/>
+                <w:bCs/>
+                <w:color w:val="1F7A6F"/>
+                <w:sz w:val="22"/>
+                <w:szCs w:val="22"/>
+              </w:rPr>
+              <w:t xml:space="preserve">Story corner: Al-Biruni  </w:t>
+            </w:r>
+            <w:r>
+              <w:rPr>
+                <w:rFonts w:ascii="Arial" w:cs="Arial" w:eastAsia="Arial" w:hAnsi="Arial"/>
+                <w:sz w:val="18"/>
+                <w:szCs w:val="18"/>
+              </w:rPr>
+              <w:t xml:space="preserve">Just for fun. You can pass.</w:t>
+            </w:r>
+          </w:p>
+          <w:p>
+            <w:pPr>
+              <w:keepLines/>
+              <w:spacing w:after="30" w:before="0" w:line="260" w:lineRule="auto"/>
+            </w:pPr>
+            <w:r>
+              <w:rPr>
+                <w:rFonts w:ascii="Arial" w:cs="Arial" w:eastAsia="Arial" w:hAnsi="Arial"/>
+                <w:sz w:val="20"/>
+                <w:szCs w:val="20"/>
+              </w:rPr>
+              <w:t xml:space="preserve">Al-Biruni (Central Asia, 973-1048) loved to measure. He used careful measuring of a hill to work out the size of the whole Earth, and found a value close to today's.</w:t>
+            </w:r>
+          </w:p>
+          <w:p>
+            <w:pPr>
+              <w:keepLines/>
+              <w:spacing w:after="30" w:before="0" w:line="260" w:lineRule="auto"/>
+            </w:pPr>
+            <w:r>
+              <w:rPr>
+                <w:rFonts w:ascii="Arial" w:cs="Arial" w:eastAsia="Arial" w:hAnsi="Arial"/>
+                <w:b/>
+                <w:bCs/>
+                <w:sz w:val="20"/>
+                <w:szCs w:val="20"/>
+              </w:rPr>
+              <w:t xml:space="preserve">Try it: </w:t>
+            </w:r>
+            <w:r>
+              <w:rPr>
+                <w:rFonts w:ascii="Arial" w:cs="Arial" w:eastAsia="Arial" w:hAnsi="Arial"/>
+                <w:sz w:val="20"/>
+                <w:szCs w:val="20"/>
+              </w:rPr>
+              <w:t xml:space="preserve">Al-Biruni needed careful measuring. A rod is 10 cm long. A table is 6 rods long. How long is the table in cm?</w:t>
+            </w:r>
+          </w:p>
+          <w:p>
+            <w:pPr>
+              <w:keepLines/>
+              <w:spacing w:after="0" w:before="0" w:line="320" w:lineRule="auto"/>
+            </w:pPr>
+            <w:r>
+              <w:rPr>
+                <w:rFonts w:ascii="Arial" w:cs="Arial" w:eastAsia="Arial" w:hAnsi="Arial"/>
+                <w:b/>
+                <w:bCs/>
+                <w:sz w:val="20"/>
+                <w:szCs w:val="20"/>
+              </w:rPr>
+              <w:t xml:space="preserve">My answer: </w:t>
+            </w:r>
+            <w:r>
+              <w:rPr>
+                <w:rFonts w:ascii="Arial" w:cs="Arial" w:eastAsia="Arial" w:hAnsi="Arial"/>
+                <w:sz w:val="20"/>
+                <w:szCs w:val="20"/>
+              </w:rPr>
+              <w:t xml:space="preserve">______________________________</w:t>
+            </w:r>
+          </w:p>
+        </w:tc>
+      </w:tr>
+    </w:tbl>
+    <w:p>
+      <w:pPr>
+        <w:keepLines/>
         <w:pageBreakBefore/>
         <w:spacing w:after="60" w:before="0" w:line="320" w:lineRule="auto"/>
         <w:jc w:val="right"/>
@@ -37261,6 +38530,147 @@
                 <w:szCs w:val="19"/>
               </w:rPr>
               <w:t xml:space="preserve"> I would like to pass    </w:t>
+            </w:r>
+          </w:p>
+        </w:tc>
+      </w:tr>
+    </w:tbl>
+    <w:p>
+      <w:pPr>
+        <w:keepLines/>
+        <w:spacing w:after="60" w:before="0" w:line="320" w:lineRule="auto"/>
+      </w:pPr>
+      <w:r>
+        <w:rPr>
+          <w:rFonts w:ascii="Arial" w:cs="Arial" w:eastAsia="Arial" w:hAnsi="Arial"/>
+          <w:sz w:val="26"/>
+          <w:szCs w:val="26"/>
+        </w:rPr>
+        <w:t xml:space="preserve"/>
+      </w:r>
+    </w:p>
+    <w:tbl>
+      <w:tblPr>
+        <w:tblW w:type="dxa" w:w="9900"/>
+        <w:tblBorders>
+          <w:top w:val="single" w:color="auto" w:sz="4"/>
+          <w:left w:val="single" w:color="auto" w:sz="4"/>
+          <w:bottom w:val="single" w:color="auto" w:sz="4"/>
+          <w:right w:val="single" w:color="auto" w:sz="4"/>
+          <w:insideH w:val="single" w:color="auto" w:sz="4"/>
+          <w:insideV w:val="single" w:color="auto" w:sz="4"/>
+        </w:tblBorders>
+      </w:tblPr>
+      <w:tblGrid>
+        <w:gridCol w:w="9900"/>
+      </w:tblGrid>
+      <w:tr>
+        <w:trPr>
+          <w:cantSplit/>
+        </w:trPr>
+        <w:tc>
+          <w:tcPr>
+            <w:tcW w:type="dxa" w:w="9900"/>
+            <w:tcBorders>
+              <w:top w:val="single" w:color="000000" w:sz="8"/>
+              <w:left w:val="single" w:color="000000" w:sz="8"/>
+              <w:bottom w:val="single" w:color="000000" w:sz="8"/>
+              <w:right w:val="single" w:color="000000" w:sz="8"/>
+            </w:tcBorders>
+            <w:shd w:fill="FFF6D6" w:color="auto" w:val="clear"/>
+            <w:tcMar>
+              <w:top w:type="dxa" w:w="50"/>
+              <w:left w:type="dxa" w:w="100"/>
+              <w:bottom w:type="dxa" w:w="50"/>
+              <w:right w:type="dxa" w:w="100"/>
+            </w:tcMar>
+            <w:vAlign w:val="center"/>
+          </w:tcPr>
+          <w:p>
+            <w:pPr>
+              <w:keepLines/>
+              <w:spacing w:after="30" w:before="0" w:line="320" w:lineRule="auto"/>
+            </w:pPr>
+            <w:r>
+              <w:rPr>
+                <w:rFonts w:ascii="Arial" w:cs="Arial" w:eastAsia="Arial" w:hAnsi="Arial"/>
+                <w:b/>
+                <w:bCs/>
+                <w:color w:val="1F7A6F"/>
+                <w:sz w:val="22"/>
+                <w:szCs w:val="22"/>
+              </w:rPr>
+              <w:t xml:space="preserve">Story corner: Srinivasa Ramanujan  </w:t>
+            </w:r>
+            <w:r>
+              <w:rPr>
+                <w:rFonts w:ascii="Arial" w:cs="Arial" w:eastAsia="Arial" w:hAnsi="Arial"/>
+                <w:sz w:val="18"/>
+                <w:szCs w:val="18"/>
+              </w:rPr>
+              <w:t xml:space="preserve">Just for fun. You can pass.</w:t>
+            </w:r>
+          </w:p>
+          <w:p>
+            <w:pPr>
+              <w:keepLines/>
+              <w:spacing w:after="30" w:before="0" w:line="260" w:lineRule="auto"/>
+            </w:pPr>
+            <w:r>
+              <w:rPr>
+                <w:rFonts w:ascii="Arial" w:cs="Arial" w:eastAsia="Arial" w:hAnsi="Arial"/>
+                <w:sz w:val="20"/>
+                <w:szCs w:val="20"/>
+              </w:rPr>
+              <w:t xml:space="preserve">Srinivasa Ramanujan (India, 1887-1920) loved numbers and sent his ideas to mathematicians in England. He treated numbers like puzzles to explore.</w:t>
+            </w:r>
+          </w:p>
+          <w:p>
+            <w:pPr>
+              <w:keepLines/>
+              <w:spacing w:after="30" w:before="0" w:line="260" w:lineRule="auto"/>
+            </w:pPr>
+            <w:r>
+              <w:rPr>
+                <w:rFonts w:ascii="Arial" w:cs="Arial" w:eastAsia="Arial" w:hAnsi="Arial"/>
+                <w:b/>
+                <w:bCs/>
+                <w:sz w:val="20"/>
+                <w:szCs w:val="20"/>
+              </w:rPr>
+              <w:t xml:space="preserve">Try it: </w:t>
+            </w:r>
+            <w:r>
+              <w:rPr>
+                <w:rFonts w:ascii="Arial" w:cs="Arial" w:eastAsia="Arial" w:hAnsi="Arial"/>
+                <w:sz w:val="20"/>
+                <w:szCs w:val="20"/>
+              </w:rPr>
+              <w:t xml:space="preserve">Puzzle: find two numbers that add up to 12 and have a difference of 2.</w:t>
+            </w:r>
+          </w:p>
+          <w:p>
+            <w:pPr>
+              <w:keepLines/>
+              <w:spacing w:after="0" w:before="0" w:line="320" w:lineRule="auto"/>
+            </w:pPr>
+            <w:r>
+              <w:rPr>
+                <w:rFonts w:ascii="Arial" w:cs="Arial" w:eastAsia="Arial" w:hAnsi="Arial"/>
+                <w:b/>
+                <w:bCs/>
+                <w:sz w:val="20"/>
+                <w:szCs w:val="20"/>
+              </w:rPr>
+              <w:t xml:space="preserve">My answer: </w:t>
+            </w:r>
+            <w:r>
+              <w:rPr>
+                <w:rFonts w:ascii="Arial" w:cs="Arial" w:eastAsia="Arial" w:hAnsi="Arial"/>
+                <w:sz w:val="20"/>
+                <w:szCs w:val="20"/>
+              </w:rPr>
+              <w:t xml:space="preserve">______________________________</w:t>
             </w:r>
           </w:p>
         </w:tc>

</xml_diff>